<commit_message>
Use ElevenLabs for spoken replies with Apple fallback
</commit_message>
<xml_diff>
--- a/docs/INTERFACES.docx
+++ b/docs/INTERFACES.docx
@@ -7,7 +7,7 @@
         <w:pStyle w:val="Title"/>
       </w:pPr>
       <w:r>
-        <w:t>Marco: who builds what, and the interfaces between us (v0.3, 2026-10-17)</w:t>
+        <w:t>Marco: who builds what, and the interfaces between us (v0.4, 2026-10-18)</w:t>
       </w:r>
     </w:p>
     <w:p>
@@ -19,7 +19,7 @@
           <w:i/>
           <w:color w:val="5F6368"/>
         </w:rPr>
-        <w:t>Three owners, one contract. Change a message format only by updating this file, the code and tests on both sides, and telling the others. What changed since v0.1 is listed in §11, and since v0.2 in §12.</w:t>
+        <w:t>Three owners, one contract. Change a message format only by updating this file, the code and tests on both sides, and telling the others. Changes are listed in §11–13.</w:t>
       </w:r>
     </w:p>
     <w:p>
@@ -328,7 +328,7 @@
         <w:t>Photon:</w:t>
       </w:r>
       <w:r>
-        <w:t xml:space="preserve"> sends the caretaker the photo of an unknown item, receives the label (text or voice memo), and posts it to the server.</w:t>
+        <w:t xml:space="preserve"> sends the caretaker the photo of an unknown item, receives its typed name, and posts it to the server. Voice recordings are not labels.</w:t>
       </w:r>
     </w:p>
     <w:p>
@@ -2742,6 +2742,331 @@
     <w:p>
       <w:r>
         <w:t>The server keeps the items but marks their positions stale until they're seen again.</w:t>
+      </w:r>
+    </w:p>
+    <w:p>
+      <w:pPr>
+        <w:pStyle w:val="Heading2"/>
+      </w:pPr>
+      <w:r>
+        <w:t>3.5 Spoken replies: `POST /v1/speech` (JSON)</w:t>
+      </w:r>
+    </w:p>
+    <w:p>
+      <w:r>
+        <w:t xml:space="preserve">The phone's existing </w:t>
+      </w:r>
+      <w:r>
+        <w:rPr>
+          <w:rFonts w:ascii="Courier New" w:hAnsi="Courier New" w:eastAsia="Courier New" w:cs="Courier New"/>
+          <w:color w:val="374151"/>
+          <w:sz w:val="19"/>
+        </w:rPr>
+        <w:t>Lines</w:t>
+      </w:r>
+      <w:r>
+        <w:t xml:space="preserve"> and guidance logic decide what to say. This route</w:t>
+      </w:r>
+    </w:p>
+    <w:p>
+      <w:r>
+        <w:t>converts that exact text to speech; it does not generate an answer or recognize</w:t>
+      </w:r>
+    </w:p>
+    <w:p>
+      <w:r>
+        <w:t>speech. It uses the same fail-closed Tailscale authentication as every other route.</w:t>
+      </w:r>
+    </w:p>
+    <w:tbl>
+      <w:tblPr>
+        <w:tblW w:type="auto" w:w="0"/>
+        <w:tblLayout w:type="fixed"/>
+        <w:tblLook w:firstColumn="1" w:firstRow="1" w:lastColumn="0" w:lastRow="0" w:noHBand="0" w:noVBand="1" w:val="04A0"/>
+      </w:tblPr>
+      <w:tblGrid>
+        <w:gridCol w:w="9648"/>
+      </w:tblGrid>
+      <w:tr>
+        <w:tc>
+          <w:tcPr>
+            <w:tcW w:type="dxa" w:w="9648"/>
+            <w:shd w:val="clear" w:color="auto" w:fill="F3F4F6"/>
+          </w:tcPr>
+          <w:p>
+            <w:pPr>
+              <w:spacing w:after="0" w:line="240" w:lineRule="auto"/>
+            </w:pPr>
+            <w:r>
+              <w:rPr>
+                <w:rFonts w:ascii="Courier New" w:hAnsi="Courier New" w:eastAsia="Courier New" w:cs="Courier New"/>
+                <w:color w:val="1F2937"/>
+                <w:sz w:val="17"/>
+              </w:rPr>
+              <w:t>{"text": "Polo! On your left, two steps, on the table."}</w:t>
+            </w:r>
+          </w:p>
+        </w:tc>
+      </w:tr>
+    </w:tbl>
+    <w:p>
+      <w:pPr>
+        <w:spacing w:after="40"/>
+      </w:pPr>
+    </w:p>
+    <w:p>
+      <w:pPr>
+        <w:numPr>
+          <w:ilvl w:val="0"/>
+          <w:numId w:val="922"/>
+        </w:numPr>
+        <w:pStyle w:val="ListParagraph"/>
+      </w:pPr>
+      <w:r>
+        <w:rPr>
+          <w:rFonts w:ascii="Courier New" w:hAnsi="Courier New" w:eastAsia="Courier New" w:cs="Courier New"/>
+          <w:color w:val="374151"/>
+          <w:sz w:val="19"/>
+        </w:rPr>
+        <w:t>text</w:t>
+      </w:r>
+      <w:r>
+        <w:t>: 1–360 characters; whitespace is trimmed. Blank text and NUL are rejected (422).</w:t>
+      </w:r>
+    </w:p>
+    <w:p>
+      <w:pPr>
+        <w:numPr>
+          <w:ilvl w:val="0"/>
+          <w:numId w:val="922"/>
+        </w:numPr>
+        <w:pStyle w:val="ListParagraph"/>
+      </w:pPr>
+      <w:r>
+        <w:rPr>
+          <w:b/>
+        </w:rPr>
+        <w:t>200:</w:t>
+      </w:r>
+      <w:r>
+        <w:t xml:space="preserve"> </w:t>
+      </w:r>
+      <w:r>
+        <w:rPr>
+          <w:rFonts w:ascii="Courier New" w:hAnsi="Courier New" w:eastAsia="Courier New" w:cs="Courier New"/>
+          <w:color w:val="374151"/>
+          <w:sz w:val="19"/>
+        </w:rPr>
+        <w:t>Content-Type: audio/wav</w:t>
+      </w:r>
+      <w:r>
+        <w:t>, mono 24 kHz signed 16-bit PCM in a WAV</w:t>
+      </w:r>
+    </w:p>
+    <w:p>
+      <w:r>
+        <w:t>container, at most 20 seconds. The server uses the standard 44-byte PCM RIFF</w:t>
+      </w:r>
+    </w:p>
+    <w:p>
+      <w:r>
+        <w:t>header followed by sample data; the phone validates format and lengths before</w:t>
+      </w:r>
+    </w:p>
+    <w:p>
+      <w:r>
+        <w:t xml:space="preserve">caching. </w:t>
+      </w:r>
+      <w:r>
+        <w:rPr>
+          <w:rFonts w:ascii="Courier New" w:hAnsi="Courier New" w:eastAsia="Courier New" w:cs="Courier New"/>
+          <w:color w:val="374151"/>
+          <w:sz w:val="19"/>
+        </w:rPr>
+        <w:t>Cache-Control: private, no-store</w:t>
+      </w:r>
+      <w:r>
+        <w:t xml:space="preserve"> prevents HTTP</w:t>
+      </w:r>
+    </w:p>
+    <w:p>
+      <w:r>
+        <w:t xml:space="preserve">caching; </w:t>
+      </w:r>
+      <w:r>
+        <w:rPr>
+          <w:rFonts w:ascii="Courier New" w:hAnsi="Courier New" w:eastAsia="Courier New" w:cs="Courier New"/>
+          <w:color w:val="374151"/>
+          <w:sz w:val="19"/>
+        </w:rPr>
+        <w:t>X-Marco-Speech-Provider: elevenlabs</w:t>
+      </w:r>
+      <w:r>
+        <w:t xml:space="preserve"> identifies the provider and</w:t>
+      </w:r>
+    </w:p>
+    <w:p>
+      <w:r>
+        <w:rPr>
+          <w:rFonts w:ascii="Courier New" w:hAnsi="Courier New" w:eastAsia="Courier New" w:cs="Courier New"/>
+          <w:color w:val="374151"/>
+          <w:sz w:val="19"/>
+        </w:rPr>
+        <w:t>X-Marco-Speech-Cache: hit|miss</w:t>
+      </w:r>
+      <w:r>
+        <w:t xml:space="preserve"> identifies reuse of a cached/pending request.</w:t>
+      </w:r>
+    </w:p>
+    <w:p>
+      <w:pPr>
+        <w:numPr>
+          <w:ilvl w:val="0"/>
+          <w:numId w:val="923"/>
+        </w:numPr>
+        <w:pStyle w:val="ListParagraph"/>
+      </w:pPr>
+      <w:r>
+        <w:rPr>
+          <w:b/>
+        </w:rPr>
+        <w:t>503:</w:t>
+      </w:r>
+      <w:r>
+        <w:t xml:space="preserve"> unconfigured key, provider failure, invalid audio, saturation or</w:t>
+      </w:r>
+    </w:p>
+    <w:p>
+      <w:r>
+        <w:t xml:space="preserve">timeout. The phone falls back to Apple's </w:t>
+      </w:r>
+      <w:r>
+        <w:rPr>
+          <w:rFonts w:ascii="Courier New" w:hAnsi="Courier New" w:eastAsia="Courier New" w:cs="Courier New"/>
+          <w:color w:val="374151"/>
+          <w:sz w:val="19"/>
+        </w:rPr>
+        <w:t>AVSpeechSynthesizer</w:t>
+      </w:r>
+      <w:r>
+        <w:t>. The server's</w:t>
+      </w:r>
+    </w:p>
+    <w:p>
+      <w:r>
+        <w:t>deadline is 2.5 s and the phone's is 3 s; after failure the phone uses Apple for</w:t>
+      </w:r>
+    </w:p>
+    <w:p>
+      <w:r>
+        <w:t xml:space="preserve">uncached lines for 15 s before trying again. </w:t>
+      </w:r>
+      <w:r>
+        <w:rPr>
+          <w:b/>
+        </w:rPr>
+        <w:t>403:</w:t>
+      </w:r>
+      <w:r>
+        <w:t xml:space="preserve"> caller not authorized.</w:t>
+      </w:r>
+    </w:p>
+    <w:p>
+      <w:pPr>
+        <w:numPr>
+          <w:ilvl w:val="0"/>
+          <w:numId w:val="924"/>
+        </w:numPr>
+        <w:pStyle w:val="ListParagraph"/>
+      </w:pPr>
+      <w:r>
+        <w:t>Server cache: at most 128 entries / 8 MiB, keyed by voice, model and text;</w:t>
+      </w:r>
+    </w:p>
+    <w:p>
+      <w:r>
+        <w:t>duplicate pending lines share generation. Phone cache: 64 entries / 8 MiB,</w:t>
+      </w:r>
+    </w:p>
+    <w:p>
+      <w:r>
+        <w:t>cleared when the configured server changes. Caches are memory-only.</w:t>
+      </w:r>
+    </w:p>
+    <w:p>
+      <w:pPr>
+        <w:numPr>
+          <w:ilvl w:val="0"/>
+          <w:numId w:val="925"/>
+        </w:numPr>
+        <w:pStyle w:val="ListParagraph"/>
+      </w:pPr>
+      <w:r>
+        <w:t>A newer line, wake blip, Stop or stopped session cancels pending playback.</w:t>
+      </w:r>
+    </w:p>
+    <w:p>
+      <w:r>
+        <w:t>Late replies cannot speak an old instruction. The phone converts the WAV to</w:t>
+      </w:r>
+    </w:p>
+    <w:p>
+      <w:r>
+        <w:t>its existing mono spatial voice node; world anchors, beeps, head fusion and</w:t>
+      </w:r>
+    </w:p>
+    <w:p>
+      <w:r>
+        <w:t>the 60 Hz guidance loop remain on the phone. No TTS request per sensor tick.</w:t>
+      </w:r>
+    </w:p>
+    <w:p>
+      <w:pPr>
+        <w:numPr>
+          <w:ilvl w:val="0"/>
+          <w:numId w:val="926"/>
+        </w:numPr>
+        <w:pStyle w:val="ListParagraph"/>
+      </w:pPr>
+      <w:r>
+        <w:t>Key and stock voice/model configuration stay on the server. Defaults:</w:t>
+      </w:r>
+    </w:p>
+    <w:p>
+      <w:r>
+        <w:rPr>
+          <w:rFonts w:ascii="Courier New" w:hAnsi="Courier New" w:eastAsia="Courier New" w:cs="Courier New"/>
+          <w:color w:val="374151"/>
+          <w:sz w:val="19"/>
+        </w:rPr>
+        <w:t>ELEVENLABS_VOICE_ID=JBFqnCBsd6RMkjVDRZzb</w:t>
+      </w:r>
+      <w:r>
+        <w:t>,</w:t>
+      </w:r>
+    </w:p>
+    <w:p>
+      <w:r>
+        <w:rPr>
+          <w:rFonts w:ascii="Courier New" w:hAnsi="Courier New" w:eastAsia="Courier New" w:cs="Courier New"/>
+          <w:color w:val="374151"/>
+          <w:sz w:val="19"/>
+        </w:rPr>
+        <w:t>ELEVENLABS_TTS_MODEL=eleven_flash_v2_5</w:t>
+      </w:r>
+      <w:r>
+        <w:t xml:space="preserve">. See </w:t>
+      </w:r>
+      <w:r>
+        <w:rPr>
+          <w:rFonts w:ascii="Courier New" w:hAnsi="Courier New" w:eastAsia="Courier New" w:cs="Courier New"/>
+          <w:color w:val="374151"/>
+          <w:sz w:val="19"/>
+        </w:rPr>
+        <w:t>server/.env.example</w:t>
+      </w:r>
+      <w:r>
+        <w:t>.</w:t>
       </w:r>
     </w:p>
     <w:p>
@@ -2974,7 +3299,7 @@
       <w:pPr>
         <w:numPr>
           <w:ilvl w:val="0"/>
-          <w:numId w:val="922"/>
+          <w:numId w:val="927"/>
         </w:numPr>
         <w:pStyle w:val="ListParagraph"/>
       </w:pPr>
@@ -3005,7 +3330,7 @@
       <w:pPr>
         <w:numPr>
           <w:ilvl w:val="0"/>
-          <w:numId w:val="922"/>
+          <w:numId w:val="927"/>
         </w:numPr>
         <w:pStyle w:val="ListParagraph"/>
       </w:pPr>
@@ -3036,7 +3361,7 @@
       <w:pPr>
         <w:numPr>
           <w:ilvl w:val="0"/>
-          <w:numId w:val="922"/>
+          <w:numId w:val="927"/>
         </w:numPr>
         <w:pStyle w:val="ListParagraph"/>
       </w:pPr>
@@ -3056,7 +3381,7 @@
       <w:pPr>
         <w:numPr>
           <w:ilvl w:val="0"/>
-          <w:numId w:val="922"/>
+          <w:numId w:val="927"/>
         </w:numPr>
         <w:pStyle w:val="ListParagraph"/>
       </w:pPr>
@@ -3067,30 +3392,27 @@
         <w:t>Touching a known item</w:t>
       </w:r>
       <w:r>
-        <w:t xml:space="preserve"> while not being guided to it names it: the phone plays its label audio, or says its label text, or "That's the {name}."</w:t>
+        <w:t xml:space="preserve"> while not being guided to it names it: the phone says its label text, or "That's the {name}," through §3.5 with Apple fallback.</w:t>
       </w:r>
     </w:p>
     <w:p>
       <w:pPr>
         <w:numPr>
           <w:ilvl w:val="0"/>
-          <w:numId w:val="922"/>
+          <w:numId w:val="927"/>
         </w:numPr>
         <w:pStyle w:val="ListParagraph"/>
       </w:pPr>
-      <w:r>
-        <w:t xml:space="preserve">The phone caches label audio, so touch playback never waits for the network. </w:t>
-      </w:r>
       <w:r>
         <w:rPr>
           <w:rFonts w:ascii="Courier New" w:hAnsi="Courier New" w:eastAsia="Courier New" w:cs="Courier New"/>
           <w:color w:val="374151"/>
           <w:sz w:val="19"/>
         </w:rPr>
-        <w:t>GET /v1/audio/{id}</w:t>
-      </w:r>
-      <w:r>
-        <w:t xml:space="preserve"> returns the original format (an iMessage voice note is </w:t>
+        <w:t>label_audio_url</w:t>
+      </w:r>
+      <w:r>
+        <w:t xml:space="preserve"> and </w:t>
       </w:r>
       <w:r>
         <w:rPr>
@@ -3098,10 +3420,10 @@
           <w:color w:val="374151"/>
           <w:sz w:val="19"/>
         </w:rPr>
-        <w:t>.caf</w:t>
-      </w:r>
-      <w:r>
-        <w:t>).</w:t>
+        <w:t>GET /v1/audio/{id}</w:t>
+      </w:r>
+      <w:r>
+        <w:t xml:space="preserve"> remain for stored-data and older-client compatibility. The current iOS app does not download or prefer caretaker recordings; it caches synthesized replies instead.</w:t>
       </w:r>
     </w:p>
     <w:p>
@@ -3168,7 +3490,7 @@
       <w:pPr>
         <w:numPr>
           <w:ilvl w:val="0"/>
-          <w:numId w:val="923"/>
+          <w:numId w:val="928"/>
         </w:numPr>
         <w:pStyle w:val="ListParagraph"/>
       </w:pPr>
@@ -3183,7 +3505,7 @@
       <w:pPr>
         <w:numPr>
           <w:ilvl w:val="1"/>
-          <w:numId w:val="924"/>
+          <w:numId w:val="929"/>
         </w:numPr>
         <w:pStyle w:val="ListParagraph"/>
       </w:pPr>
@@ -3206,7 +3528,7 @@
       <w:pPr>
         <w:numPr>
           <w:ilvl w:val="1"/>
-          <w:numId w:val="924"/>
+          <w:numId w:val="929"/>
         </w:numPr>
         <w:pStyle w:val="ListParagraph"/>
       </w:pPr>
@@ -3229,7 +3551,7 @@
       <w:pPr>
         <w:numPr>
           <w:ilvl w:val="1"/>
-          <w:numId w:val="924"/>
+          <w:numId w:val="929"/>
         </w:numPr>
         <w:pStyle w:val="ListParagraph"/>
       </w:pPr>
@@ -3246,357 +3568,6 @@
       </w:r>
       <w:r>
         <w:t xml:space="preserve"> (with about 2 s of clock slack): never start it late.</w:t>
-      </w:r>
-    </w:p>
-    <w:p>
-      <w:pPr>
-        <w:numPr>
-          <w:ilvl w:val="0"/>
-          <w:numId w:val="923"/>
-        </w:numPr>
-        <w:pStyle w:val="ListParagraph"/>
-      </w:pPr>
-      <w:r>
-        <w:rPr>
-          <w:b/>
-        </w:rPr>
-        <w:t>Find:</w:t>
-      </w:r>
-      <w:r>
-        <w:t xml:space="preserve"> guide to exactly </w:t>
-      </w:r>
-      <w:r>
-        <w:rPr>
-          <w:rFonts w:ascii="Courier New" w:hAnsi="Courier New" w:eastAsia="Courier New" w:cs="Courier New"/>
-          <w:color w:val="374151"/>
-          <w:sz w:val="19"/>
-        </w:rPr>
-        <w:t>item_id</w:t>
-      </w:r>
-      <w:r>
-        <w:t xml:space="preserve"> at </w:t>
-      </w:r>
-      <w:r>
-        <w:rPr>
-          <w:rFonts w:ascii="Courier New" w:hAnsi="Courier New" w:eastAsia="Courier New" w:cs="Courier New"/>
-          <w:color w:val="374151"/>
-          <w:sz w:val="19"/>
-        </w:rPr>
-        <w:t>position</w:t>
-      </w:r>
-      <w:r>
-        <w:t xml:space="preserve">, the same way as a voice Find; don't look the item up by name. Reject with </w:t>
-      </w:r>
-      <w:r>
-        <w:rPr>
-          <w:rFonts w:ascii="Courier New" w:hAnsi="Courier New" w:eastAsia="Courier New" w:cs="Courier New"/>
-          <w:color w:val="374151"/>
-          <w:sz w:val="19"/>
-        </w:rPr>
-        <w:t>position_unavailable</w:t>
-      </w:r>
-      <w:r>
-        <w:t xml:space="preserve"> when tracking isn't usable.</w:t>
-      </w:r>
-    </w:p>
-    <w:p>
-      <w:pPr>
-        <w:numPr>
-          <w:ilvl w:val="0"/>
-          <w:numId w:val="923"/>
-        </w:numPr>
-        <w:pStyle w:val="ListParagraph"/>
-      </w:pPr>
-      <w:r>
-        <w:rPr>
-          <w:b/>
-        </w:rPr>
-        <w:t>Stop:</w:t>
-      </w:r>
-      <w:r>
-        <w:t xml:space="preserve"> stop guidance only; the camera and streams stay on.</w:t>
-      </w:r>
-    </w:p>
-    <w:p>
-      <w:pPr>
-        <w:numPr>
-          <w:ilvl w:val="0"/>
-          <w:numId w:val="923"/>
-        </w:numPr>
-        <w:pStyle w:val="ListParagraph"/>
-      </w:pPr>
-      <w:r>
-        <w:rPr>
-          <w:b/>
-        </w:rPr>
-        <w:t>Ack:</w:t>
-      </w:r>
-      <w:r>
-        <w:t xml:space="preserve"> send </w:t>
-      </w:r>
-      <w:r>
-        <w:rPr>
-          <w:rFonts w:ascii="Courier New" w:hAnsi="Courier New" w:eastAsia="Courier New" w:cs="Courier New"/>
-          <w:color w:val="374151"/>
-          <w:sz w:val="19"/>
-        </w:rPr>
-        <w:t>command_ack</w:t>
-      </w:r>
-      <w:r>
-        <w:t xml:space="preserve"> (§3.2) for every command you act on or refuse.</w:t>
-      </w:r>
-    </w:p>
-    <w:p>
-      <w:pPr>
-        <w:pStyle w:val="Heading1"/>
-      </w:pPr>
-      <w:r>
-        <w:t>5. Photon to server (Utkarsh's Photon service)</w:t>
-      </w:r>
-    </w:p>
-    <w:p>
-      <w:pPr>
-        <w:numPr>
-          <w:ilvl w:val="0"/>
-          <w:numId w:val="925"/>
-        </w:numPr>
-        <w:pStyle w:val="ListParagraph"/>
-      </w:pPr>
-      <w:r>
-        <w:rPr>
-          <w:b/>
-        </w:rPr>
-        <w:t>Connect through the `tailscale serve` URL,</w:t>
-      </w:r>
-      <w:r>
-        <w:t xml:space="preserve"> even on the server Mac, so the allow-list sees the bridge's tailnet login.</w:t>
-      </w:r>
-    </w:p>
-    <w:p>
-      <w:pPr>
-        <w:numPr>
-          <w:ilvl w:val="0"/>
-          <w:numId w:val="925"/>
-        </w:numPr>
-        <w:pStyle w:val="ListParagraph"/>
-      </w:pPr>
-      <w:r>
-        <w:rPr>
-          <w:b/>
-        </w:rPr>
-        <w:t>Requests:</w:t>
-      </w:r>
-      <w:r>
-        <w:t xml:space="preserve"> listen on WebSocket </w:t>
-      </w:r>
-      <w:r>
-        <w:rPr>
-          <w:rFonts w:ascii="Courier New" w:hAnsi="Courier New" w:eastAsia="Courier New" w:cs="Courier New"/>
-          <w:color w:val="374151"/>
-          <w:sz w:val="19"/>
-        </w:rPr>
-        <w:t>/v1/photon</w:t>
-      </w:r>
-      <w:r>
-        <w:t xml:space="preserve"> for </w:t>
-      </w:r>
-      <w:r>
-        <w:rPr>
-          <w:rFonts w:ascii="Courier New" w:hAnsi="Courier New" w:eastAsia="Courier New" w:cs="Courier New"/>
-          <w:color w:val="374151"/>
-          <w:sz w:val="19"/>
-        </w:rPr>
-        <w:t>{"type": "label_request", "touch_id": "…", "crop_url": "/v1/touch/…/crop.jpg", "question": "What is this?"}</w:t>
-      </w:r>
-      <w:r>
-        <w:t>. These are sent when the user asks "what is this?" about an unknown item.</w:t>
-      </w:r>
-    </w:p>
-    <w:p>
-      <w:pPr>
-        <w:numPr>
-          <w:ilvl w:val="0"/>
-          <w:numId w:val="925"/>
-        </w:numPr>
-        <w:pStyle w:val="ListParagraph"/>
-      </w:pPr>
-      <w:r>
-        <w:rPr>
-          <w:b/>
-        </w:rPr>
-        <w:t>Asking:</w:t>
-      </w:r>
-      <w:r>
-        <w:t xml:space="preserve"> send the crop (the touched item boxed) to the caretaker over iMessage.</w:t>
-      </w:r>
-    </w:p>
-    <w:p>
-      <w:pPr>
-        <w:numPr>
-          <w:ilvl w:val="0"/>
-          <w:numId w:val="925"/>
-        </w:numPr>
-        <w:pStyle w:val="ListParagraph"/>
-      </w:pPr>
-      <w:r>
-        <w:rPr>
-          <w:b/>
-        </w:rPr>
-        <w:t>Replying:</w:t>
-      </w:r>
-      <w:r>
-        <w:t xml:space="preserve"> post the answer to </w:t>
-      </w:r>
-      <w:r>
-        <w:rPr>
-          <w:rFonts w:ascii="Courier New" w:hAnsi="Courier New" w:eastAsia="Courier New" w:cs="Courier New"/>
-          <w:color w:val="374151"/>
-          <w:sz w:val="19"/>
-        </w:rPr>
-        <w:t>POST /v1/labels</w:t>
-      </w:r>
-      <w:r>
-        <w:t xml:space="preserve"> as multipart:</w:t>
-      </w:r>
-    </w:p>
-    <w:p>
-      <w:pPr>
-        <w:numPr>
-          <w:ilvl w:val="1"/>
-          <w:numId w:val="926"/>
-        </w:numPr>
-        <w:pStyle w:val="ListParagraph"/>
-      </w:pPr>
-      <w:r>
-        <w:rPr>
-          <w:rFonts w:ascii="Courier New" w:hAnsi="Courier New" w:eastAsia="Courier New" w:cs="Courier New"/>
-          <w:color w:val="374151"/>
-          <w:sz w:val="19"/>
-        </w:rPr>
-        <w:t>touch_id</w:t>
-      </w:r>
-      <w:r>
-        <w:t xml:space="preserve">, </w:t>
-      </w:r>
-      <w:r>
-        <w:rPr>
-          <w:rFonts w:ascii="Courier New" w:hAnsi="Courier New" w:eastAsia="Courier New" w:cs="Courier New"/>
-          <w:color w:val="374151"/>
-          <w:sz w:val="19"/>
-        </w:rPr>
-        <w:t>name</w:t>
-      </w:r>
-      <w:r>
-        <w:t xml:space="preserve"> (short, e.g. "cumin"), and </w:t>
-      </w:r>
-      <w:r>
-        <w:rPr>
-          <w:rFonts w:ascii="Courier New" w:hAnsi="Courier New" w:eastAsia="Courier New" w:cs="Courier New"/>
-          <w:color w:val="374151"/>
-          <w:sz w:val="19"/>
-        </w:rPr>
-        <w:t>text</w:t>
-      </w:r>
-      <w:r>
-        <w:t xml:space="preserve"> (the caretaker's words, which the phone speaks);</w:t>
-      </w:r>
-    </w:p>
-    <w:p>
-      <w:pPr>
-        <w:numPr>
-          <w:ilvl w:val="1"/>
-          <w:numId w:val="926"/>
-        </w:numPr>
-        <w:pStyle w:val="ListParagraph"/>
-      </w:pPr>
-      <w:r>
-        <w:t xml:space="preserve">optionally </w:t>
-      </w:r>
-      <w:r>
-        <w:rPr>
-          <w:rFonts w:ascii="Courier New" w:hAnsi="Courier New" w:eastAsia="Courier New" w:cs="Courier New"/>
-          <w:color w:val="374151"/>
-          <w:sz w:val="19"/>
-        </w:rPr>
-        <w:t>audio</w:t>
-      </w:r>
-      <w:r>
-        <w:t xml:space="preserve"> (the voice memo, any format).</w:t>
-      </w:r>
-    </w:p>
-    <w:p>
-      <w:r>
-        <w:t>The server:</w:t>
-      </w:r>
-    </w:p>
-    <w:p>
-      <w:pPr>
-        <w:numPr>
-          <w:ilvl w:val="1"/>
-          <w:numId w:val="927"/>
-        </w:numPr>
-        <w:pStyle w:val="ListParagraph"/>
-      </w:pPr>
-      <w:r>
-        <w:t>registers the item from the crop;</w:t>
-      </w:r>
-    </w:p>
-    <w:p>
-      <w:pPr>
-        <w:numPr>
-          <w:ilvl w:val="1"/>
-          <w:numId w:val="927"/>
-        </w:numPr>
-        <w:pStyle w:val="ListParagraph"/>
-      </w:pPr>
-      <w:r>
-        <w:t>anchors it where it was touched;</w:t>
-      </w:r>
-    </w:p>
-    <w:p>
-      <w:pPr>
-        <w:numPr>
-          <w:ilvl w:val="1"/>
-          <w:numId w:val="927"/>
-        </w:numPr>
-        <w:pStyle w:val="ListParagraph"/>
-      </w:pPr>
-      <w:r>
-        <w:t xml:space="preserve">sends </w:t>
-      </w:r>
-      <w:r>
-        <w:rPr>
-          <w:rFonts w:ascii="Courier New" w:hAnsi="Courier New" w:eastAsia="Courier New" w:cs="Courier New"/>
-          <w:color w:val="374151"/>
-          <w:sz w:val="19"/>
-        </w:rPr>
-        <w:t>label_ready</w:t>
-      </w:r>
-      <w:r>
-        <w:t xml:space="preserve"> to the phone;</w:t>
-      </w:r>
-    </w:p>
-    <w:p>
-      <w:pPr>
-        <w:numPr>
-          <w:ilvl w:val="1"/>
-          <w:numId w:val="927"/>
-        </w:numPr>
-        <w:pStyle w:val="ListParagraph"/>
-      </w:pPr>
-      <w:r>
-        <w:t xml:space="preserve">replies </w:t>
-      </w:r>
-      <w:r>
-        <w:rPr>
-          <w:rFonts w:ascii="Courier New" w:hAnsi="Courier New" w:eastAsia="Courier New" w:cs="Courier New"/>
-          <w:color w:val="374151"/>
-          <w:sz w:val="19"/>
-        </w:rPr>
-        <w:t>{"status": "ok", "item_id": "…"}</w:t>
-      </w:r>
-      <w:r>
-        <w:t>.</w:t>
       </w:r>
     </w:p>
     <w:p>
@@ -3611,10 +3582,10 @@
         <w:rPr>
           <w:b/>
         </w:rPr>
-        <w:t>A voice note after the name:</w:t>
-      </w:r>
-      <w:r>
-        <w:t xml:space="preserve"> post again with that </w:t>
+        <w:t>Find:</w:t>
+      </w:r>
+      <w:r>
+        <w:t xml:space="preserve"> guide to exactly </w:t>
       </w:r>
       <w:r>
         <w:rPr>
@@ -3625,7 +3596,7 @@
         <w:t>item_id</w:t>
       </w:r>
       <w:r>
-        <w:t xml:space="preserve"> (instead of </w:t>
+        <w:t xml:space="preserve"> at </w:t>
       </w:r>
       <w:r>
         <w:rPr>
@@ -3633,10 +3604,10 @@
           <w:color w:val="374151"/>
           <w:sz w:val="19"/>
         </w:rPr>
-        <w:t>touch_id</w:t>
-      </w:r>
-      <w:r>
-        <w:t xml:space="preserve">), the same </w:t>
+        <w:t>position</w:t>
+      </w:r>
+      <w:r>
+        <w:t xml:space="preserve">, the same way as a voice Find; don't look the item up by name. Reject with </w:t>
       </w:r>
       <w:r>
         <w:rPr>
@@ -3644,32 +3615,10 @@
           <w:color w:val="374151"/>
           <w:sz w:val="19"/>
         </w:rPr>
-        <w:t>name</w:t>
-      </w:r>
-      <w:r>
-        <w:t xml:space="preserve"> and </w:t>
-      </w:r>
-      <w:r>
-        <w:rPr>
-          <w:rFonts w:ascii="Courier New" w:hAnsi="Courier New" w:eastAsia="Courier New" w:cs="Courier New"/>
-          <w:color w:val="374151"/>
-          <w:sz w:val="19"/>
-        </w:rPr>
-        <w:t>text</w:t>
-      </w:r>
-      <w:r>
-        <w:t xml:space="preserve">, and the </w:t>
-      </w:r>
-      <w:r>
-        <w:rPr>
-          <w:rFonts w:ascii="Courier New" w:hAnsi="Courier New" w:eastAsia="Courier New" w:cs="Courier New"/>
-          <w:color w:val="374151"/>
-          <w:sz w:val="19"/>
-        </w:rPr>
-        <w:t>audio</w:t>
-      </w:r>
-      <w:r>
-        <w:t>.</w:t>
+        <w:t>position_unavailable</w:t>
+      </w:r>
+      <w:r>
+        <w:t xml:space="preserve"> when tracking isn't usable.</w:t>
       </w:r>
     </w:p>
     <w:p>
@@ -3684,32 +3633,10 @@
         <w:rPr>
           <w:b/>
         </w:rPr>
-        <w:t>Caretaker-initiated setup:</w:t>
-      </w:r>
-      <w:r>
-        <w:t xml:space="preserve"> the caretaker sends a photo with a caption. Post it to </w:t>
-      </w:r>
-      <w:r>
-        <w:rPr>
-          <w:rFonts w:ascii="Courier New" w:hAnsi="Courier New" w:eastAsia="Courier New" w:cs="Courier New"/>
-          <w:color w:val="374151"/>
-          <w:sz w:val="19"/>
-        </w:rPr>
-        <w:t>POST /v1/items</w:t>
-      </w:r>
-      <w:r>
-        <w:t xml:space="preserve"> with </w:t>
-      </w:r>
-      <w:r>
-        <w:rPr>
-          <w:rFonts w:ascii="Courier New" w:hAnsi="Courier New" w:eastAsia="Courier New" w:cs="Courier New"/>
-          <w:color w:val="374151"/>
-          <w:sz w:val="19"/>
-        </w:rPr>
-        <w:t>name</w:t>
-      </w:r>
-      <w:r>
-        <w:t xml:space="preserve"> = the caption.</w:t>
+        <w:t>Stop:</w:t>
+      </w:r>
+      <w:r>
+        <w:t xml:space="preserve"> stop guidance only; the camera and streams stay on.</w:t>
       </w:r>
     </w:p>
     <w:p>
@@ -3724,10 +3651,10 @@
         <w:rPr>
           <w:b/>
         </w:rPr>
-        <w:t>`source=photon`</w:t>
-      </w:r>
-      <w:r>
-        <w:t xml:space="preserve"> goes on every Photon </w:t>
+        <w:t>Ack:</w:t>
+      </w:r>
+      <w:r>
+        <w:t xml:space="preserve"> send </w:t>
       </w:r>
       <w:r>
         <w:rPr>
@@ -3735,10 +3662,54 @@
           <w:color w:val="374151"/>
           <w:sz w:val="19"/>
         </w:rPr>
-        <w:t>POST /v1/items</w:t>
-      </w:r>
-      <w:r>
-        <w:t xml:space="preserve"> and </w:t>
+        <w:t>command_ack</w:t>
+      </w:r>
+      <w:r>
+        <w:t xml:space="preserve"> (§3.2) for every command you act on or refuse.</w:t>
+      </w:r>
+    </w:p>
+    <w:p>
+      <w:pPr>
+        <w:pStyle w:val="Heading1"/>
+      </w:pPr>
+      <w:r>
+        <w:t>5. Photon to server (Utkarsh's Photon service)</w:t>
+      </w:r>
+    </w:p>
+    <w:p>
+      <w:pPr>
+        <w:numPr>
+          <w:ilvl w:val="0"/>
+          <w:numId w:val="930"/>
+        </w:numPr>
+        <w:pStyle w:val="ListParagraph"/>
+      </w:pPr>
+      <w:r>
+        <w:rPr>
+          <w:b/>
+        </w:rPr>
+        <w:t>Connect through the `tailscale serve` URL,</w:t>
+      </w:r>
+      <w:r>
+        <w:t xml:space="preserve"> even on the server Mac, so the allow-list sees the bridge's tailnet login.</w:t>
+      </w:r>
+    </w:p>
+    <w:p>
+      <w:pPr>
+        <w:numPr>
+          <w:ilvl w:val="0"/>
+          <w:numId w:val="930"/>
+        </w:numPr>
+        <w:pStyle w:val="ListParagraph"/>
+      </w:pPr>
+      <w:r>
+        <w:rPr>
+          <w:b/>
+        </w:rPr>
+        <w:t>Requests:</w:t>
+      </w:r>
+      <w:r>
+        <w:t xml:space="preserve"> listen on WebSocket </w:t>
       </w:r>
       <w:r>
         <w:rPr>
@@ -3746,28 +3717,10 @@
           <w:color w:val="374151"/>
           <w:sz w:val="19"/>
         </w:rPr>
-        <w:t>POST /v1/labels</w:t>
-      </w:r>
-      <w:r>
-        <w:t xml:space="preserve"> (an item a label creates gets this source).</w:t>
-      </w:r>
-    </w:p>
-    <w:p>
-      <w:pPr>
-        <w:numPr>
-          <w:ilvl w:val="0"/>
-          <w:numId w:val="928"/>
-        </w:numPr>
-        <w:pStyle w:val="ListParagraph"/>
-      </w:pPr>
-      <w:r>
-        <w:rPr>
-          <w:b/>
-        </w:rPr>
-        <w:t>Starting over (testing):</w:t>
-      </w:r>
-      <w:r>
-        <w:t xml:space="preserve"> when a caretaker texts </w:t>
+        <w:t>/v1/photon</w:t>
+      </w:r>
+      <w:r>
+        <w:t xml:space="preserve"> for </w:t>
       </w:r>
       <w:r>
         <w:rPr>
@@ -3775,10 +3728,46 @@
           <w:color w:val="374151"/>
           <w:sz w:val="19"/>
         </w:rPr>
-        <w:t>/restart</w:t>
-      </w:r>
-      <w:r>
-        <w:t xml:space="preserve">, the bridge calls </w:t>
+        <w:t>{"type": "label_request", "touch_id": "…", "crop_url": "/v1/touch/…/crop.jpg", "question": "What is this?"}</w:t>
+      </w:r>
+      <w:r>
+        <w:t>. These are sent when the user asks "what is this?" about an unknown item.</w:t>
+      </w:r>
+    </w:p>
+    <w:p>
+      <w:pPr>
+        <w:numPr>
+          <w:ilvl w:val="0"/>
+          <w:numId w:val="930"/>
+        </w:numPr>
+        <w:pStyle w:val="ListParagraph"/>
+      </w:pPr>
+      <w:r>
+        <w:rPr>
+          <w:b/>
+        </w:rPr>
+        <w:t>Asking:</w:t>
+      </w:r>
+      <w:r>
+        <w:t xml:space="preserve"> send the crop (the touched item boxed) to the caretaker over iMessage.</w:t>
+      </w:r>
+    </w:p>
+    <w:p>
+      <w:pPr>
+        <w:numPr>
+          <w:ilvl w:val="0"/>
+          <w:numId w:val="930"/>
+        </w:numPr>
+        <w:pStyle w:val="ListParagraph"/>
+      </w:pPr>
+      <w:r>
+        <w:rPr>
+          <w:b/>
+        </w:rPr>
+        <w:t>Replying:</w:t>
+      </w:r>
+      <w:r>
+        <w:t xml:space="preserve"> post the answer to </w:t>
       </w:r>
       <w:r>
         <w:rPr>
@@ -3786,57 +3775,30 @@
           <w:color w:val="374151"/>
           <w:sz w:val="19"/>
         </w:rPr>
-        <w:t>DELETE /v1/items?source=photon</w:t>
-      </w:r>
-      <w:r>
-        <w:t>.</w:t>
+        <w:t>POST /v1/labels</w:t>
+      </w:r>
+      <w:r>
+        <w:t xml:space="preserve"> as multipart:</w:t>
       </w:r>
     </w:p>
     <w:p>
       <w:pPr>
         <w:numPr>
           <w:ilvl w:val="1"/>
-          <w:numId w:val="929"/>
+          <w:numId w:val="931"/>
         </w:numPr>
         <w:pStyle w:val="ListParagraph"/>
       </w:pPr>
-      <w:r>
-        <w:t>The server forgets every Photon item, with its label, voice note and saved files.</w:t>
-      </w:r>
-    </w:p>
-    <w:p>
-      <w:pPr>
-        <w:numPr>
-          <w:ilvl w:val="1"/>
-          <w:numId w:val="929"/>
-        </w:numPr>
-        <w:pStyle w:val="ListParagraph"/>
-      </w:pPr>
-      <w:r>
-        <w:t>The app's own setup items (</w:t>
-      </w:r>
       <w:r>
         <w:rPr>
           <w:rFonts w:ascii="Courier New" w:hAnsi="Courier New" w:eastAsia="Courier New" w:cs="Courier New"/>
           <w:color w:val="374151"/>
           <w:sz w:val="19"/>
         </w:rPr>
-        <w:t>source=app</w:t>
-      </w:r>
-      <w:r>
-        <w:t>) are untouched.</w:t>
-      </w:r>
-    </w:p>
-    <w:p>
-      <w:pPr>
-        <w:numPr>
-          <w:ilvl w:val="1"/>
-          <w:numId w:val="929"/>
-        </w:numPr>
-        <w:pStyle w:val="ListParagraph"/>
-      </w:pPr>
-      <w:r>
-        <w:t xml:space="preserve">The reply is </w:t>
+        <w:t>touch_id</w:t>
+      </w:r>
+      <w:r>
+        <w:t xml:space="preserve">, </w:t>
       </w:r>
       <w:r>
         <w:rPr>
@@ -3844,17 +3806,366 @@
           <w:color w:val="374151"/>
           <w:sz w:val="19"/>
         </w:rPr>
-        <w:t>{"status": "ok", "removed": [{"item_id": "…", "name": "…"}]}</w:t>
-      </w:r>
-      <w:r>
-        <w:t>.</w:t>
+        <w:t>name</w:t>
+      </w:r>
+      <w:r>
+        <w:t xml:space="preserve"> (short, e.g. "cumin"), and </w:t>
+      </w:r>
+      <w:r>
+        <w:rPr>
+          <w:rFonts w:ascii="Courier New" w:hAnsi="Courier New" w:eastAsia="Courier New" w:cs="Courier New"/>
+          <w:color w:val="374151"/>
+          <w:sz w:val="19"/>
+        </w:rPr>
+        <w:t>text</w:t>
+      </w:r>
+      <w:r>
+        <w:t xml:space="preserve"> (the caretaker's words, which the phone speaks);</w:t>
       </w:r>
     </w:p>
     <w:p>
       <w:pPr>
         <w:numPr>
           <w:ilvl w:val="1"/>
-          <w:numId w:val="929"/>
+          <w:numId w:val="931"/>
+        </w:numPr>
+        <w:pStyle w:val="ListParagraph"/>
+      </w:pPr>
+      <w:r>
+        <w:t xml:space="preserve">no </w:t>
+      </w:r>
+      <w:r>
+        <w:rPr>
+          <w:rFonts w:ascii="Courier New" w:hAnsi="Courier New" w:eastAsia="Courier New" w:cs="Courier New"/>
+          <w:color w:val="374151"/>
+          <w:sz w:val="19"/>
+        </w:rPr>
+        <w:t>audio</w:t>
+      </w:r>
+      <w:r>
+        <w:t xml:space="preserve"> is sent by the current bridge. The optional legacy upload field remains compatible with older clients and saved data.</w:t>
+      </w:r>
+    </w:p>
+    <w:p>
+      <w:r>
+        <w:t>The server:</w:t>
+      </w:r>
+    </w:p>
+    <w:p>
+      <w:pPr>
+        <w:numPr>
+          <w:ilvl w:val="1"/>
+          <w:numId w:val="932"/>
+        </w:numPr>
+        <w:pStyle w:val="ListParagraph"/>
+      </w:pPr>
+      <w:r>
+        <w:t>registers the item from the crop;</w:t>
+      </w:r>
+    </w:p>
+    <w:p>
+      <w:pPr>
+        <w:numPr>
+          <w:ilvl w:val="1"/>
+          <w:numId w:val="932"/>
+        </w:numPr>
+        <w:pStyle w:val="ListParagraph"/>
+      </w:pPr>
+      <w:r>
+        <w:t>anchors it where it was touched;</w:t>
+      </w:r>
+    </w:p>
+    <w:p>
+      <w:pPr>
+        <w:numPr>
+          <w:ilvl w:val="1"/>
+          <w:numId w:val="932"/>
+        </w:numPr>
+        <w:pStyle w:val="ListParagraph"/>
+      </w:pPr>
+      <w:r>
+        <w:t xml:space="preserve">sends </w:t>
+      </w:r>
+      <w:r>
+        <w:rPr>
+          <w:rFonts w:ascii="Courier New" w:hAnsi="Courier New" w:eastAsia="Courier New" w:cs="Courier New"/>
+          <w:color w:val="374151"/>
+          <w:sz w:val="19"/>
+        </w:rPr>
+        <w:t>label_ready</w:t>
+      </w:r>
+      <w:r>
+        <w:t xml:space="preserve"> to the phone;</w:t>
+      </w:r>
+    </w:p>
+    <w:p>
+      <w:pPr>
+        <w:numPr>
+          <w:ilvl w:val="1"/>
+          <w:numId w:val="932"/>
+        </w:numPr>
+        <w:pStyle w:val="ListParagraph"/>
+      </w:pPr>
+      <w:r>
+        <w:t xml:space="preserve">replies </w:t>
+      </w:r>
+      <w:r>
+        <w:rPr>
+          <w:rFonts w:ascii="Courier New" w:hAnsi="Courier New" w:eastAsia="Courier New" w:cs="Courier New"/>
+          <w:color w:val="374151"/>
+          <w:sz w:val="19"/>
+        </w:rPr>
+        <w:t>{"status": "ok", "item_id": "…"}</w:t>
+      </w:r>
+      <w:r>
+        <w:t>.</w:t>
+      </w:r>
+    </w:p>
+    <w:p>
+      <w:pPr>
+        <w:numPr>
+          <w:ilvl w:val="0"/>
+          <w:numId w:val="933"/>
+        </w:numPr>
+        <w:pStyle w:val="ListParagraph"/>
+      </w:pPr>
+      <w:r>
+        <w:rPr>
+          <w:b/>
+        </w:rPr>
+        <w:t>Corrections:</w:t>
+      </w:r>
+      <w:r>
+        <w:t xml:space="preserve"> post again with that </w:t>
+      </w:r>
+      <w:r>
+        <w:rPr>
+          <w:rFonts w:ascii="Courier New" w:hAnsi="Courier New" w:eastAsia="Courier New" w:cs="Courier New"/>
+          <w:color w:val="374151"/>
+          <w:sz w:val="19"/>
+        </w:rPr>
+        <w:t>item_id</w:t>
+      </w:r>
+      <w:r>
+        <w:t xml:space="preserve"> (instead of </w:t>
+      </w:r>
+      <w:r>
+        <w:rPr>
+          <w:rFonts w:ascii="Courier New" w:hAnsi="Courier New" w:eastAsia="Courier New" w:cs="Courier New"/>
+          <w:color w:val="374151"/>
+          <w:sz w:val="19"/>
+        </w:rPr>
+        <w:t>touch_id</w:t>
+      </w:r>
+      <w:r>
+        <w:t xml:space="preserve">), the corrected </w:t>
+      </w:r>
+      <w:r>
+        <w:rPr>
+          <w:rFonts w:ascii="Courier New" w:hAnsi="Courier New" w:eastAsia="Courier New" w:cs="Courier New"/>
+          <w:color w:val="374151"/>
+          <w:sz w:val="19"/>
+        </w:rPr>
+        <w:t>name</w:t>
+      </w:r>
+      <w:r>
+        <w:t xml:space="preserve"> and typed </w:t>
+      </w:r>
+      <w:r>
+        <w:rPr>
+          <w:rFonts w:ascii="Courier New" w:hAnsi="Courier New" w:eastAsia="Courier New" w:cs="Courier New"/>
+          <w:color w:val="374151"/>
+          <w:sz w:val="19"/>
+        </w:rPr>
+        <w:t>text</w:t>
+      </w:r>
+      <w:r>
+        <w:t>. A standalone recording gets a request to type the name; it is not downloaded, transcribed or uploaded as a label.</w:t>
+      </w:r>
+    </w:p>
+    <w:p>
+      <w:pPr>
+        <w:numPr>
+          <w:ilvl w:val="0"/>
+          <w:numId w:val="933"/>
+        </w:numPr>
+        <w:pStyle w:val="ListParagraph"/>
+      </w:pPr>
+      <w:r>
+        <w:rPr>
+          <w:b/>
+        </w:rPr>
+        <w:t>Caretaker-initiated setup:</w:t>
+      </w:r>
+      <w:r>
+        <w:t xml:space="preserve"> the caretaker sends a photo with a caption. Post it to </w:t>
+      </w:r>
+      <w:r>
+        <w:rPr>
+          <w:rFonts w:ascii="Courier New" w:hAnsi="Courier New" w:eastAsia="Courier New" w:cs="Courier New"/>
+          <w:color w:val="374151"/>
+          <w:sz w:val="19"/>
+        </w:rPr>
+        <w:t>POST /v1/items</w:t>
+      </w:r>
+      <w:r>
+        <w:t xml:space="preserve"> with </w:t>
+      </w:r>
+      <w:r>
+        <w:rPr>
+          <w:rFonts w:ascii="Courier New" w:hAnsi="Courier New" w:eastAsia="Courier New" w:cs="Courier New"/>
+          <w:color w:val="374151"/>
+          <w:sz w:val="19"/>
+        </w:rPr>
+        <w:t>name</w:t>
+      </w:r>
+      <w:r>
+        <w:t xml:space="preserve"> = the caption.</w:t>
+      </w:r>
+    </w:p>
+    <w:p>
+      <w:pPr>
+        <w:numPr>
+          <w:ilvl w:val="0"/>
+          <w:numId w:val="933"/>
+        </w:numPr>
+        <w:pStyle w:val="ListParagraph"/>
+      </w:pPr>
+      <w:r>
+        <w:rPr>
+          <w:b/>
+        </w:rPr>
+        <w:t>`source=photon`</w:t>
+      </w:r>
+      <w:r>
+        <w:t xml:space="preserve"> goes on every Photon </w:t>
+      </w:r>
+      <w:r>
+        <w:rPr>
+          <w:rFonts w:ascii="Courier New" w:hAnsi="Courier New" w:eastAsia="Courier New" w:cs="Courier New"/>
+          <w:color w:val="374151"/>
+          <w:sz w:val="19"/>
+        </w:rPr>
+        <w:t>POST /v1/items</w:t>
+      </w:r>
+      <w:r>
+        <w:t xml:space="preserve"> and </w:t>
+      </w:r>
+      <w:r>
+        <w:rPr>
+          <w:rFonts w:ascii="Courier New" w:hAnsi="Courier New" w:eastAsia="Courier New" w:cs="Courier New"/>
+          <w:color w:val="374151"/>
+          <w:sz w:val="19"/>
+        </w:rPr>
+        <w:t>POST /v1/labels</w:t>
+      </w:r>
+      <w:r>
+        <w:t xml:space="preserve"> (an item a label creates gets this source).</w:t>
+      </w:r>
+    </w:p>
+    <w:p>
+      <w:pPr>
+        <w:numPr>
+          <w:ilvl w:val="0"/>
+          <w:numId w:val="933"/>
+        </w:numPr>
+        <w:pStyle w:val="ListParagraph"/>
+      </w:pPr>
+      <w:r>
+        <w:rPr>
+          <w:b/>
+        </w:rPr>
+        <w:t>Starting over (testing):</w:t>
+      </w:r>
+      <w:r>
+        <w:t xml:space="preserve"> when a caretaker texts </w:t>
+      </w:r>
+      <w:r>
+        <w:rPr>
+          <w:rFonts w:ascii="Courier New" w:hAnsi="Courier New" w:eastAsia="Courier New" w:cs="Courier New"/>
+          <w:color w:val="374151"/>
+          <w:sz w:val="19"/>
+        </w:rPr>
+        <w:t>/restart</w:t>
+      </w:r>
+      <w:r>
+        <w:t xml:space="preserve">, the bridge calls </w:t>
+      </w:r>
+      <w:r>
+        <w:rPr>
+          <w:rFonts w:ascii="Courier New" w:hAnsi="Courier New" w:eastAsia="Courier New" w:cs="Courier New"/>
+          <w:color w:val="374151"/>
+          <w:sz w:val="19"/>
+        </w:rPr>
+        <w:t>DELETE /v1/items?source=photon</w:t>
+      </w:r>
+      <w:r>
+        <w:t>.</w:t>
+      </w:r>
+    </w:p>
+    <w:p>
+      <w:pPr>
+        <w:numPr>
+          <w:ilvl w:val="1"/>
+          <w:numId w:val="934"/>
+        </w:numPr>
+        <w:pStyle w:val="ListParagraph"/>
+      </w:pPr>
+      <w:r>
+        <w:t>The server forgets every Photon item, with its label, voice note and saved files.</w:t>
+      </w:r>
+    </w:p>
+    <w:p>
+      <w:pPr>
+        <w:numPr>
+          <w:ilvl w:val="1"/>
+          <w:numId w:val="934"/>
+        </w:numPr>
+        <w:pStyle w:val="ListParagraph"/>
+      </w:pPr>
+      <w:r>
+        <w:t>The app's own setup items (</w:t>
+      </w:r>
+      <w:r>
+        <w:rPr>
+          <w:rFonts w:ascii="Courier New" w:hAnsi="Courier New" w:eastAsia="Courier New" w:cs="Courier New"/>
+          <w:color w:val="374151"/>
+          <w:sz w:val="19"/>
+        </w:rPr>
+        <w:t>source=app</w:t>
+      </w:r>
+      <w:r>
+        <w:t>) are untouched.</w:t>
+      </w:r>
+    </w:p>
+    <w:p>
+      <w:pPr>
+        <w:numPr>
+          <w:ilvl w:val="1"/>
+          <w:numId w:val="934"/>
+        </w:numPr>
+        <w:pStyle w:val="ListParagraph"/>
+      </w:pPr>
+      <w:r>
+        <w:t xml:space="preserve">The reply is </w:t>
+      </w:r>
+      <w:r>
+        <w:rPr>
+          <w:rFonts w:ascii="Courier New" w:hAnsi="Courier New" w:eastAsia="Courier New" w:cs="Courier New"/>
+          <w:color w:val="374151"/>
+          <w:sz w:val="19"/>
+        </w:rPr>
+        <w:t>{"status": "ok", "removed": [{"item_id": "…", "name": "…"}]}</w:t>
+      </w:r>
+      <w:r>
+        <w:t>.</w:t>
+      </w:r>
+    </w:p>
+    <w:p>
+      <w:pPr>
+        <w:numPr>
+          <w:ilvl w:val="1"/>
+          <w:numId w:val="934"/>
         </w:numPr>
         <w:pStyle w:val="ListParagraph"/>
       </w:pPr>
@@ -4359,7 +4670,7 @@
       <w:pPr>
         <w:numPr>
           <w:ilvl w:val="0"/>
-          <w:numId w:val="930"/>
+          <w:numId w:val="935"/>
         </w:numPr>
         <w:pStyle w:val="ListParagraph"/>
       </w:pPr>
@@ -4388,7 +4699,7 @@
       <w:pPr>
         <w:numPr>
           <w:ilvl w:val="0"/>
-          <w:numId w:val="930"/>
+          <w:numId w:val="935"/>
         </w:numPr>
         <w:pStyle w:val="ListParagraph"/>
       </w:pPr>
@@ -4428,7 +4739,7 @@
       <w:pPr>
         <w:numPr>
           <w:ilvl w:val="1"/>
-          <w:numId w:val="931"/>
+          <w:numId w:val="936"/>
         </w:numPr>
         <w:pStyle w:val="ListParagraph"/>
       </w:pPr>
@@ -4457,7 +4768,7 @@
       <w:pPr>
         <w:numPr>
           <w:ilvl w:val="1"/>
-          <w:numId w:val="931"/>
+          <w:numId w:val="936"/>
         </w:numPr>
         <w:pStyle w:val="ListParagraph"/>
       </w:pPr>
@@ -4519,7 +4830,7 @@
       <w:pPr>
         <w:numPr>
           <w:ilvl w:val="1"/>
-          <w:numId w:val="931"/>
+          <w:numId w:val="936"/>
         </w:numPr>
         <w:pStyle w:val="ListParagraph"/>
       </w:pPr>
@@ -4559,7 +4870,7 @@
       <w:pPr>
         <w:numPr>
           <w:ilvl w:val="1"/>
-          <w:numId w:val="931"/>
+          <w:numId w:val="936"/>
         </w:numPr>
         <w:pStyle w:val="ListParagraph"/>
       </w:pPr>
@@ -4588,7 +4899,7 @@
       <w:pPr>
         <w:numPr>
           <w:ilvl w:val="1"/>
-          <w:numId w:val="931"/>
+          <w:numId w:val="936"/>
         </w:numPr>
         <w:pStyle w:val="ListParagraph"/>
       </w:pPr>
@@ -4694,7 +5005,7 @@
       <w:pPr>
         <w:numPr>
           <w:ilvl w:val="0"/>
-          <w:numId w:val="930"/>
+          <w:numId w:val="935"/>
         </w:numPr>
         <w:pStyle w:val="ListParagraph"/>
       </w:pPr>
@@ -4709,7 +5020,7 @@
       <w:pPr>
         <w:numPr>
           <w:ilvl w:val="1"/>
-          <w:numId w:val="932"/>
+          <w:numId w:val="937"/>
         </w:numPr>
         <w:pStyle w:val="ListParagraph"/>
       </w:pPr>
@@ -4738,7 +5049,7 @@
       <w:pPr>
         <w:numPr>
           <w:ilvl w:val="1"/>
-          <w:numId w:val="932"/>
+          <w:numId w:val="937"/>
         </w:numPr>
         <w:pStyle w:val="ListParagraph"/>
       </w:pPr>
@@ -4756,7 +5067,7 @@
       <w:pPr>
         <w:numPr>
           <w:ilvl w:val="1"/>
-          <w:numId w:val="932"/>
+          <w:numId w:val="937"/>
         </w:numPr>
         <w:pStyle w:val="ListParagraph"/>
       </w:pPr>
@@ -4774,7 +5085,7 @@
       <w:pPr>
         <w:numPr>
           <w:ilvl w:val="2"/>
-          <w:numId w:val="933"/>
+          <w:numId w:val="938"/>
         </w:numPr>
         <w:pStyle w:val="ListParagraph"/>
       </w:pPr>
@@ -4797,7 +5108,7 @@
       <w:pPr>
         <w:numPr>
           <w:ilvl w:val="2"/>
-          <w:numId w:val="933"/>
+          <w:numId w:val="938"/>
         </w:numPr>
         <w:pStyle w:val="ListParagraph"/>
       </w:pPr>
@@ -4820,7 +5131,7 @@
       <w:pPr>
         <w:numPr>
           <w:ilvl w:val="2"/>
-          <w:numId w:val="933"/>
+          <w:numId w:val="938"/>
         </w:numPr>
         <w:pStyle w:val="ListParagraph"/>
       </w:pPr>
@@ -4843,7 +5154,7 @@
       <w:pPr>
         <w:numPr>
           <w:ilvl w:val="2"/>
-          <w:numId w:val="933"/>
+          <w:numId w:val="938"/>
         </w:numPr>
         <w:pStyle w:val="ListParagraph"/>
       </w:pPr>
@@ -4877,7 +5188,7 @@
       <w:pPr>
         <w:numPr>
           <w:ilvl w:val="1"/>
-          <w:numId w:val="932"/>
+          <w:numId w:val="937"/>
         </w:numPr>
         <w:pStyle w:val="ListParagraph"/>
       </w:pPr>
@@ -4928,7 +5239,7 @@
       <w:pPr>
         <w:numPr>
           <w:ilvl w:val="1"/>
-          <w:numId w:val="932"/>
+          <w:numId w:val="937"/>
         </w:numPr>
         <w:pStyle w:val="ListParagraph"/>
       </w:pPr>
@@ -4979,7 +5290,7 @@
       <w:pPr>
         <w:numPr>
           <w:ilvl w:val="1"/>
-          <w:numId w:val="932"/>
+          <w:numId w:val="937"/>
         </w:numPr>
         <w:pStyle w:val="ListParagraph"/>
       </w:pPr>
@@ -5041,7 +5352,7 @@
       <w:pPr>
         <w:numPr>
           <w:ilvl w:val="0"/>
-          <w:numId w:val="930"/>
+          <w:numId w:val="935"/>
         </w:numPr>
         <w:pStyle w:val="ListParagraph"/>
       </w:pPr>
@@ -5560,7 +5871,7 @@
       <w:pPr>
         <w:numPr>
           <w:ilvl w:val="0"/>
-          <w:numId w:val="934"/>
+          <w:numId w:val="939"/>
         </w:numPr>
         <w:pStyle w:val="ListParagraph"/>
       </w:pPr>
@@ -5583,532 +5894,6 @@
       </w:r>
       <w:r>
         <w:t>.</w:t>
-      </w:r>
-    </w:p>
-    <w:p>
-      <w:pPr>
-        <w:numPr>
-          <w:ilvl w:val="0"/>
-          <w:numId w:val="934"/>
-        </w:numPr>
-        <w:pStyle w:val="ListParagraph"/>
-      </w:pPr>
-      <w:r>
-        <w:rPr>
-          <w:b/>
-        </w:rPr>
-        <w:t>The answer arrives.</w:t>
-      </w:r>
-      <w:r>
-        <w:t xml:space="preserve"> The phone speaks </w:t>
-      </w:r>
-      <w:r>
-        <w:rPr>
-          <w:i/>
-        </w:rPr>
-        <w:t>"Polo! Behind you, two steps, on the table,"</w:t>
-      </w:r>
-      <w:r>
-        <w:t xml:space="preserve"> spatialised at </w:t>
-      </w:r>
-      <w:r>
-        <w:rPr>
-          <w:rFonts w:ascii="Courier New" w:hAnsi="Courier New" w:eastAsia="Courier New" w:cs="Courier New"/>
-          <w:color w:val="374151"/>
-          <w:sz w:val="19"/>
-        </w:rPr>
-        <w:t>position</w:t>
-      </w:r>
-      <w:r>
-        <w:t>:</w:t>
-      </w:r>
-    </w:p>
-    <w:p>
-      <w:pPr>
-        <w:numPr>
-          <w:ilvl w:val="1"/>
-          <w:numId w:val="935"/>
-        </w:numPr>
-        <w:pStyle w:val="ListParagraph"/>
-      </w:pPr>
-      <w:r>
-        <w:t xml:space="preserve">the direction is relative to the </w:t>
-      </w:r>
-      <w:r>
-        <w:rPr>
-          <w:b/>
-        </w:rPr>
-        <w:t>body</w:t>
-      </w:r>
-      <w:r>
-        <w:t xml:space="preserve"> (chest heading), because "behind you" means behind your body;</w:t>
-      </w:r>
-    </w:p>
-    <w:p>
-      <w:pPr>
-        <w:numPr>
-          <w:ilvl w:val="1"/>
-          <w:numId w:val="935"/>
-        </w:numPr>
-        <w:pStyle w:val="ListParagraph"/>
-      </w:pPr>
-      <w:r>
-        <w:t>clock position = round(relative azimuth / 30°), where 12 o'clock means ahead; 12, 3, 6 and 9 are said as "straight ahead", "on your right", "behind you" and "on your left";</w:t>
-      </w:r>
-    </w:p>
-    <w:p>
-      <w:pPr>
-        <w:numPr>
-          <w:ilvl w:val="1"/>
-          <w:numId w:val="935"/>
-        </w:numPr>
-        <w:pStyle w:val="ListParagraph"/>
-      </w:pPr>
-      <w:r>
-        <w:t>steps = round(horizontal distance / 0.7 m), at least one;</w:t>
-      </w:r>
-    </w:p>
-    <w:p>
-      <w:pPr>
-        <w:numPr>
-          <w:ilvl w:val="1"/>
-          <w:numId w:val="935"/>
-        </w:numPr>
-        <w:pStyle w:val="ListParagraph"/>
-      </w:pPr>
-      <w:r>
-        <w:t xml:space="preserve">within 0.6 m it says </w:t>
-      </w:r>
-      <w:r>
-        <w:rPr>
-          <w:i/>
-        </w:rPr>
-        <w:t>"Polo! Within reach, …"</w:t>
-      </w:r>
-      <w:r>
-        <w:t xml:space="preserve"> instead.</w:t>
-      </w:r>
-    </w:p>
-    <w:p>
-      <w:pPr>
-        <w:numPr>
-          <w:ilvl w:val="0"/>
-          <w:numId w:val="934"/>
-        </w:numPr>
-        <w:pStyle w:val="ListParagraph"/>
-      </w:pPr>
-      <w:r>
-        <w:rPr>
-          <w:b/>
-        </w:rPr>
-        <w:t>Beacon:</w:t>
-      </w:r>
-      <w:r>
-        <w:t xml:space="preserve"> beeps from </w:t>
-      </w:r>
-      <w:r>
-        <w:rPr>
-          <w:rFonts w:ascii="Courier New" w:hAnsi="Courier New" w:eastAsia="Courier New" w:cs="Courier New"/>
-          <w:color w:val="374151"/>
-          <w:sz w:val="19"/>
-        </w:rPr>
-        <w:t>position</w:t>
-      </w:r>
-      <w:r>
-        <w:t xml:space="preserve">, rendered relative to the </w:t>
-      </w:r>
-      <w:r>
-        <w:rPr>
-          <w:b/>
-        </w:rPr>
-        <w:t>head</w:t>
-      </w:r>
-      <w:r>
-        <w:t xml:space="preserve"> (fused yaw). They're muffled and lower while the item is behind the head (|relative azimuth| more than 90°).</w:t>
-      </w:r>
-    </w:p>
-    <w:p>
-      <w:pPr>
-        <w:numPr>
-          <w:ilvl w:val="0"/>
-          <w:numId w:val="934"/>
-        </w:numPr>
-        <w:pStyle w:val="ListParagraph"/>
-      </w:pPr>
-      <w:r>
-        <w:rPr>
-          <w:b/>
-        </w:rPr>
-        <w:t>Facing</w:t>
-      </w:r>
-      <w:r>
-        <w:t xml:space="preserve"> (|relative azimuth| 12° or less): a double ding plus a haptic, once per lock. The lock releases past 20°.</w:t>
-      </w:r>
-    </w:p>
-    <w:p>
-      <w:pPr>
-        <w:numPr>
-          <w:ilvl w:val="0"/>
-          <w:numId w:val="934"/>
-        </w:numPr>
-        <w:pStyle w:val="ListParagraph"/>
-      </w:pPr>
-      <w:r>
-        <w:rPr>
-          <w:b/>
-        </w:rPr>
-        <w:t>Walking:</w:t>
-      </w:r>
-      <w:r>
-        <w:t xml:space="preserve"> the gap between beeps = clamp(0.15 + 0.35 × distance, 0.15, 1.0) s. </w:t>
-      </w:r>
-      <w:r>
-        <w:rPr>
-          <w:i/>
-        </w:rPr>
-        <w:t>"Within reach, on the {surface}"</w:t>
-      </w:r>
-      <w:r>
-        <w:t xml:space="preserve"> is said once at 0.6 m (POC 5).</w:t>
-      </w:r>
-    </w:p>
-    <w:p>
-      <w:pPr>
-        <w:numPr>
-          <w:ilvl w:val="0"/>
-          <w:numId w:val="934"/>
-        </w:numPr>
-        <w:pStyle w:val="ListParagraph"/>
-      </w:pPr>
-      <w:r>
-        <w:rPr>
-          <w:b/>
-        </w:rPr>
-        <w:t>Steady tone</w:t>
-      </w:r>
-      <w:r>
-        <w:t xml:space="preserve"> once </w:t>
-      </w:r>
-      <w:r>
-        <w:rPr>
-          <w:rFonts w:ascii="Courier New" w:hAnsi="Courier New" w:eastAsia="Courier New" w:cs="Courier New"/>
-          <w:color w:val="374151"/>
-          <w:sz w:val="19"/>
-        </w:rPr>
-        <w:t>hand_proximity.distance_m</w:t>
-      </w:r>
-      <w:r>
-        <w:t xml:space="preserve"> is 0.30 or less. It releases above 0.40, or when proximity is older than 0.5 s.</w:t>
-      </w:r>
-    </w:p>
-    <w:p>
-      <w:pPr>
-        <w:numPr>
-          <w:ilvl w:val="0"/>
-          <w:numId w:val="934"/>
-        </w:numPr>
-        <w:pStyle w:val="ListParagraph"/>
-      </w:pPr>
-      <w:r>
-        <w:rPr>
-          <w:b/>
-        </w:rPr>
-        <w:t>On `touch` for that item:</w:t>
-      </w:r>
-      <w:r>
-        <w:t xml:space="preserve"> silence, then the item's label (audio, or its text) or </w:t>
-      </w:r>
-      <w:r>
-        <w:rPr>
-          <w:i/>
-        </w:rPr>
-        <w:t>"Got it."</w:t>
-      </w:r>
-    </w:p>
-    <w:p>
-      <w:r>
-        <w:t xml:space="preserve">If an </w:t>
-      </w:r>
-      <w:r>
-        <w:rPr>
-          <w:rFonts w:ascii="Courier New" w:hAnsi="Courier New" w:eastAsia="Courier New" w:cs="Courier New"/>
-          <w:color w:val="374151"/>
-          <w:sz w:val="19"/>
-        </w:rPr>
-        <w:t>event moved</w:t>
-      </w:r>
-      <w:r>
-        <w:t xml:space="preserve"> (or </w:t>
-      </w:r>
-      <w:r>
-        <w:rPr>
-          <w:rFonts w:ascii="Courier New" w:hAnsi="Courier New" w:eastAsia="Courier New" w:cs="Courier New"/>
-          <w:color w:val="374151"/>
-          <w:sz w:val="19"/>
-        </w:rPr>
-        <w:t>put_down</w:t>
-      </w:r>
-      <w:r>
-        <w:t xml:space="preserve">) arrives for the target, retarget to its new </w:t>
-      </w:r>
-      <w:r>
-        <w:rPr>
-          <w:rFonts w:ascii="Courier New" w:hAnsi="Courier New" w:eastAsia="Courier New" w:cs="Courier New"/>
-          <w:color w:val="374151"/>
-          <w:sz w:val="19"/>
-        </w:rPr>
-        <w:t>position</w:t>
-      </w:r>
-      <w:r>
-        <w:t>.</w:t>
-      </w:r>
-    </w:p>
-    <w:p>
-      <w:pPr>
-        <w:pStyle w:val="Heading1"/>
-      </w:pPr>
-      <w:r>
-        <w:t>8. What each person needs from the others</w:t>
-      </w:r>
-    </w:p>
-    <w:p>
-      <w:r>
-        <w:rPr>
-          <w:b/>
-        </w:rPr>
-        <w:t>Vedant needs from Utkarsh:</w:t>
-      </w:r>
-    </w:p>
-    <w:p>
-      <w:pPr>
-        <w:numPr>
-          <w:ilvl w:val="0"/>
-          <w:numId w:val="936"/>
-        </w:numPr>
-        <w:pStyle w:val="ListParagraph"/>
-      </w:pPr>
-      <w:r>
-        <w:t>The frame upload (§3.1).</w:t>
-      </w:r>
-    </w:p>
-    <w:p>
-      <w:pPr>
-        <w:numPr>
-          <w:ilvl w:val="0"/>
-          <w:numId w:val="936"/>
-        </w:numPr>
-        <w:pStyle w:val="ListParagraph"/>
-      </w:pPr>
-      <w:r>
-        <w:t>The pose stream and the hand stream (§3.2).</w:t>
-      </w:r>
-    </w:p>
-    <w:p>
-      <w:pPr>
-        <w:numPr>
-          <w:ilvl w:val="0"/>
-          <w:numId w:val="936"/>
-        </w:numPr>
-        <w:pStyle w:val="ListParagraph"/>
-      </w:pPr>
-      <w:r>
-        <w:t xml:space="preserve">The </w:t>
-      </w:r>
-      <w:r>
-        <w:rPr>
-          <w:rFonts w:ascii="Courier New" w:hAnsi="Courier New" w:eastAsia="Courier New" w:cs="Courier New"/>
-          <w:color w:val="374151"/>
-          <w:sz w:val="19"/>
-        </w:rPr>
-        <w:t>map</w:t>
-      </w:r>
-      <w:r>
-        <w:t xml:space="preserve"> messages (§3.4).</w:t>
-      </w:r>
-    </w:p>
-    <w:p>
-      <w:pPr>
-        <w:numPr>
-          <w:ilvl w:val="0"/>
-          <w:numId w:val="936"/>
-        </w:numPr>
-        <w:pStyle w:val="ListParagraph"/>
-      </w:pPr>
-      <w:r>
-        <w:t>A 5-minute recorded session saved to disk in exactly these formats (frames, poses, hands), so Vedant can build against real data before the app is finished.</w:t>
-      </w:r>
-    </w:p>
-    <w:p>
-      <w:pPr>
-        <w:numPr>
-          <w:ilvl w:val="1"/>
-          <w:numId w:val="937"/>
-        </w:numPr>
-        <w:pStyle w:val="ListParagraph"/>
-      </w:pPr>
-      <w:r>
-        <w:t xml:space="preserve">The server records every session it receives under </w:t>
-      </w:r>
-      <w:r>
-        <w:rPr>
-          <w:rFonts w:ascii="Courier New" w:hAnsi="Courier New" w:eastAsia="Courier New" w:cs="Courier New"/>
-          <w:color w:val="374151"/>
-          <w:sz w:val="19"/>
-        </w:rPr>
-        <w:t>server/data/sessions/&lt;session_id&gt;/</w:t>
-      </w:r>
-      <w:r>
-        <w:t>. Running the app against the server is enough.</w:t>
-      </w:r>
-    </w:p>
-    <w:p>
-      <w:pPr>
-        <w:numPr>
-          <w:ilvl w:val="1"/>
-          <w:numId w:val="937"/>
-        </w:numPr>
-        <w:pStyle w:val="ListParagraph"/>
-      </w:pPr>
-      <w:r>
-        <w:t xml:space="preserve">Until then, a Stray Scanner recording converts with </w:t>
-      </w:r>
-      <w:r>
-        <w:rPr>
-          <w:rFonts w:ascii="Courier New" w:hAnsi="Courier New" w:eastAsia="Courier New" w:cs="Courier New"/>
-          <w:color w:val="374151"/>
-          <w:sz w:val="19"/>
-        </w:rPr>
-        <w:t>server/tools/stray_session.py</w:t>
-      </w:r>
-      <w:r>
-        <w:t>.</w:t>
-      </w:r>
-    </w:p>
-    <w:p>
-      <w:r>
-        <w:rPr>
-          <w:b/>
-        </w:rPr>
-        <w:t>Utkarsh needs from Vedant:</w:t>
-      </w:r>
-    </w:p>
-    <w:p>
-      <w:pPr>
-        <w:numPr>
-          <w:ilvl w:val="0"/>
-          <w:numId w:val="938"/>
-        </w:numPr>
-        <w:pStyle w:val="ListParagraph"/>
-      </w:pPr>
-      <w:r>
-        <w:t xml:space="preserve">A stub server that accepts everything above and returns fake </w:t>
-      </w:r>
-      <w:r>
-        <w:rPr>
-          <w:rFonts w:ascii="Courier New" w:hAnsi="Courier New" w:eastAsia="Courier New" w:cs="Courier New"/>
-          <w:color w:val="374151"/>
-          <w:sz w:val="19"/>
-        </w:rPr>
-        <w:t>answer</w:t>
-      </w:r>
-      <w:r>
-        <w:t xml:space="preserve"> / </w:t>
-      </w:r>
-      <w:r>
-        <w:rPr>
-          <w:rFonts w:ascii="Courier New" w:hAnsi="Courier New" w:eastAsia="Courier New" w:cs="Courier New"/>
-          <w:color w:val="374151"/>
-          <w:sz w:val="19"/>
-        </w:rPr>
-        <w:t>touch</w:t>
-      </w:r>
-      <w:r>
-        <w:t xml:space="preserve"> / </w:t>
-      </w:r>
-      <w:r>
-        <w:rPr>
-          <w:rFonts w:ascii="Courier New" w:hAnsi="Courier New" w:eastAsia="Courier New" w:cs="Courier New"/>
-          <w:color w:val="374151"/>
-          <w:sz w:val="19"/>
-        </w:rPr>
-        <w:t>event</w:t>
-      </w:r>
-      <w:r>
-        <w:t xml:space="preserve"> messages (</w:t>
-      </w:r>
-      <w:r>
-        <w:rPr>
-          <w:rFonts w:ascii="Courier New" w:hAnsi="Courier New" w:eastAsia="Courier New" w:cs="Courier New"/>
-          <w:color w:val="374151"/>
-          <w:sz w:val="19"/>
-        </w:rPr>
-        <w:t>MARCO_MODE=stub</w:t>
-      </w:r>
-      <w:r>
-        <w:t>, the default).</w:t>
-      </w:r>
-    </w:p>
-    <w:p>
-      <w:pPr>
-        <w:numPr>
-          <w:ilvl w:val="0"/>
-          <w:numId w:val="938"/>
-        </w:numPr>
-        <w:pStyle w:val="ListParagraph"/>
-      </w:pPr>
-      <w:r>
-        <w:t>Then the real ones (</w:t>
-      </w:r>
-      <w:r>
-        <w:rPr>
-          <w:rFonts w:ascii="Courier New" w:hAnsi="Courier New" w:eastAsia="Courier New" w:cs="Courier New"/>
-          <w:color w:val="374151"/>
-          <w:sz w:val="19"/>
-        </w:rPr>
-        <w:t>MARCO_MODE=real</w:t>
-      </w:r>
-      <w:r>
-        <w:t>).</w:t>
-      </w:r>
-    </w:p>
-    <w:p>
-      <w:pPr>
-        <w:numPr>
-          <w:ilvl w:val="0"/>
-          <w:numId w:val="938"/>
-        </w:numPr>
-        <w:pStyle w:val="ListParagraph"/>
-      </w:pPr>
-      <w:r>
-        <w:t>Label audio URLs.</w:t>
-      </w:r>
-    </w:p>
-    <w:p>
-      <w:pPr>
-        <w:numPr>
-          <w:ilvl w:val="0"/>
-          <w:numId w:val="938"/>
-        </w:numPr>
-        <w:pStyle w:val="ListParagraph"/>
-      </w:pPr>
-      <w:r>
-        <w:rPr>
-          <w:rFonts w:ascii="Courier New" w:hAnsi="Courier New" w:eastAsia="Courier New" w:cs="Courier New"/>
-          <w:color w:val="374151"/>
-          <w:sz w:val="19"/>
-        </w:rPr>
-        <w:t>label_request</w:t>
-      </w:r>
-      <w:r>
-        <w:t xml:space="preserve"> events for Photon.</w:t>
-      </w:r>
-    </w:p>
-    <w:p>
-      <w:r>
-        <w:rPr>
-          <w:b/>
-        </w:rPr>
-        <w:t>The dashboard needs from Vedant:</w:t>
       </w:r>
     </w:p>
     <w:p>
@@ -6120,7 +5905,22 @@
         <w:pStyle w:val="ListParagraph"/>
       </w:pPr>
       <w:r>
-        <w:t xml:space="preserve">the </w:t>
+        <w:rPr>
+          <w:b/>
+        </w:rPr>
+        <w:t>The answer arrives.</w:t>
+      </w:r>
+      <w:r>
+        <w:t xml:space="preserve"> The phone speaks </w:t>
+      </w:r>
+      <w:r>
+        <w:rPr>
+          <w:i/>
+        </w:rPr>
+        <w:t>"Polo! Behind you, two steps, on the table,"</w:t>
+      </w:r>
+      <w:r>
+        <w:t xml:space="preserve"> spatialised at </w:t>
       </w:r>
       <w:r>
         <w:rPr>
@@ -6128,10 +5928,94 @@
           <w:color w:val="374151"/>
           <w:sz w:val="19"/>
         </w:rPr>
-        <w:t>/v1/dashboard</w:t>
-      </w:r>
-      <w:r>
-        <w:t xml:space="preserve"> feed with recorded or fake data first (</w:t>
+        <w:t>position</w:t>
+      </w:r>
+      <w:r>
+        <w:t>:</w:t>
+      </w:r>
+    </w:p>
+    <w:p>
+      <w:pPr>
+        <w:numPr>
+          <w:ilvl w:val="1"/>
+          <w:numId w:val="940"/>
+        </w:numPr>
+        <w:pStyle w:val="ListParagraph"/>
+      </w:pPr>
+      <w:r>
+        <w:t xml:space="preserve">the direction is relative to the </w:t>
+      </w:r>
+      <w:r>
+        <w:rPr>
+          <w:b/>
+        </w:rPr>
+        <w:t>body</w:t>
+      </w:r>
+      <w:r>
+        <w:t xml:space="preserve"> (chest heading), because "behind you" means behind your body;</w:t>
+      </w:r>
+    </w:p>
+    <w:p>
+      <w:pPr>
+        <w:numPr>
+          <w:ilvl w:val="1"/>
+          <w:numId w:val="940"/>
+        </w:numPr>
+        <w:pStyle w:val="ListParagraph"/>
+      </w:pPr>
+      <w:r>
+        <w:t>clock position = round(relative azimuth / 30°), where 12 o'clock means ahead; 12, 3, 6 and 9 are said as "straight ahead", "on your right", "behind you" and "on your left";</w:t>
+      </w:r>
+    </w:p>
+    <w:p>
+      <w:pPr>
+        <w:numPr>
+          <w:ilvl w:val="1"/>
+          <w:numId w:val="940"/>
+        </w:numPr>
+        <w:pStyle w:val="ListParagraph"/>
+      </w:pPr>
+      <w:r>
+        <w:t>steps = round(horizontal distance / 0.7 m), at least one;</w:t>
+      </w:r>
+    </w:p>
+    <w:p>
+      <w:pPr>
+        <w:numPr>
+          <w:ilvl w:val="1"/>
+          <w:numId w:val="940"/>
+        </w:numPr>
+        <w:pStyle w:val="ListParagraph"/>
+      </w:pPr>
+      <w:r>
+        <w:t xml:space="preserve">within 0.6 m it says </w:t>
+      </w:r>
+      <w:r>
+        <w:rPr>
+          <w:i/>
+        </w:rPr>
+        <w:t>"Polo! Within reach, …"</w:t>
+      </w:r>
+      <w:r>
+        <w:t xml:space="preserve"> instead.</w:t>
+      </w:r>
+    </w:p>
+    <w:p>
+      <w:pPr>
+        <w:numPr>
+          <w:ilvl w:val="0"/>
+          <w:numId w:val="939"/>
+        </w:numPr>
+        <w:pStyle w:val="ListParagraph"/>
+      </w:pPr>
+      <w:r>
+        <w:rPr>
+          <w:b/>
+        </w:rPr>
+        <w:t>Beacon:</w:t>
+      </w:r>
+      <w:r>
+        <w:t xml:space="preserve"> beeps from </w:t>
       </w:r>
       <w:r>
         <w:rPr>
@@ -6139,33 +6023,82 @@
           <w:color w:val="374151"/>
           <w:sz w:val="19"/>
         </w:rPr>
-        <w:t>server/tools/replay.py</w:t>
-      </w:r>
-      <w:r>
-        <w:t>), then live.</w:t>
+        <w:t>position</w:t>
+      </w:r>
+      <w:r>
+        <w:t xml:space="preserve">, rendered relative to the </w:t>
+      </w:r>
+      <w:r>
+        <w:rPr>
+          <w:b/>
+        </w:rPr>
+        <w:t>head</w:t>
+      </w:r>
+      <w:r>
+        <w:t xml:space="preserve"> (fused yaw). They're muffled and lower while the item is behind the head (|relative azimuth| more than 90°).</w:t>
       </w:r>
     </w:p>
     <w:p>
+      <w:pPr>
+        <w:numPr>
+          <w:ilvl w:val="0"/>
+          <w:numId w:val="939"/>
+        </w:numPr>
+        <w:pStyle w:val="ListParagraph"/>
+      </w:pPr>
       <w:r>
         <w:rPr>
           <w:b/>
         </w:rPr>
-        <w:t>Everyone:</w:t>
-      </w:r>
-      <w:r>
-        <w:t xml:space="preserve"> the server is private:</w:t>
+        <w:t>Facing</w:t>
+      </w:r>
+      <w:r>
+        <w:t xml:space="preserve"> (|relative azimuth| 12° or less): a double ding plus a haptic, once per lock. The lock releases past 20°.</w:t>
       </w:r>
     </w:p>
     <w:p>
       <w:pPr>
         <w:numPr>
           <w:ilvl w:val="0"/>
-          <w:numId w:val="940"/>
+          <w:numId w:val="939"/>
         </w:numPr>
         <w:pStyle w:val="ListParagraph"/>
       </w:pPr>
       <w:r>
-        <w:t xml:space="preserve">it binds 127.0.0.1 only and is reached through </w:t>
+        <w:rPr>
+          <w:b/>
+        </w:rPr>
+        <w:t>Walking:</w:t>
+      </w:r>
+      <w:r>
+        <w:t xml:space="preserve"> the gap between beeps = clamp(0.15 + 0.35 × distance, 0.15, 1.0) s. </w:t>
+      </w:r>
+      <w:r>
+        <w:rPr>
+          <w:i/>
+        </w:rPr>
+        <w:t>"Within reach, on the {surface}"</w:t>
+      </w:r>
+      <w:r>
+        <w:t xml:space="preserve"> is said once at 0.6 m (POC 5).</w:t>
+      </w:r>
+    </w:p>
+    <w:p>
+      <w:pPr>
+        <w:numPr>
+          <w:ilvl w:val="0"/>
+          <w:numId w:val="939"/>
+        </w:numPr>
+        <w:pStyle w:val="ListParagraph"/>
+      </w:pPr>
+      <w:r>
+        <w:rPr>
+          <w:b/>
+        </w:rPr>
+        <w:t>Steady tone</w:t>
+      </w:r>
+      <w:r>
+        <w:t xml:space="preserve"> once </w:t>
       </w:r>
       <w:r>
         <w:rPr>
@@ -6173,22 +6106,42 @@
           <w:color w:val="374151"/>
           <w:sz w:val="19"/>
         </w:rPr>
-        <w:t>tailscale serve</w:t>
-      </w:r>
-      <w:r>
-        <w:t>;</w:t>
+        <w:t>hand_proximity.distance_m</w:t>
+      </w:r>
+      <w:r>
+        <w:t xml:space="preserve"> is 0.30 or less. It releases above 0.40, or when proximity is older than 0.5 s.</w:t>
       </w:r>
     </w:p>
     <w:p>
       <w:pPr>
         <w:numPr>
           <w:ilvl w:val="0"/>
-          <w:numId w:val="940"/>
+          <w:numId w:val="939"/>
         </w:numPr>
         <w:pStyle w:val="ListParagraph"/>
       </w:pPr>
       <w:r>
-        <w:t>every route goes through the fail-closed auth gate (</w:t>
+        <w:rPr>
+          <w:b/>
+        </w:rPr>
+        <w:t>On `touch` for that item:</w:t>
+      </w:r>
+      <w:r>
+        <w:t xml:space="preserve"> silence, then the item's typed label or </w:t>
+      </w:r>
+      <w:r>
+        <w:rPr>
+          <w:i/>
+        </w:rPr>
+        <w:t>"Got it."</w:t>
+      </w:r>
+      <w:r>
+        <w:t xml:space="preserve"> through §3.5. The phone's guidance sequence does not wait for cloud speech.</w:t>
+      </w:r>
+    </w:p>
+    <w:p>
+      <w:r>
+        <w:t xml:space="preserve">If an </w:t>
       </w:r>
       <w:r>
         <w:rPr>
@@ -6196,10 +6149,10 @@
           <w:color w:val="374151"/>
           <w:sz w:val="19"/>
         </w:rPr>
-        <w:t>server/marco/auth.py</w:t>
-      </w:r>
-      <w:r>
-        <w:t xml:space="preserve">), which admits only </w:t>
+        <w:t>event moved</w:t>
+      </w:r>
+      <w:r>
+        <w:t xml:space="preserve"> (or </w:t>
       </w:r>
       <w:r>
         <w:rPr>
@@ -6207,7 +6160,18 @@
           <w:color w:val="374151"/>
           <w:sz w:val="19"/>
         </w:rPr>
-        <w:t>TAILSCALE_ALLOWED_LOGINS</w:t>
+        <w:t>put_down</w:t>
+      </w:r>
+      <w:r>
+        <w:t xml:space="preserve">) arrives for the target, retarget to its new </w:t>
+      </w:r>
+      <w:r>
+        <w:rPr>
+          <w:rFonts w:ascii="Courier New" w:hAnsi="Courier New" w:eastAsia="Courier New" w:cs="Courier New"/>
+          <w:color w:val="374151"/>
+          <w:sz w:val="19"/>
+        </w:rPr>
+        <w:t>position</w:t>
       </w:r>
       <w:r>
         <w:t>.</w:t>
@@ -6218,7 +6182,15 @@
         <w:pStyle w:val="Heading1"/>
       </w:pPr>
       <w:r>
-        <w:t>9. Integration order</w:t>
+        <w:t>8. What each person needs from the others</w:t>
+      </w:r>
+    </w:p>
+    <w:p>
+      <w:r>
+        <w:rPr>
+          <w:b/>
+        </w:rPr>
+        <w:t>Vedant needs from Utkarsh:</w:t>
       </w:r>
     </w:p>
     <w:p>
@@ -6230,13 +6202,7 @@
         <w:pStyle w:val="ListParagraph"/>
       </w:pPr>
       <w:r>
-        <w:rPr>
-          <w:b/>
-        </w:rPr>
-        <w:t>Hour 0–2:</w:t>
-      </w:r>
-      <w:r>
-        <w:t xml:space="preserve"> agree this file. Vedant ships the stub server; Utkarsh gets the ARKit session and frame upload working; the dashboard renders fake feeds.</w:t>
+        <w:t>The frame upload (§3.1).</w:t>
       </w:r>
     </w:p>
     <w:p>
@@ -6248,13 +6214,7 @@
         <w:pStyle w:val="ListParagraph"/>
       </w:pPr>
       <w:r>
-        <w:rPr>
-          <w:b/>
-        </w:rPr>
-        <w:t>Then:</w:t>
-      </w:r>
-      <w:r>
-        <w:t xml:space="preserve"> the recorded 5-minute session from the vest. Vedant runs the real pipeline on it offline; the dashboard replays it.</w:t>
+        <w:t>The pose stream and the hand stream (§3.2).</w:t>
       </w:r>
     </w:p>
     <w:p>
@@ -6266,13 +6226,18 @@
         <w:pStyle w:val="ListParagraph"/>
       </w:pPr>
       <w:r>
-        <w:rPr>
-          <w:b/>
-        </w:rPr>
-        <w:t>First live path:</w:t>
-      </w:r>
-      <w:r>
-        <w:t xml:space="preserve"> register keys, put them down, ask "where are my keys?", and follow the sound to them, end to end.</w:t>
+        <w:t xml:space="preserve">The </w:t>
+      </w:r>
+      <w:r>
+        <w:rPr>
+          <w:rFonts w:ascii="Courier New" w:hAnsi="Courier New" w:eastAsia="Courier New" w:cs="Courier New"/>
+          <w:color w:val="374151"/>
+          <w:sz w:val="19"/>
+        </w:rPr>
+        <w:t>map</w:t>
+      </w:r>
+      <w:r>
+        <w:t xml:space="preserve"> messages (§3.4).</w:t>
       </w:r>
     </w:p>
     <w:p>
@@ -6284,10 +6249,7 @@
         <w:pStyle w:val="ListParagraph"/>
       </w:pPr>
       <w:r>
-        <w:rPr>
-          <w:b/>
-        </w:rPr>
-        <w:t>Then:</w:t>
+        <w:t>A 5-minute recorded session saved to disk in exactly these formats (frames, poses, hands), so Vedant can build against real data before the app is finished.</w:t>
       </w:r>
     </w:p>
     <w:p>
@@ -6299,7 +6261,18 @@
         <w:pStyle w:val="ListParagraph"/>
       </w:pPr>
       <w:r>
-        <w:t>touch and "what is this?" with Photon labeling;</w:t>
+        <w:t xml:space="preserve">The server records every session it receives under </w:t>
+      </w:r>
+      <w:r>
+        <w:rPr>
+          <w:rFonts w:ascii="Courier New" w:hAnsi="Courier New" w:eastAsia="Courier New" w:cs="Courier New"/>
+          <w:color w:val="374151"/>
+          <w:sz w:val="19"/>
+        </w:rPr>
+        <w:t>server/data/sessions/&lt;session_id&gt;/</w:t>
+      </w:r>
+      <w:r>
+        <w:t>. Running the app against the server is enough.</w:t>
       </w:r>
     </w:p>
     <w:p>
@@ -6311,27 +6284,26 @@
         <w:pStyle w:val="ListParagraph"/>
       </w:pPr>
       <w:r>
-        <w:t>moved and left-behind events;</w:t>
+        <w:t xml:space="preserve">Until then, a Stray Scanner recording converts with </w:t>
+      </w:r>
+      <w:r>
+        <w:rPr>
+          <w:rFonts w:ascii="Courier New" w:hAnsi="Courier New" w:eastAsia="Courier New" w:cs="Courier New"/>
+          <w:color w:val="374151"/>
+          <w:sz w:val="19"/>
+        </w:rPr>
+        <w:t>server/tools/stray_session.py</w:t>
+      </w:r>
+      <w:r>
+        <w:t>.</w:t>
       </w:r>
     </w:p>
     <w:p>
-      <w:pPr>
-        <w:numPr>
-          <w:ilvl w:val="1"/>
-          <w:numId w:val="942"/>
-        </w:numPr>
-        <w:pStyle w:val="ListParagraph"/>
-      </w:pPr>
-      <w:r>
-        <w:t>relaunch persistence.</w:t>
-      </w:r>
-    </w:p>
-    <w:p>
-      <w:pPr>
-        <w:pStyle w:val="Heading1"/>
-      </w:pPr>
-      <w:r>
-        <w:t>10. Open questions (decide together)</w:t>
+      <w:r>
+        <w:rPr>
+          <w:b/>
+        </w:rPr>
+        <w:t>Utkarsh needs from Vedant:</w:t>
       </w:r>
     </w:p>
     <w:p>
@@ -6343,13 +6315,7 @@
         <w:pStyle w:val="ListParagraph"/>
       </w:pPr>
       <w:r>
-        <w:rPr>
-          <w:b/>
-        </w:rPr>
-        <w:t>Vision orientation:</w:t>
-      </w:r>
-      <w:r>
-        <w:t xml:space="preserve"> </w:t>
+        <w:t xml:space="preserve">A stub server that accepts everything above and returns fake </w:t>
       </w:r>
       <w:r>
         <w:rPr>
@@ -6357,10 +6323,10 @@
           <w:color w:val="374151"/>
           <w:sz w:val="19"/>
         </w:rPr>
-        <w:t>.up</w:t>
-      </w:r>
-      <w:r>
-        <w:t xml:space="preserve"> versus </w:t>
+        <w:t>answer</w:t>
+      </w:r>
+      <w:r>
+        <w:t xml:space="preserve"> / </w:t>
       </w:r>
       <w:r>
         <w:rPr>
@@ -6368,10 +6334,32 @@
           <w:color w:val="374151"/>
           <w:sz w:val="19"/>
         </w:rPr>
-        <w:t>.right</w:t>
-      </w:r>
-      <w:r>
-        <w:t xml:space="preserve"> for the hand pose. Test in hour one.</w:t>
+        <w:t>touch</w:t>
+      </w:r>
+      <w:r>
+        <w:t xml:space="preserve"> / </w:t>
+      </w:r>
+      <w:r>
+        <w:rPr>
+          <w:rFonts w:ascii="Courier New" w:hAnsi="Courier New" w:eastAsia="Courier New" w:cs="Courier New"/>
+          <w:color w:val="374151"/>
+          <w:sz w:val="19"/>
+        </w:rPr>
+        <w:t>event</w:t>
+      </w:r>
+      <w:r>
+        <w:t xml:space="preserve"> messages (</w:t>
+      </w:r>
+      <w:r>
+        <w:rPr>
+          <w:rFonts w:ascii="Courier New" w:hAnsi="Courier New" w:eastAsia="Courier New" w:cs="Courier New"/>
+          <w:color w:val="374151"/>
+          <w:sz w:val="19"/>
+        </w:rPr>
+        <w:t>MARCO_MODE=stub</w:t>
+      </w:r>
+      <w:r>
+        <w:t>, the default).</w:t>
       </w:r>
     </w:p>
     <w:p>
@@ -6383,13 +6371,7 @@
         <w:pStyle w:val="ListParagraph"/>
       </w:pPr>
       <w:r>
-        <w:rPr>
-          <w:b/>
-        </w:rPr>
-        <w:t>Where the server runs: decided (2026-10-17).</w:t>
-      </w:r>
-      <w:r>
-        <w:t xml:space="preserve"> The Vultr GPU box (</w:t>
+        <w:t>Then the real ones (</w:t>
       </w:r>
       <w:r>
         <w:rPr>
@@ -6397,21 +6379,10 @@
           <w:color w:val="374151"/>
           <w:sz w:val="19"/>
         </w:rPr>
-        <w:t>deploy/vultr/</w:t>
-      </w:r>
-      <w:r>
-        <w:t xml:space="preserve">, </w:t>
-      </w:r>
-      <w:r>
-        <w:rPr>
-          <w:rFonts w:ascii="Courier New" w:hAnsi="Courier New" w:eastAsia="Courier New" w:cs="Courier New"/>
-          <w:color w:val="374151"/>
-          <w:sz w:val="19"/>
-        </w:rPr>
-        <w:t>marco-gpu</w:t>
-      </w:r>
-      <w:r>
-        <w:t>) is the primary server; a laptop at the venue is the fallback. Nothing in this contract changes: clients only change the base URL.</w:t>
+        <w:t>MARCO_MODE=real</w:t>
+      </w:r>
+      <w:r>
+        <w:t>).</w:t>
       </w:r>
     </w:p>
     <w:p>
@@ -6423,13 +6394,7 @@
         <w:pStyle w:val="ListParagraph"/>
       </w:pPr>
       <w:r>
-        <w:rPr>
-          <w:b/>
-        </w:rPr>
-        <w:t>Who names places</w:t>
-      </w:r>
-      <w:r>
-        <w:t xml:space="preserve"> ("entry table"): the server names them by height, or the user names them during setup.</w:t>
+        <w:t>Typed labels and the speech route (§3.5). Legacy label audio URLs remain optional compatibility fields.</w:t>
       </w:r>
     </w:p>
     <w:p>
@@ -6442,23 +6407,34 @@
       </w:pPr>
       <w:r>
         <w:rPr>
-          <w:b/>
-        </w:rPr>
-        <w:t>Photon and dashboard routes.</w:t>
-      </w:r>
-      <w:r>
-        <w:t xml:space="preserve"> </w:t>
-      </w:r>
-      <w:r>
-        <w:rPr>
           <w:rFonts w:ascii="Courier New" w:hAnsi="Courier New" w:eastAsia="Courier New" w:cs="Courier New"/>
           <w:color w:val="374151"/>
           <w:sz w:val="19"/>
         </w:rPr>
-        <w:t>photon/</w:t>
-      </w:r>
-      <w:r>
-        <w:t xml:space="preserve"> and </w:t>
+        <w:t>label_request</w:t>
+      </w:r>
+      <w:r>
+        <w:t xml:space="preserve"> events for Photon.</w:t>
+      </w:r>
+    </w:p>
+    <w:p>
+      <w:r>
+        <w:rPr>
+          <w:b/>
+        </w:rPr>
+        <w:t>The dashboard needs from Vedant:</w:t>
+      </w:r>
+    </w:p>
+    <w:p>
+      <w:pPr>
+        <w:numPr>
+          <w:ilvl w:val="0"/>
+          <w:numId w:val="944"/>
+        </w:numPr>
+        <w:pStyle w:val="ListParagraph"/>
+      </w:pPr>
+      <w:r>
+        <w:t xml:space="preserve">the </w:t>
       </w:r>
       <w:r>
         <w:rPr>
@@ -6466,28 +6442,10 @@
           <w:color w:val="374151"/>
           <w:sz w:val="19"/>
         </w:rPr>
-        <w:t>frontend/</w:t>
-      </w:r>
-      <w:r>
-        <w:t xml:space="preserve"> were built against the earlier requirements and POC 26 paths. Status of each:</w:t>
-      </w:r>
-    </w:p>
-    <w:p>
-      <w:pPr>
-        <w:numPr>
-          <w:ilvl w:val="1"/>
-          <w:numId w:val="944"/>
-        </w:numPr>
-        <w:pStyle w:val="ListParagraph"/>
-      </w:pPr>
-      <w:r>
-        <w:rPr>
-          <w:b/>
-        </w:rPr>
-        <w:t>Photon: decided (2026-10-17).</w:t>
-      </w:r>
-      <w:r>
-        <w:t xml:space="preserve"> </w:t>
+        <w:t>/v1/dashboard</w:t>
+      </w:r>
+      <w:r>
+        <w:t xml:space="preserve"> feed with recorded or fake data first (</w:t>
       </w:r>
       <w:r>
         <w:rPr>
@@ -6495,124 +6453,21 @@
           <w:color w:val="374151"/>
           <w:sz w:val="19"/>
         </w:rPr>
-        <w:t>photon/</w:t>
-      </w:r>
-      <w:r>
-        <w:t xml:space="preserve"> adopted §5 as written, on Photon 2.0, with no format changes. The phone never talks to </w:t>
-      </w:r>
-      <w:r>
-        <w:rPr>
-          <w:rFonts w:ascii="Courier New" w:hAnsi="Courier New" w:eastAsia="Courier New" w:cs="Courier New"/>
-          <w:color w:val="374151"/>
-          <w:sz w:val="19"/>
-        </w:rPr>
-        <w:t>photon/</w:t>
-      </w:r>
-      <w:r>
-        <w:t xml:space="preserve">. Two optional additions are proposed in </w:t>
-      </w:r>
-      <w:r>
-        <w:rPr>
-          <w:rFonts w:ascii="Courier New" w:hAnsi="Courier New" w:eastAsia="Courier New" w:cs="Courier New"/>
-          <w:color w:val="374151"/>
-          <w:sz w:val="19"/>
-        </w:rPr>
-        <w:t>STATUS.md</w:t>
-      </w:r>
-      <w:r>
-        <w:t xml:space="preserve"> (</w:t>
-      </w:r>
-      <w:r>
-        <w:rPr>
-          <w:rFonts w:ascii="Courier New" w:hAnsi="Courier New" w:eastAsia="Courier New" w:cs="Courier New"/>
-          <w:color w:val="374151"/>
-          <w:sz w:val="19"/>
-        </w:rPr>
-        <w:t>label_request_seen</w:t>
-      </w:r>
-      <w:r>
-        <w:t xml:space="preserve">, </w:t>
-      </w:r>
-      <w:r>
-        <w:rPr>
-          <w:rFonts w:ascii="Courier New" w:hAnsi="Courier New" w:eastAsia="Courier New" w:cs="Courier New"/>
-          <w:color w:val="374151"/>
-          <w:sz w:val="19"/>
-        </w:rPr>
-        <w:t>label_unknown</w:t>
-      </w:r>
-      <w:r>
-        <w:t>); they are not part of this contract.</w:t>
+        <w:t>server/tools/replay.py</w:t>
+      </w:r>
+      <w:r>
+        <w:t>), then live.</w:t>
       </w:r>
     </w:p>
     <w:p>
-      <w:pPr>
-        <w:numPr>
-          <w:ilvl w:val="1"/>
-          <w:numId w:val="944"/>
-        </w:numPr>
-        <w:pStyle w:val="ListParagraph"/>
-      </w:pPr>
       <w:r>
         <w:rPr>
           <w:b/>
         </w:rPr>
-        <w:t>Dashboard: decided (2026-10-18).</w:t>
-      </w:r>
-      <w:r>
-        <w:t xml:space="preserve"> The server serves </w:t>
-      </w:r>
-      <w:r>
-        <w:rPr>
-          <w:rFonts w:ascii="Courier New" w:hAnsi="Courier New" w:eastAsia="Courier New" w:cs="Courier New"/>
-          <w:color w:val="374151"/>
-          <w:sz w:val="19"/>
-        </w:rPr>
-        <w:t>frontend/</w:t>
-      </w:r>
-      <w:r>
-        <w:t xml:space="preserve">'s own contract (§6, </w:t>
-      </w:r>
-      <w:r>
-        <w:rPr>
-          <w:rFonts w:ascii="Courier New" w:hAnsi="Courier New" w:eastAsia="Courier New" w:cs="Courier New"/>
-          <w:color w:val="374151"/>
-          <w:sz w:val="19"/>
-        </w:rPr>
-        <w:t>marco/dashboard.py</w:t>
-      </w:r>
-      <w:r>
-        <w:t xml:space="preserve">). The phone gained </w:t>
-      </w:r>
-      <w:r>
-        <w:rPr>
-          <w:rFonts w:ascii="Courier New" w:hAnsi="Courier New" w:eastAsia="Courier New" w:cs="Courier New"/>
-          <w:color w:val="374151"/>
-          <w:sz w:val="19"/>
-        </w:rPr>
-        <w:t>command</w:t>
-      </w:r>
-      <w:r>
-        <w:t xml:space="preserve"> and </w:t>
-      </w:r>
-      <w:r>
-        <w:rPr>
-          <w:rFonts w:ascii="Courier New" w:hAnsi="Courier New" w:eastAsia="Courier New" w:cs="Courier New"/>
-          <w:color w:val="374151"/>
-          <w:sz w:val="19"/>
-        </w:rPr>
-        <w:t>command_ack</w:t>
-      </w:r>
-      <w:r>
-        <w:t xml:space="preserve"> for Find and Stop.</w:t>
-      </w:r>
-    </w:p>
-    <w:p>
-      <w:pPr>
-        <w:pStyle w:val="Heading1"/>
-      </w:pPr>
-      <w:r>
-        <w:t>11. Changes since v0.1</w:t>
+        <w:t>Everyone:</w:t>
+      </w:r>
+      <w:r>
+        <w:t xml:space="preserve"> the server is private:</w:t>
       </w:r>
     </w:p>
     <w:p>
@@ -6624,13 +6479,7 @@
         <w:pStyle w:val="ListParagraph"/>
       </w:pPr>
       <w:r>
-        <w:rPr>
-          <w:b/>
-        </w:rPr>
-        <w:t>Compression:</w:t>
-      </w:r>
-      <w:r>
-        <w:t xml:space="preserve"> DEFLATE, where raw DEFLATE (Apple's </w:t>
+        <w:t xml:space="preserve">it binds 127.0.0.1 only and is reached through </w:t>
       </w:r>
       <w:r>
         <w:rPr>
@@ -6638,10 +6487,10 @@
           <w:color w:val="374151"/>
           <w:sz w:val="19"/>
         </w:rPr>
-        <w:t>.zlib</w:t>
-      </w:r>
-      <w:r>
-        <w:t>) and zlib are both accepted.</w:t>
+        <w:t>tailscale serve</w:t>
+      </w:r>
+      <w:r>
+        <w:t>;</w:t>
       </w:r>
     </w:p>
     <w:p>
@@ -6653,31 +6502,7 @@
         <w:pStyle w:val="ListParagraph"/>
       </w:pPr>
       <w:r>
-        <w:rPr>
-          <w:b/>
-        </w:rPr>
-        <w:t>`session_id`</w:t>
-      </w:r>
-      <w:r>
-        <w:t xml:space="preserve"> is on every phone message (hand, guidance, query and map too).</w:t>
-      </w:r>
-    </w:p>
-    <w:p>
-      <w:pPr>
-        <w:numPr>
-          <w:ilvl w:val="0"/>
-          <w:numId w:val="945"/>
-        </w:numPr>
-        <w:pStyle w:val="ListParagraph"/>
-      </w:pPr>
-      <w:r>
-        <w:rPr>
-          <w:b/>
-        </w:rPr>
-        <w:t>Hand message:</w:t>
-      </w:r>
-      <w:r>
-        <w:t xml:space="preserve"> gains </w:t>
+        <w:t>every route goes through the fail-closed auth gate (</w:t>
       </w:r>
       <w:r>
         <w:rPr>
@@ -6685,28 +6510,10 @@
           <w:color w:val="374151"/>
           <w:sz w:val="19"/>
         </w:rPr>
-        <w:t>map_id</w:t>
-      </w:r>
-      <w:r>
-        <w:t>. The server uses the latest frame's intrinsics, and the joint names are spelled out.</w:t>
-      </w:r>
-    </w:p>
-    <w:p>
-      <w:pPr>
-        <w:numPr>
-          <w:ilvl w:val="0"/>
-          <w:numId w:val="945"/>
-        </w:numPr>
-        <w:pStyle w:val="ListParagraph"/>
-      </w:pPr>
-      <w:r>
-        <w:rPr>
-          <w:b/>
-        </w:rPr>
-        <w:t>New query</w:t>
-      </w:r>
-      <w:r>
-        <w:t xml:space="preserve"> </w:t>
+        <w:t>server/marco/auth.py</w:t>
+      </w:r>
+      <w:r>
+        <w:t xml:space="preserve">), which admits only </w:t>
       </w:r>
       <w:r>
         <w:rPr>
@@ -6714,45 +6521,160 @@
           <w:color w:val="374151"/>
           <w:sz w:val="19"/>
         </w:rPr>
-        <w:t>set_place door</w:t>
-      </w:r>
-      <w:r>
-        <w:t>, with its answer.</w:t>
+        <w:t>TAILSCALE_ALLOWED_LOGINS</w:t>
+      </w:r>
+      <w:r>
+        <w:t>.</w:t>
       </w:r>
     </w:p>
     <w:p>
       <w:pPr>
+        <w:pStyle w:val="Heading1"/>
+      </w:pPr>
+      <w:r>
+        <w:t>9. Integration order</w:t>
+      </w:r>
+    </w:p>
+    <w:p>
+      <w:pPr>
         <w:numPr>
           <w:ilvl w:val="0"/>
-          <w:numId w:val="945"/>
-        </w:numPr>
-        <w:pStyle w:val="ListParagraph"/>
-      </w:pPr>
-      <w:r>
-        <w:rPr>
-          <w:b/>
-        </w:rPr>
-        <w:t>Find answers:</w:t>
-      </w:r>
-    </w:p>
-    <w:p>
-      <w:pPr>
-        <w:numPr>
-          <w:ilvl w:val="1"/>
           <w:numId w:val="946"/>
         </w:numPr>
         <w:pStyle w:val="ListParagraph"/>
       </w:pPr>
       <w:r>
         <w:rPr>
+          <w:b/>
+        </w:rPr>
+        <w:t>Hour 0–2:</w:t>
+      </w:r>
+      <w:r>
+        <w:t xml:space="preserve"> agree this file. Vedant ships the stub server; Utkarsh gets the ARKit session and frame upload working; the dashboard renders fake feeds.</w:t>
+      </w:r>
+    </w:p>
+    <w:p>
+      <w:pPr>
+        <w:numPr>
+          <w:ilvl w:val="0"/>
+          <w:numId w:val="946"/>
+        </w:numPr>
+        <w:pStyle w:val="ListParagraph"/>
+      </w:pPr>
+      <w:r>
+        <w:rPr>
+          <w:b/>
+        </w:rPr>
+        <w:t>Then:</w:t>
+      </w:r>
+      <w:r>
+        <w:t xml:space="preserve"> the recorded 5-minute session from the vest. Vedant runs the real pipeline on it offline; the dashboard replays it.</w:t>
+      </w:r>
+    </w:p>
+    <w:p>
+      <w:pPr>
+        <w:numPr>
+          <w:ilvl w:val="0"/>
+          <w:numId w:val="946"/>
+        </w:numPr>
+        <w:pStyle w:val="ListParagraph"/>
+      </w:pPr>
+      <w:r>
+        <w:rPr>
+          <w:b/>
+        </w:rPr>
+        <w:t>First live path:</w:t>
+      </w:r>
+      <w:r>
+        <w:t xml:space="preserve"> register keys, put them down, ask "where are my keys?", and follow the sound to them, end to end.</w:t>
+      </w:r>
+    </w:p>
+    <w:p>
+      <w:pPr>
+        <w:numPr>
+          <w:ilvl w:val="0"/>
+          <w:numId w:val="946"/>
+        </w:numPr>
+        <w:pStyle w:val="ListParagraph"/>
+      </w:pPr>
+      <w:r>
+        <w:rPr>
+          <w:b/>
+        </w:rPr>
+        <w:t>Then:</w:t>
+      </w:r>
+    </w:p>
+    <w:p>
+      <w:pPr>
+        <w:numPr>
+          <w:ilvl w:val="1"/>
+          <w:numId w:val="947"/>
+        </w:numPr>
+        <w:pStyle w:val="ListParagraph"/>
+      </w:pPr>
+      <w:r>
+        <w:t>touch and "what is this?" with Photon labeling;</w:t>
+      </w:r>
+    </w:p>
+    <w:p>
+      <w:pPr>
+        <w:numPr>
+          <w:ilvl w:val="1"/>
+          <w:numId w:val="947"/>
+        </w:numPr>
+        <w:pStyle w:val="ListParagraph"/>
+      </w:pPr>
+      <w:r>
+        <w:t>moved and left-behind events;</w:t>
+      </w:r>
+    </w:p>
+    <w:p>
+      <w:pPr>
+        <w:numPr>
+          <w:ilvl w:val="1"/>
+          <w:numId w:val="947"/>
+        </w:numPr>
+        <w:pStyle w:val="ListParagraph"/>
+      </w:pPr>
+      <w:r>
+        <w:t>relaunch persistence.</w:t>
+      </w:r>
+    </w:p>
+    <w:p>
+      <w:pPr>
+        <w:pStyle w:val="Heading1"/>
+      </w:pPr>
+      <w:r>
+        <w:t>10. Open questions (decide together)</w:t>
+      </w:r>
+    </w:p>
+    <w:p>
+      <w:pPr>
+        <w:numPr>
+          <w:ilvl w:val="0"/>
+          <w:numId w:val="948"/>
+        </w:numPr>
+        <w:pStyle w:val="ListParagraph"/>
+      </w:pPr>
+      <w:r>
+        <w:rPr>
+          <w:b/>
+        </w:rPr>
+        <w:t>Vision orientation:</w:t>
+      </w:r>
+      <w:r>
+        <w:t xml:space="preserve"> </w:t>
+      </w:r>
+      <w:r>
+        <w:rPr>
           <w:rFonts w:ascii="Courier New" w:hAnsi="Courier New" w:eastAsia="Courier New" w:cs="Courier New"/>
           <w:color w:val="374151"/>
           <w:sz w:val="19"/>
         </w:rPr>
-        <w:t>reason</w:t>
-      </w:r>
-      <w:r>
-        <w:t xml:space="preserve"> adds </w:t>
+        <w:t>.up</w:t>
+      </w:r>
+      <w:r>
+        <w:t xml:space="preserve"> versus </w:t>
       </w:r>
       <w:r>
         <w:rPr>
@@ -6760,30 +6682,39 @@
           <w:color w:val="374151"/>
           <w:sz w:val="19"/>
         </w:rPr>
-        <w:t>not_registered</w:t>
-      </w:r>
-      <w:r>
-        <w:t>;</w:t>
+        <w:t>.right</w:t>
+      </w:r>
+      <w:r>
+        <w:t xml:space="preserve"> for the hand pose. Test in hour one.</w:t>
       </w:r>
     </w:p>
     <w:p>
       <w:pPr>
         <w:numPr>
-          <w:ilvl w:val="1"/>
-          <w:numId w:val="946"/>
+          <w:ilvl w:val="0"/>
+          <w:numId w:val="948"/>
         </w:numPr>
         <w:pStyle w:val="ListParagraph"/>
       </w:pPr>
+      <w:r>
+        <w:rPr>
+          <w:b/>
+        </w:rPr>
+        <w:t>Where the server runs: decided (2026-10-17).</w:t>
+      </w:r>
+      <w:r>
+        <w:t xml:space="preserve"> The Vultr GPU box (</w:t>
+      </w:r>
       <w:r>
         <w:rPr>
           <w:rFonts w:ascii="Courier New" w:hAnsi="Courier New" w:eastAsia="Courier New" w:cs="Courier New"/>
           <w:color w:val="374151"/>
           <w:sz w:val="19"/>
         </w:rPr>
-        <w:t>not_where_last_seen</w:t>
-      </w:r>
-      <w:r>
-        <w:t xml:space="preserve"> carries </w:t>
+        <w:t>deploy/vultr/</w:t>
+      </w:r>
+      <w:r>
+        <w:t xml:space="preserve">, </w:t>
       </w:r>
       <w:r>
         <w:rPr>
@@ -6791,10 +6722,46 @@
           <w:color w:val="374151"/>
           <w:sz w:val="19"/>
         </w:rPr>
-        <w:t>last_position</w:t>
-      </w:r>
-      <w:r>
-        <w:t xml:space="preserve"> and </w:t>
+        <w:t>marco-gpu</w:t>
+      </w:r>
+      <w:r>
+        <w:t>) is the primary server; a laptop at the venue is the fallback. Nothing in this contract changes: clients only change the base URL.</w:t>
+      </w:r>
+    </w:p>
+    <w:p>
+      <w:pPr>
+        <w:numPr>
+          <w:ilvl w:val="0"/>
+          <w:numId w:val="948"/>
+        </w:numPr>
+        <w:pStyle w:val="ListParagraph"/>
+      </w:pPr>
+      <w:r>
+        <w:rPr>
+          <w:b/>
+        </w:rPr>
+        <w:t>Who names places</w:t>
+      </w:r>
+      <w:r>
+        <w:t xml:space="preserve"> ("entry table"): the server names them by height, or the user names them during setup.</w:t>
+      </w:r>
+    </w:p>
+    <w:p>
+      <w:pPr>
+        <w:numPr>
+          <w:ilvl w:val="0"/>
+          <w:numId w:val="948"/>
+        </w:numPr>
+        <w:pStyle w:val="ListParagraph"/>
+      </w:pPr>
+      <w:r>
+        <w:rPr>
+          <w:b/>
+        </w:rPr>
+        <w:t>Photon and dashboard routes.</w:t>
+      </w:r>
+      <w:r>
+        <w:t xml:space="preserve"> </w:t>
       </w:r>
       <w:r>
         <w:rPr>
@@ -6802,22 +6769,10 @@
           <w:color w:val="374151"/>
           <w:sz w:val="19"/>
         </w:rPr>
-        <w:t>surface</w:t>
-      </w:r>
-      <w:r>
-        <w:t>;</w:t>
-      </w:r>
-    </w:p>
-    <w:p>
-      <w:pPr>
-        <w:numPr>
-          <w:ilvl w:val="1"/>
-          <w:numId w:val="946"/>
-        </w:numPr>
-        <w:pStyle w:val="ListParagraph"/>
-      </w:pPr>
-      <w:r>
-        <w:t xml:space="preserve">found answers carry </w:t>
+        <w:t>photon/</w:t>
+      </w:r>
+      <w:r>
+        <w:t xml:space="preserve"> and </w:t>
       </w:r>
       <w:r>
         <w:rPr>
@@ -6825,17 +6780,17 @@
           <w:color w:val="374151"/>
           <w:sz w:val="19"/>
         </w:rPr>
-        <w:t>state</w:t>
-      </w:r>
-      <w:r>
-        <w:t>.</w:t>
+        <w:t>frontend/</w:t>
+      </w:r>
+      <w:r>
+        <w:t xml:space="preserve"> were built against the earlier requirements and POC 26 paths. Status of each:</w:t>
       </w:r>
     </w:p>
     <w:p>
       <w:pPr>
         <w:numPr>
-          <w:ilvl w:val="0"/>
-          <w:numId w:val="945"/>
+          <w:ilvl w:val="1"/>
+          <w:numId w:val="949"/>
         </w:numPr>
         <w:pStyle w:val="ListParagraph"/>
       </w:pPr>
@@ -6843,10 +6798,10 @@
         <w:rPr>
           <w:b/>
         </w:rPr>
-        <w:t>Event kinds:</w:t>
-      </w:r>
-      <w:r>
-        <w:t xml:space="preserve"> added </w:t>
+        <w:t>Photon: decided (2026-10-17).</w:t>
+      </w:r>
+      <w:r>
+        <w:t xml:space="preserve"> </w:t>
       </w:r>
       <w:r>
         <w:rPr>
@@ -6854,10 +6809,10 @@
           <w:color w:val="374151"/>
           <w:sz w:val="19"/>
         </w:rPr>
-        <w:t>seen</w:t>
-      </w:r>
-      <w:r>
-        <w:t xml:space="preserve">, </w:t>
+        <w:t>photon/</w:t>
+      </w:r>
+      <w:r>
+        <w:t xml:space="preserve"> adopted §5 as written, on Photon 2.0, with no format changes. The phone never talks to </w:t>
       </w:r>
       <w:r>
         <w:rPr>
@@ -6865,10 +6820,10 @@
           <w:color w:val="374151"/>
           <w:sz w:val="19"/>
         </w:rPr>
-        <w:t>missing</w:t>
-      </w:r>
-      <w:r>
-        <w:t xml:space="preserve"> and </w:t>
+        <w:t>photon/</w:t>
+      </w:r>
+      <w:r>
+        <w:t xml:space="preserve">. Two optional additions are proposed in </w:t>
       </w:r>
       <w:r>
         <w:rPr>
@@ -6876,28 +6831,10 @@
           <w:color w:val="374151"/>
           <w:sz w:val="19"/>
         </w:rPr>
-        <w:t>label_added</w:t>
-      </w:r>
-      <w:r>
-        <w:t>.</w:t>
-      </w:r>
-    </w:p>
-    <w:p>
-      <w:pPr>
-        <w:numPr>
-          <w:ilvl w:val="0"/>
-          <w:numId w:val="945"/>
-        </w:numPr>
-        <w:pStyle w:val="ListParagraph"/>
-      </w:pPr>
-      <w:r>
-        <w:rPr>
-          <w:b/>
-        </w:rPr>
-        <w:t>`POST /v1/labels`:</w:t>
-      </w:r>
-      <w:r>
-        <w:t xml:space="preserve"> takes </w:t>
+        <w:t>STATUS.md</w:t>
+      </w:r>
+      <w:r>
+        <w:t xml:space="preserve"> (</w:t>
       </w:r>
       <w:r>
         <w:rPr>
@@ -6905,10 +6842,10 @@
           <w:color w:val="374151"/>
           <w:sz w:val="19"/>
         </w:rPr>
-        <w:t>text</w:t>
-      </w:r>
-      <w:r>
-        <w:t xml:space="preserve">, and </w:t>
+        <w:t>label_request_seen</w:t>
+      </w:r>
+      <w:r>
+        <w:t xml:space="preserve">, </w:t>
       </w:r>
       <w:r>
         <w:rPr>
@@ -6916,10 +6853,28 @@
           <w:color w:val="374151"/>
           <w:sz w:val="19"/>
         </w:rPr>
-        <w:t>item_id</w:t>
-      </w:r>
-      <w:r>
-        <w:t xml:space="preserve"> for a follow-up voice note; it returns </w:t>
+        <w:t>label_unknown</w:t>
+      </w:r>
+      <w:r>
+        <w:t>); they are not part of this contract.</w:t>
+      </w:r>
+    </w:p>
+    <w:p>
+      <w:pPr>
+        <w:numPr>
+          <w:ilvl w:val="1"/>
+          <w:numId w:val="949"/>
+        </w:numPr>
+        <w:pStyle w:val="ListParagraph"/>
+      </w:pPr>
+      <w:r>
+        <w:rPr>
+          <w:b/>
+        </w:rPr>
+        <w:t>Dashboard: decided (2026-10-18).</w:t>
+      </w:r>
+      <w:r>
+        <w:t xml:space="preserve"> The server serves </w:t>
       </w:r>
       <w:r>
         <w:rPr>
@@ -6927,90 +6882,10 @@
           <w:color w:val="374151"/>
           <w:sz w:val="19"/>
         </w:rPr>
-        <w:t>item_id</w:t>
-      </w:r>
-      <w:r>
-        <w:t>.</w:t>
-      </w:r>
-    </w:p>
-    <w:p>
-      <w:pPr>
-        <w:numPr>
-          <w:ilvl w:val="0"/>
-          <w:numId w:val="945"/>
-        </w:numPr>
-        <w:pStyle w:val="ListParagraph"/>
-      </w:pPr>
-      <w:r>
-        <w:rPr>
-          <w:b/>
-        </w:rPr>
-        <w:t>`GET /v1/items` fields</w:t>
-      </w:r>
-      <w:r>
-        <w:t xml:space="preserve"> are listed.</w:t>
-      </w:r>
-    </w:p>
-    <w:p>
-      <w:pPr>
-        <w:numPr>
-          <w:ilvl w:val="0"/>
-          <w:numId w:val="945"/>
-        </w:numPr>
-        <w:pStyle w:val="ListParagraph"/>
-      </w:pPr>
-      <w:r>
-        <w:rPr>
-          <w:b/>
-        </w:rPr>
-        <w:t>§7:</w:t>
-      </w:r>
-      <w:r>
-        <w:t xml:space="preserve"> directions are relative to the body and sound to the head; there is a "within reach" line, the facing lock releases past 20°, and the steady tone releases above 40 cm.</w:t>
-      </w:r>
-    </w:p>
-    <w:p>
-      <w:pPr>
-        <w:numPr>
-          <w:ilvl w:val="0"/>
-          <w:numId w:val="945"/>
-        </w:numPr>
-        <w:pStyle w:val="ListParagraph"/>
-      </w:pPr>
-      <w:r>
-        <w:rPr>
-          <w:b/>
-        </w:rPr>
-        <w:t>"Getting my bearings."</w:t>
-      </w:r>
-      <w:r>
-        <w:t xml:space="preserve"> replaces "Marco is getting its bearings."</w:t>
-      </w:r>
-    </w:p>
-    <w:p>
-      <w:pPr>
-        <w:pStyle w:val="Heading1"/>
-      </w:pPr>
-      <w:r>
-        <w:t>12. Changes since v0.2</w:t>
-      </w:r>
-    </w:p>
-    <w:p>
-      <w:pPr>
-        <w:numPr>
-          <w:ilvl w:val="0"/>
-          <w:numId w:val="947"/>
-        </w:numPr>
-        <w:pStyle w:val="ListParagraph"/>
-      </w:pPr>
-      <w:r>
-        <w:rPr>
-          <w:b/>
-        </w:rPr>
-        <w:t>Registrations and labels persist</w:t>
-      </w:r>
-      <w:r>
-        <w:t xml:space="preserve"> across server restarts (§3.3), under </w:t>
+        <w:t>frontend/</w:t>
+      </w:r>
+      <w:r>
+        <w:t xml:space="preserve">'s own contract (§6, </w:t>
       </w:r>
       <w:r>
         <w:rPr>
@@ -7018,37 +6893,10 @@
           <w:color w:val="374151"/>
           <w:sz w:val="19"/>
         </w:rPr>
-        <w:t>MARCO_DATA/registry/</w:t>
-      </w:r>
-      <w:r>
-        <w:t>.</w:t>
-      </w:r>
-    </w:p>
-    <w:p>
-      <w:pPr>
-        <w:numPr>
-          <w:ilvl w:val="0"/>
-          <w:numId w:val="947"/>
-        </w:numPr>
-        <w:pStyle w:val="ListParagraph"/>
-      </w:pPr>
-      <w:r>
-        <w:rPr>
-          <w:b/>
-        </w:rPr>
-        <w:t>`source`:</w:t>
-      </w:r>
-    </w:p>
-    <w:p>
-      <w:pPr>
-        <w:numPr>
-          <w:ilvl w:val="1"/>
-          <w:numId w:val="948"/>
-        </w:numPr>
-        <w:pStyle w:val="ListParagraph"/>
-      </w:pPr>
-      <w:r>
-        <w:t xml:space="preserve">optional on </w:t>
+        <w:t>marco/dashboard.py</w:t>
+      </w:r>
+      <w:r>
+        <w:t xml:space="preserve">). The phone gained </w:t>
       </w:r>
       <w:r>
         <w:rPr>
@@ -7056,10 +6904,10 @@
           <w:color w:val="374151"/>
           <w:sz w:val="19"/>
         </w:rPr>
-        <w:t>POST /v1/items</w:t>
-      </w:r>
-      <w:r>
-        <w:t xml:space="preserve"> (default </w:t>
+        <w:t>command</w:t>
+      </w:r>
+      <w:r>
+        <w:t xml:space="preserve"> and </w:t>
       </w:r>
       <w:r>
         <w:rPr>
@@ -7067,10 +6915,36 @@
           <w:color w:val="374151"/>
           <w:sz w:val="19"/>
         </w:rPr>
-        <w:t>app</w:t>
-      </w:r>
-      <w:r>
-        <w:t xml:space="preserve">) and </w:t>
+        <w:t>command_ack</w:t>
+      </w:r>
+      <w:r>
+        <w:t xml:space="preserve"> for Find and Stop.</w:t>
+      </w:r>
+    </w:p>
+    <w:p>
+      <w:pPr>
+        <w:pStyle w:val="Heading1"/>
+      </w:pPr>
+      <w:r>
+        <w:t>11. Changes since v0.1</w:t>
+      </w:r>
+    </w:p>
+    <w:p>
+      <w:pPr>
+        <w:numPr>
+          <w:ilvl w:val="0"/>
+          <w:numId w:val="950"/>
+        </w:numPr>
+        <w:pStyle w:val="ListParagraph"/>
+      </w:pPr>
+      <w:r>
+        <w:rPr>
+          <w:b/>
+        </w:rPr>
+        <w:t>Compression:</w:t>
+      </w:r>
+      <w:r>
+        <w:t xml:space="preserve"> DEFLATE, where raw DEFLATE (Apple's </w:t>
       </w:r>
       <w:r>
         <w:rPr>
@@ -7078,10 +6952,46 @@
           <w:color w:val="374151"/>
           <w:sz w:val="19"/>
         </w:rPr>
-        <w:t>POST /v1/labels</w:t>
-      </w:r>
-      <w:r>
-        <w:t xml:space="preserve"> (default </w:t>
+        <w:t>.zlib</w:t>
+      </w:r>
+      <w:r>
+        <w:t>) and zlib are both accepted.</w:t>
+      </w:r>
+    </w:p>
+    <w:p>
+      <w:pPr>
+        <w:numPr>
+          <w:ilvl w:val="0"/>
+          <w:numId w:val="950"/>
+        </w:numPr>
+        <w:pStyle w:val="ListParagraph"/>
+      </w:pPr>
+      <w:r>
+        <w:rPr>
+          <w:b/>
+        </w:rPr>
+        <w:t>`session_id`</w:t>
+      </w:r>
+      <w:r>
+        <w:t xml:space="preserve"> is on every phone message (hand, guidance, query and map too).</w:t>
+      </w:r>
+    </w:p>
+    <w:p>
+      <w:pPr>
+        <w:numPr>
+          <w:ilvl w:val="0"/>
+          <w:numId w:val="950"/>
+        </w:numPr>
+        <w:pStyle w:val="ListParagraph"/>
+      </w:pPr>
+      <w:r>
+        <w:rPr>
+          <w:b/>
+        </w:rPr>
+        <w:t>Hand message:</w:t>
+      </w:r>
+      <w:r>
+        <w:t xml:space="preserve"> gains </w:t>
       </w:r>
       <w:r>
         <w:rPr>
@@ -7089,22 +6999,28 @@
           <w:color w:val="374151"/>
           <w:sz w:val="19"/>
         </w:rPr>
-        <w:t>photon</w:t>
-      </w:r>
-      <w:r>
-        <w:t>);</w:t>
+        <w:t>map_id</w:t>
+      </w:r>
+      <w:r>
+        <w:t>. The server uses the latest frame's intrinsics, and the joint names are spelled out.</w:t>
       </w:r>
     </w:p>
     <w:p>
       <w:pPr>
         <w:numPr>
-          <w:ilvl w:val="1"/>
-          <w:numId w:val="948"/>
+          <w:ilvl w:val="0"/>
+          <w:numId w:val="950"/>
         </w:numPr>
         <w:pStyle w:val="ListParagraph"/>
       </w:pPr>
       <w:r>
-        <w:t xml:space="preserve">listed in </w:t>
+        <w:rPr>
+          <w:b/>
+        </w:rPr>
+        <w:t>New query</w:t>
+      </w:r>
+      <w:r>
+        <w:t xml:space="preserve"> </w:t>
       </w:r>
       <w:r>
         <w:rPr>
@@ -7112,17 +7028,17 @@
           <w:color w:val="374151"/>
           <w:sz w:val="19"/>
         </w:rPr>
-        <w:t>GET /v1/items</w:t>
-      </w:r>
-      <w:r>
-        <w:t>.</w:t>
+        <w:t>set_place door</w:t>
+      </w:r>
+      <w:r>
+        <w:t>, with its answer.</w:t>
       </w:r>
     </w:p>
     <w:p>
       <w:pPr>
         <w:numPr>
           <w:ilvl w:val="0"/>
-          <w:numId w:val="947"/>
+          <w:numId w:val="950"/>
         </w:numPr>
         <w:pStyle w:val="ListParagraph"/>
       </w:pPr>
@@ -7130,21 +7046,27 @@
         <w:rPr>
           <w:b/>
         </w:rPr>
-        <w:t>New route</w:t>
-      </w:r>
-      <w:r>
-        <w:t xml:space="preserve"> </w:t>
-      </w:r>
+        <w:t>Find answers:</w:t>
+      </w:r>
+    </w:p>
+    <w:p>
+      <w:pPr>
+        <w:numPr>
+          <w:ilvl w:val="1"/>
+          <w:numId w:val="951"/>
+        </w:numPr>
+        <w:pStyle w:val="ListParagraph"/>
+      </w:pPr>
       <w:r>
         <w:rPr>
           <w:rFonts w:ascii="Courier New" w:hAnsi="Courier New" w:eastAsia="Courier New" w:cs="Courier New"/>
           <w:color w:val="374151"/>
           <w:sz w:val="19"/>
         </w:rPr>
-        <w:t>DELETE /v1/items?source=…</w:t>
-      </w:r>
-      <w:r>
-        <w:t xml:space="preserve">, which forgets one source's items. Photon's </w:t>
+        <w:t>reason</w:t>
+      </w:r>
+      <w:r>
+        <w:t xml:space="preserve"> adds </w:t>
       </w:r>
       <w:r>
         <w:rPr>
@@ -7152,39 +7074,30 @@
           <w:color w:val="374151"/>
           <w:sz w:val="19"/>
         </w:rPr>
-        <w:t>/restart</w:t>
-      </w:r>
-      <w:r>
-        <w:t xml:space="preserve"> command uses it (§5).</w:t>
+        <w:t>not_registered</w:t>
+      </w:r>
+      <w:r>
+        <w:t>;</w:t>
       </w:r>
     </w:p>
     <w:p>
       <w:pPr>
         <w:numPr>
-          <w:ilvl w:val="0"/>
-          <w:numId w:val="947"/>
+          <w:ilvl w:val="1"/>
+          <w:numId w:val="951"/>
         </w:numPr>
         <w:pStyle w:val="ListParagraph"/>
       </w:pPr>
-      <w:r>
-        <w:rPr>
-          <w:b/>
-        </w:rPr>
-        <w:t>Dashboard API</w:t>
-      </w:r>
-      <w:r>
-        <w:t xml:space="preserve"> (§6): </w:t>
-      </w:r>
       <w:r>
         <w:rPr>
           <w:rFonts w:ascii="Courier New" w:hAnsi="Courier New" w:eastAsia="Courier New" w:cs="Courier New"/>
           <w:color w:val="374151"/>
           <w:sz w:val="19"/>
         </w:rPr>
-        <w:t>GET /dashboard/snapshot</w:t>
-      </w:r>
-      <w:r>
-        <w:t xml:space="preserve">, </w:t>
+        <w:t>not_where_last_seen</w:t>
+      </w:r>
+      <w:r>
+        <w:t xml:space="preserve"> carries </w:t>
       </w:r>
       <w:r>
         <w:rPr>
@@ -7192,10 +7105,10 @@
           <w:color w:val="374151"/>
           <w:sz w:val="19"/>
         </w:rPr>
-        <w:t>WS /events</w:t>
-      </w:r>
-      <w:r>
-        <w:t xml:space="preserve">, </w:t>
+        <w:t>last_position</w:t>
+      </w:r>
+      <w:r>
+        <w:t xml:space="preserve"> and </w:t>
       </w:r>
       <w:r>
         <w:rPr>
@@ -7203,10 +7116,22 @@
           <w:color w:val="374151"/>
           <w:sz w:val="19"/>
         </w:rPr>
-        <w:t>POST /dashboard/commands</w:t>
-      </w:r>
-      <w:r>
-        <w:t xml:space="preserve">, </w:t>
+        <w:t>surface</w:t>
+      </w:r>
+      <w:r>
+        <w:t>;</w:t>
+      </w:r>
+    </w:p>
+    <w:p>
+      <w:pPr>
+        <w:numPr>
+          <w:ilvl w:val="1"/>
+          <w:numId w:val="951"/>
+        </w:numPr>
+        <w:pStyle w:val="ListParagraph"/>
+      </w:pPr>
+      <w:r>
+        <w:t xml:space="preserve">found answers carry </w:t>
       </w:r>
       <w:r>
         <w:rPr>
@@ -7214,10 +7139,28 @@
           <w:color w:val="374151"/>
           <w:sz w:val="19"/>
         </w:rPr>
-        <w:t>GET /media/…</w:t>
-      </w:r>
-      <w:r>
-        <w:t xml:space="preserve"> and </w:t>
+        <w:t>state</w:t>
+      </w:r>
+      <w:r>
+        <w:t>.</w:t>
+      </w:r>
+    </w:p>
+    <w:p>
+      <w:pPr>
+        <w:numPr>
+          <w:ilvl w:val="0"/>
+          <w:numId w:val="950"/>
+        </w:numPr>
+        <w:pStyle w:val="ListParagraph"/>
+      </w:pPr>
+      <w:r>
+        <w:rPr>
+          <w:b/>
+        </w:rPr>
+        <w:t>Event kinds:</w:t>
+      </w:r>
+      <w:r>
+        <w:t xml:space="preserve"> added </w:t>
       </w:r>
       <w:r>
         <w:rPr>
@@ -7225,10 +7168,10 @@
           <w:color w:val="374151"/>
           <w:sz w:val="19"/>
         </w:rPr>
-        <w:t>/app/…</w:t>
-      </w:r>
-      <w:r>
-        <w:t xml:space="preserve">, each also under </w:t>
+        <w:t>seen</w:t>
+      </w:r>
+      <w:r>
+        <w:t xml:space="preserve">, </w:t>
       </w:r>
       <w:r>
         <w:rPr>
@@ -7236,28 +7179,10 @@
           <w:color w:val="374151"/>
           <w:sz w:val="19"/>
         </w:rPr>
-        <w:t>/api/…</w:t>
-      </w:r>
-      <w:r>
-        <w:t>, all behind the auth gate.</w:t>
-      </w:r>
-    </w:p>
-    <w:p>
-      <w:pPr>
-        <w:numPr>
-          <w:ilvl w:val="0"/>
-          <w:numId w:val="947"/>
-        </w:numPr>
-        <w:pStyle w:val="ListParagraph"/>
-      </w:pPr>
-      <w:r>
-        <w:rPr>
-          <w:b/>
-        </w:rPr>
-        <w:t>New phone messages for dashboard Find and Stop:</w:t>
-      </w:r>
-      <w:r>
-        <w:t xml:space="preserve"> </w:t>
+        <w:t>missing</w:t>
+      </w:r>
+      <w:r>
+        <w:t xml:space="preserve"> and </w:t>
       </w:r>
       <w:r>
         <w:rPr>
@@ -7265,10 +7190,28 @@
           <w:color w:val="374151"/>
           <w:sz w:val="19"/>
         </w:rPr>
-        <w:t>command</w:t>
-      </w:r>
-      <w:r>
-        <w:t xml:space="preserve"> (server to phone, §4) and </w:t>
+        <w:t>label_added</w:t>
+      </w:r>
+      <w:r>
+        <w:t>.</w:t>
+      </w:r>
+    </w:p>
+    <w:p>
+      <w:pPr>
+        <w:numPr>
+          <w:ilvl w:val="0"/>
+          <w:numId w:val="950"/>
+        </w:numPr>
+        <w:pStyle w:val="ListParagraph"/>
+      </w:pPr>
+      <w:r>
+        <w:rPr>
+          <w:b/>
+        </w:rPr>
+        <w:t>`POST /v1/labels`:</w:t>
+      </w:r>
+      <w:r>
+        <w:t xml:space="preserve"> takes </w:t>
       </w:r>
       <w:r>
         <w:rPr>
@@ -7276,10 +7219,436 @@
           <w:color w:val="374151"/>
           <w:sz w:val="19"/>
         </w:rPr>
+        <w:t>text</w:t>
+      </w:r>
+      <w:r>
+        <w:t xml:space="preserve">, and </w:t>
+      </w:r>
+      <w:r>
+        <w:rPr>
+          <w:rFonts w:ascii="Courier New" w:hAnsi="Courier New" w:eastAsia="Courier New" w:cs="Courier New"/>
+          <w:color w:val="374151"/>
+          <w:sz w:val="19"/>
+        </w:rPr>
+        <w:t>item_id</w:t>
+      </w:r>
+      <w:r>
+        <w:t xml:space="preserve"> for a follow-up voice note; it returns </w:t>
+      </w:r>
+      <w:r>
+        <w:rPr>
+          <w:rFonts w:ascii="Courier New" w:hAnsi="Courier New" w:eastAsia="Courier New" w:cs="Courier New"/>
+          <w:color w:val="374151"/>
+          <w:sz w:val="19"/>
+        </w:rPr>
+        <w:t>item_id</w:t>
+      </w:r>
+      <w:r>
+        <w:t>.</w:t>
+      </w:r>
+    </w:p>
+    <w:p>
+      <w:pPr>
+        <w:numPr>
+          <w:ilvl w:val="0"/>
+          <w:numId w:val="950"/>
+        </w:numPr>
+        <w:pStyle w:val="ListParagraph"/>
+      </w:pPr>
+      <w:r>
+        <w:rPr>
+          <w:b/>
+        </w:rPr>
+        <w:t>`GET /v1/items` fields</w:t>
+      </w:r>
+      <w:r>
+        <w:t xml:space="preserve"> are listed.</w:t>
+      </w:r>
+    </w:p>
+    <w:p>
+      <w:pPr>
+        <w:numPr>
+          <w:ilvl w:val="0"/>
+          <w:numId w:val="950"/>
+        </w:numPr>
+        <w:pStyle w:val="ListParagraph"/>
+      </w:pPr>
+      <w:r>
+        <w:rPr>
+          <w:b/>
+        </w:rPr>
+        <w:t>§7:</w:t>
+      </w:r>
+      <w:r>
+        <w:t xml:space="preserve"> directions are relative to the body and sound to the head; there is a "within reach" line, the facing lock releases past 20°, and the steady tone releases above 40 cm.</w:t>
+      </w:r>
+    </w:p>
+    <w:p>
+      <w:pPr>
+        <w:numPr>
+          <w:ilvl w:val="0"/>
+          <w:numId w:val="950"/>
+        </w:numPr>
+        <w:pStyle w:val="ListParagraph"/>
+      </w:pPr>
+      <w:r>
+        <w:rPr>
+          <w:b/>
+        </w:rPr>
+        <w:t>"Getting my bearings."</w:t>
+      </w:r>
+      <w:r>
+        <w:t xml:space="preserve"> replaces "Marco is getting its bearings."</w:t>
+      </w:r>
+    </w:p>
+    <w:p>
+      <w:pPr>
+        <w:pStyle w:val="Heading1"/>
+      </w:pPr>
+      <w:r>
+        <w:t>12. Changes since v0.2</w:t>
+      </w:r>
+    </w:p>
+    <w:p>
+      <w:pPr>
+        <w:numPr>
+          <w:ilvl w:val="0"/>
+          <w:numId w:val="952"/>
+        </w:numPr>
+        <w:pStyle w:val="ListParagraph"/>
+      </w:pPr>
+      <w:r>
+        <w:rPr>
+          <w:b/>
+        </w:rPr>
+        <w:t>Registrations and labels persist</w:t>
+      </w:r>
+      <w:r>
+        <w:t xml:space="preserve"> across server restarts (§3.3), under </w:t>
+      </w:r>
+      <w:r>
+        <w:rPr>
+          <w:rFonts w:ascii="Courier New" w:hAnsi="Courier New" w:eastAsia="Courier New" w:cs="Courier New"/>
+          <w:color w:val="374151"/>
+          <w:sz w:val="19"/>
+        </w:rPr>
+        <w:t>MARCO_DATA/registry/</w:t>
+      </w:r>
+      <w:r>
+        <w:t>.</w:t>
+      </w:r>
+    </w:p>
+    <w:p>
+      <w:pPr>
+        <w:numPr>
+          <w:ilvl w:val="0"/>
+          <w:numId w:val="952"/>
+        </w:numPr>
+        <w:pStyle w:val="ListParagraph"/>
+      </w:pPr>
+      <w:r>
+        <w:rPr>
+          <w:b/>
+        </w:rPr>
+        <w:t>`source`:</w:t>
+      </w:r>
+    </w:p>
+    <w:p>
+      <w:pPr>
+        <w:numPr>
+          <w:ilvl w:val="1"/>
+          <w:numId w:val="953"/>
+        </w:numPr>
+        <w:pStyle w:val="ListParagraph"/>
+      </w:pPr>
+      <w:r>
+        <w:t xml:space="preserve">optional on </w:t>
+      </w:r>
+      <w:r>
+        <w:rPr>
+          <w:rFonts w:ascii="Courier New" w:hAnsi="Courier New" w:eastAsia="Courier New" w:cs="Courier New"/>
+          <w:color w:val="374151"/>
+          <w:sz w:val="19"/>
+        </w:rPr>
+        <w:t>POST /v1/items</w:t>
+      </w:r>
+      <w:r>
+        <w:t xml:space="preserve"> (default </w:t>
+      </w:r>
+      <w:r>
+        <w:rPr>
+          <w:rFonts w:ascii="Courier New" w:hAnsi="Courier New" w:eastAsia="Courier New" w:cs="Courier New"/>
+          <w:color w:val="374151"/>
+          <w:sz w:val="19"/>
+        </w:rPr>
+        <w:t>app</w:t>
+      </w:r>
+      <w:r>
+        <w:t xml:space="preserve">) and </w:t>
+      </w:r>
+      <w:r>
+        <w:rPr>
+          <w:rFonts w:ascii="Courier New" w:hAnsi="Courier New" w:eastAsia="Courier New" w:cs="Courier New"/>
+          <w:color w:val="374151"/>
+          <w:sz w:val="19"/>
+        </w:rPr>
+        <w:t>POST /v1/labels</w:t>
+      </w:r>
+      <w:r>
+        <w:t xml:space="preserve"> (default </w:t>
+      </w:r>
+      <w:r>
+        <w:rPr>
+          <w:rFonts w:ascii="Courier New" w:hAnsi="Courier New" w:eastAsia="Courier New" w:cs="Courier New"/>
+          <w:color w:val="374151"/>
+          <w:sz w:val="19"/>
+        </w:rPr>
+        <w:t>photon</w:t>
+      </w:r>
+      <w:r>
+        <w:t>);</w:t>
+      </w:r>
+    </w:p>
+    <w:p>
+      <w:pPr>
+        <w:numPr>
+          <w:ilvl w:val="1"/>
+          <w:numId w:val="953"/>
+        </w:numPr>
+        <w:pStyle w:val="ListParagraph"/>
+      </w:pPr>
+      <w:r>
+        <w:t xml:space="preserve">listed in </w:t>
+      </w:r>
+      <w:r>
+        <w:rPr>
+          <w:rFonts w:ascii="Courier New" w:hAnsi="Courier New" w:eastAsia="Courier New" w:cs="Courier New"/>
+          <w:color w:val="374151"/>
+          <w:sz w:val="19"/>
+        </w:rPr>
+        <w:t>GET /v1/items</w:t>
+      </w:r>
+      <w:r>
+        <w:t>.</w:t>
+      </w:r>
+    </w:p>
+    <w:p>
+      <w:pPr>
+        <w:numPr>
+          <w:ilvl w:val="0"/>
+          <w:numId w:val="952"/>
+        </w:numPr>
+        <w:pStyle w:val="ListParagraph"/>
+      </w:pPr>
+      <w:r>
+        <w:rPr>
+          <w:b/>
+        </w:rPr>
+        <w:t>New route</w:t>
+      </w:r>
+      <w:r>
+        <w:t xml:space="preserve"> </w:t>
+      </w:r>
+      <w:r>
+        <w:rPr>
+          <w:rFonts w:ascii="Courier New" w:hAnsi="Courier New" w:eastAsia="Courier New" w:cs="Courier New"/>
+          <w:color w:val="374151"/>
+          <w:sz w:val="19"/>
+        </w:rPr>
+        <w:t>DELETE /v1/items?source=…</w:t>
+      </w:r>
+      <w:r>
+        <w:t xml:space="preserve">, which forgets one source's items. Photon's </w:t>
+      </w:r>
+      <w:r>
+        <w:rPr>
+          <w:rFonts w:ascii="Courier New" w:hAnsi="Courier New" w:eastAsia="Courier New" w:cs="Courier New"/>
+          <w:color w:val="374151"/>
+          <w:sz w:val="19"/>
+        </w:rPr>
+        <w:t>/restart</w:t>
+      </w:r>
+      <w:r>
+        <w:t xml:space="preserve"> command uses it (§5).</w:t>
+      </w:r>
+    </w:p>
+    <w:p>
+      <w:pPr>
+        <w:numPr>
+          <w:ilvl w:val="0"/>
+          <w:numId w:val="952"/>
+        </w:numPr>
+        <w:pStyle w:val="ListParagraph"/>
+      </w:pPr>
+      <w:r>
+        <w:rPr>
+          <w:b/>
+        </w:rPr>
+        <w:t>Dashboard API</w:t>
+      </w:r>
+      <w:r>
+        <w:t xml:space="preserve"> (§6): </w:t>
+      </w:r>
+      <w:r>
+        <w:rPr>
+          <w:rFonts w:ascii="Courier New" w:hAnsi="Courier New" w:eastAsia="Courier New" w:cs="Courier New"/>
+          <w:color w:val="374151"/>
+          <w:sz w:val="19"/>
+        </w:rPr>
+        <w:t>GET /dashboard/snapshot</w:t>
+      </w:r>
+      <w:r>
+        <w:t xml:space="preserve">, </w:t>
+      </w:r>
+      <w:r>
+        <w:rPr>
+          <w:rFonts w:ascii="Courier New" w:hAnsi="Courier New" w:eastAsia="Courier New" w:cs="Courier New"/>
+          <w:color w:val="374151"/>
+          <w:sz w:val="19"/>
+        </w:rPr>
+        <w:t>WS /events</w:t>
+      </w:r>
+      <w:r>
+        <w:t xml:space="preserve">, </w:t>
+      </w:r>
+      <w:r>
+        <w:rPr>
+          <w:rFonts w:ascii="Courier New" w:hAnsi="Courier New" w:eastAsia="Courier New" w:cs="Courier New"/>
+          <w:color w:val="374151"/>
+          <w:sz w:val="19"/>
+        </w:rPr>
+        <w:t>POST /dashboard/commands</w:t>
+      </w:r>
+      <w:r>
+        <w:t xml:space="preserve">, </w:t>
+      </w:r>
+      <w:r>
+        <w:rPr>
+          <w:rFonts w:ascii="Courier New" w:hAnsi="Courier New" w:eastAsia="Courier New" w:cs="Courier New"/>
+          <w:color w:val="374151"/>
+          <w:sz w:val="19"/>
+        </w:rPr>
+        <w:t>GET /media/…</w:t>
+      </w:r>
+      <w:r>
+        <w:t xml:space="preserve"> and </w:t>
+      </w:r>
+      <w:r>
+        <w:rPr>
+          <w:rFonts w:ascii="Courier New" w:hAnsi="Courier New" w:eastAsia="Courier New" w:cs="Courier New"/>
+          <w:color w:val="374151"/>
+          <w:sz w:val="19"/>
+        </w:rPr>
+        <w:t>/app/…</w:t>
+      </w:r>
+      <w:r>
+        <w:t xml:space="preserve">, each also under </w:t>
+      </w:r>
+      <w:r>
+        <w:rPr>
+          <w:rFonts w:ascii="Courier New" w:hAnsi="Courier New" w:eastAsia="Courier New" w:cs="Courier New"/>
+          <w:color w:val="374151"/>
+          <w:sz w:val="19"/>
+        </w:rPr>
+        <w:t>/api/…</w:t>
+      </w:r>
+      <w:r>
+        <w:t>, all behind the auth gate.</w:t>
+      </w:r>
+    </w:p>
+    <w:p>
+      <w:pPr>
+        <w:numPr>
+          <w:ilvl w:val="0"/>
+          <w:numId w:val="952"/>
+        </w:numPr>
+        <w:pStyle w:val="ListParagraph"/>
+      </w:pPr>
+      <w:r>
+        <w:rPr>
+          <w:b/>
+        </w:rPr>
+        <w:t>New phone messages for dashboard Find and Stop:</w:t>
+      </w:r>
+      <w:r>
+        <w:t xml:space="preserve"> </w:t>
+      </w:r>
+      <w:r>
+        <w:rPr>
+          <w:rFonts w:ascii="Courier New" w:hAnsi="Courier New" w:eastAsia="Courier New" w:cs="Courier New"/>
+          <w:color w:val="374151"/>
+          <w:sz w:val="19"/>
+        </w:rPr>
+        <w:t>command</w:t>
+      </w:r>
+      <w:r>
+        <w:t xml:space="preserve"> (server to phone, §4) and </w:t>
+      </w:r>
+      <w:r>
+        <w:rPr>
+          <w:rFonts w:ascii="Courier New" w:hAnsi="Courier New" w:eastAsia="Courier New" w:cs="Courier New"/>
+          <w:color w:val="374151"/>
+          <w:sz w:val="19"/>
+        </w:rPr>
         <w:t>command_ack</w:t>
       </w:r>
       <w:r>
         <w:t xml:space="preserve"> (phone to server, §3.2).</w:t>
+      </w:r>
+    </w:p>
+    <w:p>
+      <w:pPr>
+        <w:pStyle w:val="Heading1"/>
+      </w:pPr>
+      <w:r>
+        <w:t>13. Changes since v0.3</w:t>
+      </w:r>
+    </w:p>
+    <w:p>
+      <w:pPr>
+        <w:numPr>
+          <w:ilvl w:val="0"/>
+          <w:numId w:val="954"/>
+        </w:numPr>
+        <w:pStyle w:val="ListParagraph"/>
+      </w:pPr>
+      <w:r>
+        <w:rPr>
+          <w:b/>
+        </w:rPr>
+        <w:t>Output-only ElevenLabs:</w:t>
+      </w:r>
+      <w:r>
+        <w:t xml:space="preserve"> authenticated </w:t>
+      </w:r>
+      <w:r>
+        <w:rPr>
+          <w:rFonts w:ascii="Courier New" w:hAnsi="Courier New" w:eastAsia="Courier New" w:cs="Courier New"/>
+          <w:color w:val="374151"/>
+          <w:sz w:val="19"/>
+        </w:rPr>
+        <w:t>POST /v1/speech</w:t>
+      </w:r>
+      <w:r>
+        <w:t xml:space="preserve"> (§3.5), short exact text to mono WAV, bounded caching/timeouts and Apple fallback. iOS plays it through the existing spatial voice node.</w:t>
+      </w:r>
+    </w:p>
+    <w:p>
+      <w:pPr>
+        <w:numPr>
+          <w:ilvl w:val="0"/>
+          <w:numId w:val="954"/>
+        </w:numPr>
+        <w:pStyle w:val="ListParagraph"/>
+      </w:pPr>
+      <w:r>
+        <w:rPr>
+          <w:b/>
+        </w:rPr>
+        <w:t>Typed Photon labels:</w:t>
+      </w:r>
+      <w:r>
+        <w:t xml:space="preserve"> no Scribe, transcription or new caregiver audio labels. Photos and typed names, retries, corrections and source attribution stay. Stored legacy media and optional wire fields remain compatible.</w:t>
       </w:r>
     </w:p>
     <w:sectPr>
@@ -7860,7 +8229,7 @@
   </w:num>
   <w:num w:numId="924">
     <w:abstractNumId w:val="900"/>
-    <w:lvlOverride w:ilvl="1">
+    <w:lvlOverride w:ilvl="0">
       <w:startOverride w:val="1"/>
     </w:lvlOverride>
   </w:num>
@@ -7872,13 +8241,13 @@
   </w:num>
   <w:num w:numId="926">
     <w:abstractNumId w:val="900"/>
-    <w:lvlOverride w:ilvl="1">
+    <w:lvlOverride w:ilvl="0">
       <w:startOverride w:val="1"/>
     </w:lvlOverride>
   </w:num>
   <w:num w:numId="927">
     <w:abstractNumId w:val="900"/>
-    <w:lvlOverride w:ilvl="1">
+    <w:lvlOverride w:ilvl="0">
       <w:startOverride w:val="1"/>
     </w:lvlOverride>
   </w:num>
@@ -7914,25 +8283,25 @@
   </w:num>
   <w:num w:numId="933">
     <w:abstractNumId w:val="900"/>
-    <w:lvlOverride w:ilvl="2">
+    <w:lvlOverride w:ilvl="0">
       <w:startOverride w:val="1"/>
     </w:lvlOverride>
   </w:num>
   <w:num w:numId="934">
-    <w:abstractNumId w:val="901"/>
-    <w:lvlOverride w:ilvl="0">
+    <w:abstractNumId w:val="900"/>
+    <w:lvlOverride w:ilvl="1">
       <w:startOverride w:val="1"/>
     </w:lvlOverride>
   </w:num>
   <w:num w:numId="935">
     <w:abstractNumId w:val="900"/>
-    <w:lvlOverride w:ilvl="1">
+    <w:lvlOverride w:ilvl="0">
       <w:startOverride w:val="1"/>
     </w:lvlOverride>
   </w:num>
   <w:num w:numId="936">
-    <w:abstractNumId w:val="901"/>
-    <w:lvlOverride w:ilvl="0">
+    <w:abstractNumId w:val="900"/>
+    <w:lvlOverride w:ilvl="1">
       <w:startOverride w:val="1"/>
     </w:lvlOverride>
   </w:num>
@@ -7943,20 +8312,20 @@
     </w:lvlOverride>
   </w:num>
   <w:num w:numId="938">
-    <w:abstractNumId w:val="901"/>
-    <w:lvlOverride w:ilvl="0">
+    <w:abstractNumId w:val="900"/>
+    <w:lvlOverride w:ilvl="2">
       <w:startOverride w:val="1"/>
     </w:lvlOverride>
   </w:num>
   <w:num w:numId="939">
-    <w:abstractNumId w:val="900"/>
+    <w:abstractNumId w:val="901"/>
     <w:lvlOverride w:ilvl="0">
       <w:startOverride w:val="1"/>
     </w:lvlOverride>
   </w:num>
   <w:num w:numId="940">
     <w:abstractNumId w:val="900"/>
-    <w:lvlOverride w:ilvl="0">
+    <w:lvlOverride w:ilvl="1">
       <w:startOverride w:val="1"/>
     </w:lvlOverride>
   </w:num>
@@ -7973,14 +8342,14 @@
     </w:lvlOverride>
   </w:num>
   <w:num w:numId="943">
-    <w:abstractNumId w:val="900"/>
+    <w:abstractNumId w:val="901"/>
     <w:lvlOverride w:ilvl="0">
       <w:startOverride w:val="1"/>
     </w:lvlOverride>
   </w:num>
   <w:num w:numId="944">
     <w:abstractNumId w:val="900"/>
-    <w:lvlOverride w:ilvl="1">
+    <w:lvlOverride w:ilvl="0">
       <w:startOverride w:val="1"/>
     </w:lvlOverride>
   </w:num>
@@ -7991,20 +8360,56 @@
     </w:lvlOverride>
   </w:num>
   <w:num w:numId="946">
+    <w:abstractNumId w:val="901"/>
+    <w:lvlOverride w:ilvl="0">
+      <w:startOverride w:val="1"/>
+    </w:lvlOverride>
+  </w:num>
+  <w:num w:numId="947">
     <w:abstractNumId w:val="900"/>
     <w:lvlOverride w:ilvl="1">
       <w:startOverride w:val="1"/>
     </w:lvlOverride>
   </w:num>
-  <w:num w:numId="947">
+  <w:num w:numId="948">
     <w:abstractNumId w:val="900"/>
     <w:lvlOverride w:ilvl="0">
       <w:startOverride w:val="1"/>
     </w:lvlOverride>
   </w:num>
-  <w:num w:numId="948">
+  <w:num w:numId="949">
     <w:abstractNumId w:val="900"/>
     <w:lvlOverride w:ilvl="1">
+      <w:startOverride w:val="1"/>
+    </w:lvlOverride>
+  </w:num>
+  <w:num w:numId="950">
+    <w:abstractNumId w:val="900"/>
+    <w:lvlOverride w:ilvl="0">
+      <w:startOverride w:val="1"/>
+    </w:lvlOverride>
+  </w:num>
+  <w:num w:numId="951">
+    <w:abstractNumId w:val="900"/>
+    <w:lvlOverride w:ilvl="1">
+      <w:startOverride w:val="1"/>
+    </w:lvlOverride>
+  </w:num>
+  <w:num w:numId="952">
+    <w:abstractNumId w:val="900"/>
+    <w:lvlOverride w:ilvl="0">
+      <w:startOverride w:val="1"/>
+    </w:lvlOverride>
+  </w:num>
+  <w:num w:numId="953">
+    <w:abstractNumId w:val="900"/>
+    <w:lvlOverride w:ilvl="1">
+      <w:startOverride w:val="1"/>
+    </w:lvlOverride>
+  </w:num>
+  <w:num w:numId="954">
+    <w:abstractNumId w:val="900"/>
+    <w:lvlOverride w:ilvl="0">
       <w:startOverride w:val="1"/>
     </w:lvlOverride>
   </w:num>

</xml_diff>

<commit_message>
Deploy reliable Photon caretaker bridge and activate integration workflows
</commit_message>
<xml_diff>
--- a/docs/INTERFACES.docx
+++ b/docs/INTERFACES.docx
@@ -3746,10 +3746,21 @@
         <w:rPr>
           <w:b/>
         </w:rPr>
-        <w:t>Asking:</w:t>
-      </w:r>
-      <w:r>
-        <w:t xml:space="preserve"> send the crop (the touched item boxed) to the caretaker over iMessage.</w:t>
+        <w:t>Reconnect delivery:</w:t>
+      </w:r>
+      <w:r>
+        <w:t xml:space="preserve"> the server retains up to 128 unanswered requests for 10 minutes and replays them to an authenticated bridge when it connects. Delivery is at least once: deduplicate by </w:t>
+      </w:r>
+      <w:r>
+        <w:rPr>
+          <w:rFonts w:ascii="Courier New" w:hAnsi="Courier New" w:eastAsia="Courier New" w:cs="Courier New"/>
+          <w:color w:val="374151"/>
+          <w:sz w:val="19"/>
+        </w:rPr>
+        <w:t>touch_id</w:t>
+      </w:r>
+      <w:r>
+        <w:t>, including across bridge restarts. Saving a label resolves that request. This buffer and touch crops are memory-only; a server restart loses them. The bridge can use its saved crop if a later answer encounters an expired touch (404).</w:t>
       </w:r>
     </w:p>
     <w:p>
@@ -3764,6 +3775,24 @@
         <w:rPr>
           <w:b/>
         </w:rPr>
+        <w:t>Asking:</w:t>
+      </w:r>
+      <w:r>
+        <w:t xml:space="preserve"> send the crop (the touched item boxed) to the caretaker over iMessage.</w:t>
+      </w:r>
+    </w:p>
+    <w:p>
+      <w:pPr>
+        <w:numPr>
+          <w:ilvl w:val="0"/>
+          <w:numId w:val="930"/>
+        </w:numPr>
+        <w:pStyle w:val="ListParagraph"/>
+      </w:pPr>
+      <w:r>
+        <w:rPr>
+          <w:b/>
+        </w:rPr>
         <w:t>Replying:</w:t>
       </w:r>
       <w:r>
@@ -3919,6 +3948,108 @@
       </w:r>
       <w:r>
         <w:t>.</w:t>
+      </w:r>
+    </w:p>
+    <w:p>
+      <w:pPr>
+        <w:numPr>
+          <w:ilvl w:val="0"/>
+          <w:numId w:val="933"/>
+        </w:numPr>
+        <w:pStyle w:val="ListParagraph"/>
+      </w:pPr>
+      <w:r>
+        <w:rPr>
+          <w:b/>
+        </w:rPr>
+        <w:t>Retried answers:</w:t>
+      </w:r>
+      <w:r>
+        <w:t xml:space="preserve"> posting the same retained </w:t>
+      </w:r>
+      <w:r>
+        <w:rPr>
+          <w:rFonts w:ascii="Courier New" w:hAnsi="Courier New" w:eastAsia="Courier New" w:cs="Courier New"/>
+          <w:color w:val="374151"/>
+          <w:sz w:val="19"/>
+        </w:rPr>
+        <w:t>touch_id</w:t>
+      </w:r>
+      <w:r>
+        <w:t xml:space="preserve"> again reuses its existing </w:t>
+      </w:r>
+      <w:r>
+        <w:rPr>
+          <w:rFonts w:ascii="Courier New" w:hAnsi="Courier New" w:eastAsia="Courier New" w:cs="Courier New"/>
+          <w:color w:val="374151"/>
+          <w:sz w:val="19"/>
+        </w:rPr>
+        <w:t>item_id</w:t>
+      </w:r>
+      <w:r>
+        <w:t xml:space="preserve">, so a lost HTTP response does not create a second item. It can emit </w:t>
+      </w:r>
+      <w:r>
+        <w:rPr>
+          <w:rFonts w:ascii="Courier New" w:hAnsi="Courier New" w:eastAsia="Courier New" w:cs="Courier New"/>
+          <w:color w:val="374151"/>
+          <w:sz w:val="19"/>
+        </w:rPr>
+        <w:t>label_ready</w:t>
+      </w:r>
+      <w:r>
+        <w:t xml:space="preserve"> again. Prefer </w:t>
+      </w:r>
+      <w:r>
+        <w:rPr>
+          <w:rFonts w:ascii="Courier New" w:hAnsi="Courier New" w:eastAsia="Courier New" w:cs="Courier New"/>
+          <w:color w:val="374151"/>
+          <w:sz w:val="19"/>
+        </w:rPr>
+        <w:t>item_id</w:t>
+      </w:r>
+      <w:r>
+        <w:t xml:space="preserve"> for subsequent corrections. This does not make arbitrary </w:t>
+      </w:r>
+      <w:r>
+        <w:rPr>
+          <w:rFonts w:ascii="Courier New" w:hAnsi="Courier New" w:eastAsia="Courier New" w:cs="Courier New"/>
+          <w:color w:val="374151"/>
+          <w:sz w:val="19"/>
+        </w:rPr>
+        <w:t>POST /v1/items</w:t>
+      </w:r>
+      <w:r>
+        <w:t xml:space="preserve"> uploads idempotent.</w:t>
+      </w:r>
+    </w:p>
+    <w:p>
+      <w:pPr>
+        <w:numPr>
+          <w:ilvl w:val="0"/>
+          <w:numId w:val="933"/>
+        </w:numPr>
+        <w:pStyle w:val="ListParagraph"/>
+      </w:pPr>
+      <w:r>
+        <w:rPr>
+          <w:b/>
+        </w:rPr>
+        <w:t>Delivery status:</w:t>
+      </w:r>
+      <w:r>
+        <w:t xml:space="preserve"> the phone's </w:t>
+      </w:r>
+      <w:r>
+        <w:rPr>
+          <w:rFonts w:ascii="Courier New" w:hAnsi="Courier New" w:eastAsia="Courier New" w:cs="Courier New"/>
+          <w:color w:val="374151"/>
+          <w:sz w:val="19"/>
+        </w:rPr>
+        <w:t>unknown</w:t>
+      </w:r>
+      <w:r>
+        <w:t xml:space="preserve"> answer means a helper request was generated, not that iMessage accepted or delivered a photo. This contract has no provider-delivery acknowledgement to the phone.</w:t>
       </w:r>
     </w:p>
     <w:p>

</xml_diff>

<commit_message>
Room map on the dashboard: walls and stock furniture shapes from the LiDAR map (POC 27)
server: world/layout.py turns a 10 cm column grid (filled in RoomMap.add) into walls and furniture
(table, chair, sofa, bench, bed, storage, tree, plant) with size and facing. The brain sends
room_layout every 3 frames on its own thread; the dashboard adapter fills map.walls and the new
map.landmarks. A new map_id now starts a fresh room map.

frontend: map.landmarks in the schema (kind/shape are strings, so new kinds can't break parsing);
lib/roomShapes.ts + RoomShape.tsx draw one stock shape per kind, Tesla-screen style; MapView uses
them for scanned landmarks and hand-placed fixtures.

POC 27 (poc/pocs/poc27_room_map): detection outputs identical with the layout on and off (real
OWLv2 runs), no change in mean frame latency, summarize 5 ms per room and 177 ms at the 40 m cap
(off the frame thread); synthetic room 6/6 furniture right, walls 95% precision/recall.
</commit_message>
<xml_diff>
--- a/docs/INTERFACES.docx
+++ b/docs/INTERFACES.docx
@@ -5482,8 +5482,312 @@
     <w:p>
       <w:pPr>
         <w:numPr>
+          <w:ilvl w:val="1"/>
+          <w:numId w:val="937"/>
+        </w:numPr>
+        <w:pStyle w:val="ListParagraph"/>
+      </w:pPr>
+      <w:r>
+        <w:rPr>
+          <w:b/>
+        </w:rPr>
+        <w:t>Room layout:</w:t>
+      </w:r>
+      <w:r>
+        <w:t xml:space="preserve"> the latest </w:t>
+      </w:r>
+      <w:r>
+        <w:rPr>
+          <w:rFonts w:ascii="Courier New" w:hAnsi="Courier New" w:eastAsia="Courier New" w:cs="Courier New"/>
+          <w:color w:val="374151"/>
+          <w:sz w:val="19"/>
+        </w:rPr>
+        <w:t>room_layout</w:t>
+      </w:r>
+      <w:r>
+        <w:t xml:space="preserve"> for the current map (below). </w:t>
+      </w:r>
+      <w:r>
+        <w:rPr>
+          <w:rFonts w:ascii="Courier New" w:hAnsi="Courier New" w:eastAsia="Courier New" w:cs="Courier New"/>
+          <w:color w:val="374151"/>
+          <w:sz w:val="19"/>
+        </w:rPr>
+        <w:t>map.walls</w:t>
+      </w:r>
+      <w:r>
+        <w:t xml:space="preserve"> holds its walls as </w:t>
+      </w:r>
+      <w:r>
+        <w:rPr>
+          <w:rFonts w:ascii="Courier New" w:hAnsi="Courier New" w:eastAsia="Courier New" w:cs="Courier New"/>
+          <w:color w:val="374151"/>
+          <w:sz w:val="19"/>
+        </w:rPr>
+        <w:t>{from: {x, z}, to: {x, z}}</w:t>
+      </w:r>
+      <w:r>
+        <w:t xml:space="preserve">. </w:t>
+      </w:r>
+      <w:r>
+        <w:rPr>
+          <w:rFonts w:ascii="Courier New" w:hAnsi="Courier New" w:eastAsia="Courier New" w:cs="Courier New"/>
+          <w:color w:val="374151"/>
+          <w:sz w:val="19"/>
+        </w:rPr>
+        <w:t>map.landmarks</w:t>
+      </w:r>
+      <w:r>
+        <w:t xml:space="preserve"> holds its furniture as </w:t>
+      </w:r>
+      <w:r>
+        <w:rPr>
+          <w:rFonts w:ascii="Courier New" w:hAnsi="Courier New" w:eastAsia="Courier New" w:cs="Courier New"/>
+          <w:color w:val="374151"/>
+          <w:sz w:val="19"/>
+        </w:rPr>
+        <w:t>{id, kind, x, z, width, depth, yawDeg, shape}</w:t>
+      </w:r>
+      <w:r>
+        <w:t>:</w:t>
+      </w:r>
+    </w:p>
+    <w:p>
+      <w:pPr>
+        <w:numPr>
+          <w:ilvl w:val="2"/>
+          <w:numId w:val="939"/>
+        </w:numPr>
+        <w:pStyle w:val="ListParagraph"/>
+      </w:pPr>
+      <w:r>
+        <w:rPr>
+          <w:rFonts w:ascii="Courier New" w:hAnsi="Courier New" w:eastAsia="Courier New" w:cs="Courier New"/>
+          <w:color w:val="374151"/>
+          <w:sz w:val="19"/>
+        </w:rPr>
+        <w:t>x, z</w:t>
+      </w:r>
+      <w:r>
+        <w:t xml:space="preserve"> is the centre; </w:t>
+      </w:r>
+      <w:r>
+        <w:rPr>
+          <w:rFonts w:ascii="Courier New" w:hAnsi="Courier New" w:eastAsia="Courier New" w:cs="Courier New"/>
+          <w:color w:val="374151"/>
+          <w:sz w:val="19"/>
+        </w:rPr>
+        <w:t>width</w:t>
+      </w:r>
+      <w:r>
+        <w:t xml:space="preserve"> runs across, </w:t>
+      </w:r>
+      <w:r>
+        <w:rPr>
+          <w:rFonts w:ascii="Courier New" w:hAnsi="Courier New" w:eastAsia="Courier New" w:cs="Courier New"/>
+          <w:color w:val="374151"/>
+          <w:sz w:val="19"/>
+        </w:rPr>
+        <w:t>depth</w:t>
+      </w:r>
+      <w:r>
+        <w:t xml:space="preserve"> front to back;</w:t>
+      </w:r>
+    </w:p>
+    <w:p>
+      <w:pPr>
+        <w:numPr>
+          <w:ilvl w:val="2"/>
+          <w:numId w:val="939"/>
+        </w:numPr>
+        <w:pStyle w:val="ListParagraph"/>
+      </w:pPr>
+      <w:r>
+        <w:rPr>
+          <w:rFonts w:ascii="Courier New" w:hAnsi="Courier New" w:eastAsia="Courier New" w:cs="Courier New"/>
+          <w:color w:val="374151"/>
+          <w:sz w:val="19"/>
+        </w:rPr>
+        <w:t>yawDeg</w:t>
+      </w:r>
+      <w:r>
+        <w:t xml:space="preserve"> is the way the front faces, in the wearer's convention (0 = world -z, 90 = +x);</w:t>
+      </w:r>
+    </w:p>
+    <w:p>
+      <w:pPr>
+        <w:numPr>
+          <w:ilvl w:val="2"/>
+          <w:numId w:val="939"/>
+        </w:numPr>
+        <w:pStyle w:val="ListParagraph"/>
+      </w:pPr>
+      <w:r>
+        <w:rPr>
+          <w:rFonts w:ascii="Courier New" w:hAnsi="Courier New" w:eastAsia="Courier New" w:cs="Courier New"/>
+          <w:color w:val="374151"/>
+          <w:sz w:val="19"/>
+        </w:rPr>
+        <w:t>shape</w:t>
+      </w:r>
+      <w:r>
+        <w:t xml:space="preserve"> is </w:t>
+      </w:r>
+      <w:r>
+        <w:rPr>
+          <w:rFonts w:ascii="Courier New" w:hAnsi="Courier New" w:eastAsia="Courier New" w:cs="Courier New"/>
+          <w:color w:val="374151"/>
+          <w:sz w:val="19"/>
+        </w:rPr>
+        <w:t>round</w:t>
+      </w:r>
+      <w:r>
+        <w:t xml:space="preserve"> or </w:t>
+      </w:r>
+      <w:r>
+        <w:rPr>
+          <w:rFonts w:ascii="Courier New" w:hAnsi="Courier New" w:eastAsia="Courier New" w:cs="Courier New"/>
+          <w:color w:val="374151"/>
+          <w:sz w:val="19"/>
+        </w:rPr>
+        <w:t>rect</w:t>
+      </w:r>
+      <w:r>
+        <w:t>;</w:t>
+      </w:r>
+    </w:p>
+    <w:p>
+      <w:pPr>
+        <w:numPr>
+          <w:ilvl w:val="2"/>
+          <w:numId w:val="939"/>
+        </w:numPr>
+        <w:pStyle w:val="ListParagraph"/>
+      </w:pPr>
+      <w:r>
+        <w:t xml:space="preserve">kinds today are </w:t>
+      </w:r>
+      <w:r>
+        <w:rPr>
+          <w:rFonts w:ascii="Courier New" w:hAnsi="Courier New" w:eastAsia="Courier New" w:cs="Courier New"/>
+          <w:color w:val="374151"/>
+          <w:sz w:val="19"/>
+        </w:rPr>
+        <w:t>table</w:t>
+      </w:r>
+      <w:r>
+        <w:t xml:space="preserve">, </w:t>
+      </w:r>
+      <w:r>
+        <w:rPr>
+          <w:rFonts w:ascii="Courier New" w:hAnsi="Courier New" w:eastAsia="Courier New" w:cs="Courier New"/>
+          <w:color w:val="374151"/>
+          <w:sz w:val="19"/>
+        </w:rPr>
+        <w:t>chair</w:t>
+      </w:r>
+      <w:r>
+        <w:t xml:space="preserve">, </w:t>
+      </w:r>
+      <w:r>
+        <w:rPr>
+          <w:rFonts w:ascii="Courier New" w:hAnsi="Courier New" w:eastAsia="Courier New" w:cs="Courier New"/>
+          <w:color w:val="374151"/>
+          <w:sz w:val="19"/>
+        </w:rPr>
+        <w:t>sofa</w:t>
+      </w:r>
+      <w:r>
+        <w:t xml:space="preserve">, </w:t>
+      </w:r>
+      <w:r>
+        <w:rPr>
+          <w:rFonts w:ascii="Courier New" w:hAnsi="Courier New" w:eastAsia="Courier New" w:cs="Courier New"/>
+          <w:color w:val="374151"/>
+          <w:sz w:val="19"/>
+        </w:rPr>
+        <w:t>bench</w:t>
+      </w:r>
+      <w:r>
+        <w:t xml:space="preserve">, </w:t>
+      </w:r>
+      <w:r>
+        <w:rPr>
+          <w:rFonts w:ascii="Courier New" w:hAnsi="Courier New" w:eastAsia="Courier New" w:cs="Courier New"/>
+          <w:color w:val="374151"/>
+          <w:sz w:val="19"/>
+        </w:rPr>
+        <w:t>bed</w:t>
+      </w:r>
+      <w:r>
+        <w:t xml:space="preserve">, </w:t>
+      </w:r>
+      <w:r>
+        <w:rPr>
+          <w:rFonts w:ascii="Courier New" w:hAnsi="Courier New" w:eastAsia="Courier New" w:cs="Courier New"/>
+          <w:color w:val="374151"/>
+          <w:sz w:val="19"/>
+        </w:rPr>
+        <w:t>storage</w:t>
+      </w:r>
+      <w:r>
+        <w:t xml:space="preserve">, </w:t>
+      </w:r>
+      <w:r>
+        <w:rPr>
+          <w:rFonts w:ascii="Courier New" w:hAnsi="Courier New" w:eastAsia="Courier New" w:cs="Courier New"/>
+          <w:color w:val="374151"/>
+          <w:sz w:val="19"/>
+        </w:rPr>
+        <w:t>tree</w:t>
+      </w:r>
+      <w:r>
+        <w:t xml:space="preserve"> and </w:t>
+      </w:r>
+      <w:r>
+        <w:rPr>
+          <w:rFonts w:ascii="Courier New" w:hAnsi="Courier New" w:eastAsia="Courier New" w:cs="Courier New"/>
+          <w:color w:val="374151"/>
+          <w:sz w:val="19"/>
+        </w:rPr>
+        <w:t>plant</w:t>
+      </w:r>
+      <w:r>
+        <w:t>; draw unknown kinds as a plain block.</w:t>
+      </w:r>
+    </w:p>
+    <w:p>
+      <w:r>
+        <w:t xml:space="preserve">The layout is display only. It's LiDAR geometry, so it can be wrong (a doorway the scan hasn't seen through yet can show as a wall). It's dropped when the map changes. Without a layout, </w:t>
+      </w:r>
+      <w:r>
+        <w:rPr>
+          <w:rFonts w:ascii="Courier New" w:hAnsi="Courier New" w:eastAsia="Courier New" w:cs="Courier New"/>
+          <w:color w:val="374151"/>
+          <w:sz w:val="19"/>
+        </w:rPr>
+        <w:t>walls</w:t>
+      </w:r>
+      <w:r>
+        <w:t xml:space="preserve"> is null and </w:t>
+      </w:r>
+      <w:r>
+        <w:rPr>
+          <w:rFonts w:ascii="Courier New" w:hAnsi="Courier New" w:eastAsia="Courier New" w:cs="Courier New"/>
+          <w:color w:val="374151"/>
+          <w:sz w:val="19"/>
+        </w:rPr>
+        <w:t>landmarks</w:t>
+      </w:r>
+      <w:r>
+        <w:t xml:space="preserve"> is absent.</w:t>
+      </w:r>
+    </w:p>
+    <w:p>
+      <w:pPr>
+        <w:numPr>
           <w:ilvl w:val="0"/>
-          <w:numId w:val="935"/>
+          <w:numId w:val="940"/>
         </w:numPr>
         <w:pStyle w:val="ListParagraph"/>
       </w:pPr>
@@ -5556,7 +5860,7 @@
       <w:tr>
         <w:tc>
           <w:tcPr>
-            <w:tcW w:type="dxa" w:w="1248"/>
+            <w:tcW w:type="dxa" w:w="1223"/>
             <w:shd w:val="clear" w:color="auto" w:fill="E8EEF7"/>
           </w:tcPr>
           <w:p>
@@ -5574,7 +5878,7 @@
         </w:tc>
         <w:tc>
           <w:tcPr>
-            <w:tcW w:type="dxa" w:w="1710"/>
+            <w:tcW w:type="dxa" w:w="3715"/>
             <w:shd w:val="clear" w:color="auto" w:fill="E8EEF7"/>
           </w:tcPr>
           <w:p>
@@ -5592,7 +5896,7 @@
         </w:tc>
         <w:tc>
           <w:tcPr>
-            <w:tcW w:type="dxa" w:w="6690"/>
+            <w:tcW w:type="dxa" w:w="4710"/>
             <w:shd w:val="clear" w:color="auto" w:fill="E8EEF7"/>
           </w:tcPr>
           <w:p>
@@ -5612,7 +5916,7 @@
       <w:tr>
         <w:tc>
           <w:tcPr>
-            <w:tcW w:type="dxa" w:w="1248"/>
+            <w:tcW w:type="dxa" w:w="1223"/>
           </w:tcPr>
           <w:p>
             <w:pPr>
@@ -5630,7 +5934,7 @@
         </w:tc>
         <w:tc>
           <w:tcPr>
-            <w:tcW w:type="dxa" w:w="1710"/>
+            <w:tcW w:type="dxa" w:w="3715"/>
           </w:tcPr>
           <w:p>
             <w:pPr>
@@ -5646,7 +5950,7 @@
         </w:tc>
         <w:tc>
           <w:tcPr>
-            <w:tcW w:type="dxa" w:w="6690"/>
+            <w:tcW w:type="dxa" w:w="4710"/>
           </w:tcPr>
           <w:p>
             <w:pPr>
@@ -5672,7 +5976,7 @@
       <w:tr>
         <w:tc>
           <w:tcPr>
-            <w:tcW w:type="dxa" w:w="1248"/>
+            <w:tcW w:type="dxa" w:w="1223"/>
           </w:tcPr>
           <w:p>
             <w:pPr>
@@ -5690,7 +5994,7 @@
         </w:tc>
         <w:tc>
           <w:tcPr>
-            <w:tcW w:type="dxa" w:w="1710"/>
+            <w:tcW w:type="dxa" w:w="3715"/>
           </w:tcPr>
           <w:p>
             <w:pPr>
@@ -5706,7 +6010,7 @@
         </w:tc>
         <w:tc>
           <w:tcPr>
-            <w:tcW w:type="dxa" w:w="6690"/>
+            <w:tcW w:type="dxa" w:w="4710"/>
           </w:tcPr>
           <w:p>
             <w:pPr>
@@ -5752,7 +6056,7 @@
       <w:tr>
         <w:tc>
           <w:tcPr>
-            <w:tcW w:type="dxa" w:w="1248"/>
+            <w:tcW w:type="dxa" w:w="1223"/>
           </w:tcPr>
           <w:p>
             <w:pPr>
@@ -5770,7 +6074,7 @@
         </w:tc>
         <w:tc>
           <w:tcPr>
-            <w:tcW w:type="dxa" w:w="1710"/>
+            <w:tcW w:type="dxa" w:w="3715"/>
           </w:tcPr>
           <w:p>
             <w:pPr>
@@ -5786,7 +6090,7 @@
         </w:tc>
         <w:tc>
           <w:tcPr>
-            <w:tcW w:type="dxa" w:w="6690"/>
+            <w:tcW w:type="dxa" w:w="4710"/>
           </w:tcPr>
           <w:p>
             <w:pPr>
@@ -5818,7 +6122,95 @@
       <w:tr>
         <w:tc>
           <w:tcPr>
-            <w:tcW w:type="dxa" w:w="1248"/>
+            <w:tcW w:type="dxa" w:w="1223"/>
+          </w:tcPr>
+          <w:p>
+            <w:pPr>
+              <w:spacing w:after="40"/>
+            </w:pPr>
+            <w:r>
+              <w:rPr>
+                <w:rFonts w:ascii="Courier New" w:hAnsi="Courier New" w:eastAsia="Courier New" w:cs="Courier New"/>
+                <w:color w:val="374151"/>
+                <w:sz w:val="19"/>
+              </w:rPr>
+              <w:t>room_layout</w:t>
+            </w:r>
+          </w:p>
+        </w:tc>
+        <w:tc>
+          <w:tcPr>
+            <w:tcW w:type="dxa" w:w="3715"/>
+          </w:tcPr>
+          <w:p>
+            <w:pPr>
+              <w:spacing w:after="40"/>
+            </w:pPr>
+            <w:r>
+              <w:rPr>
+                <w:sz w:val="20"/>
+              </w:rPr>
+              <w:t>every 3 frames (</w:t>
+            </w:r>
+            <w:r>
+              <w:rPr>
+                <w:rFonts w:ascii="Courier New" w:hAnsi="Courier New" w:eastAsia="Courier New" w:cs="Courier New"/>
+                <w:color w:val="374151"/>
+                <w:sz w:val="19"/>
+              </w:rPr>
+              <w:t>MARCO_LAYOUT_EVERY</w:t>
+            </w:r>
+            <w:r>
+              <w:rPr>
+                <w:sz w:val="20"/>
+              </w:rPr>
+              <w:t>, 0 = off), once the floor is known</w:t>
+            </w:r>
+          </w:p>
+        </w:tc>
+        <w:tc>
+          <w:tcPr>
+            <w:tcW w:type="dxa" w:w="4710"/>
+          </w:tcPr>
+          <w:p>
+            <w:pPr>
+              <w:spacing w:after="40"/>
+            </w:pPr>
+            <w:r>
+              <w:rPr>
+                <w:rFonts w:ascii="Courier New" w:hAnsi="Courier New" w:eastAsia="Courier New" w:cs="Courier New"/>
+                <w:color w:val="374151"/>
+                <w:sz w:val="19"/>
+              </w:rPr>
+              <w:t>{map_id, walls: [[[x, z], [x, z]], …], objects: [{kind, x, z, width, depth, yaw, height, shape}]}</w:t>
+            </w:r>
+            <w:r>
+              <w:rPr>
+                <w:sz w:val="20"/>
+              </w:rPr>
+              <w:t xml:space="preserve"> from </w:t>
+            </w:r>
+            <w:r>
+              <w:rPr>
+                <w:rFonts w:ascii="Courier New" w:hAnsi="Courier New" w:eastAsia="Courier New" w:cs="Courier New"/>
+                <w:color w:val="374151"/>
+                <w:sz w:val="19"/>
+              </w:rPr>
+              <w:t>server/marco/world/layout.py</w:t>
+            </w:r>
+            <w:r>
+              <w:rPr>
+                <w:sz w:val="20"/>
+              </w:rPr>
+              <w:t>: walls and furniture shapes summarised from the LiDAR map</w:t>
+            </w:r>
+          </w:p>
+        </w:tc>
+      </w:tr>
+      <w:tr>
+        <w:tc>
+          <w:tcPr>
+            <w:tcW w:type="dxa" w:w="1223"/>
           </w:tcPr>
           <w:p>
             <w:pPr>
@@ -5836,7 +6228,7 @@
         </w:tc>
         <w:tc>
           <w:tcPr>
-            <w:tcW w:type="dxa" w:w="1710"/>
+            <w:tcW w:type="dxa" w:w="3715"/>
           </w:tcPr>
           <w:p>
             <w:pPr>
@@ -5852,7 +6244,7 @@
         </w:tc>
         <w:tc>
           <w:tcPr>
-            <w:tcW w:type="dxa" w:w="6690"/>
+            <w:tcW w:type="dxa" w:w="4710"/>
           </w:tcPr>
           <w:p>
             <w:pPr>
@@ -5870,7 +6262,7 @@
       <w:tr>
         <w:tc>
           <w:tcPr>
-            <w:tcW w:type="dxa" w:w="1248"/>
+            <w:tcW w:type="dxa" w:w="1223"/>
           </w:tcPr>
           <w:p>
             <w:pPr>
@@ -5888,7 +6280,7 @@
         </w:tc>
         <w:tc>
           <w:tcPr>
-            <w:tcW w:type="dxa" w:w="1710"/>
+            <w:tcW w:type="dxa" w:w="3715"/>
           </w:tcPr>
           <w:p>
             <w:pPr>
@@ -5904,7 +6296,7 @@
         </w:tc>
         <w:tc>
           <w:tcPr>
-            <w:tcW w:type="dxa" w:w="6690"/>
+            <w:tcW w:type="dxa" w:w="4710"/>
           </w:tcPr>
           <w:p>
             <w:pPr>
@@ -6002,7 +6394,7 @@
       <w:pPr>
         <w:numPr>
           <w:ilvl w:val="0"/>
-          <w:numId w:val="939"/>
+          <w:numId w:val="941"/>
         </w:numPr>
         <w:pStyle w:val="ListParagraph"/>
       </w:pPr>
@@ -6025,303 +6417,6 @@
       </w:r>
       <w:r>
         <w:t>.</w:t>
-      </w:r>
-    </w:p>
-    <w:p>
-      <w:pPr>
-        <w:numPr>
-          <w:ilvl w:val="0"/>
-          <w:numId w:val="939"/>
-        </w:numPr>
-        <w:pStyle w:val="ListParagraph"/>
-      </w:pPr>
-      <w:r>
-        <w:rPr>
-          <w:b/>
-        </w:rPr>
-        <w:t>The answer arrives.</w:t>
-      </w:r>
-      <w:r>
-        <w:t xml:space="preserve"> The phone speaks </w:t>
-      </w:r>
-      <w:r>
-        <w:rPr>
-          <w:i/>
-        </w:rPr>
-        <w:t>"Polo! Behind you, two steps, on the table,"</w:t>
-      </w:r>
-      <w:r>
-        <w:t xml:space="preserve"> spatialised at </w:t>
-      </w:r>
-      <w:r>
-        <w:rPr>
-          <w:rFonts w:ascii="Courier New" w:hAnsi="Courier New" w:eastAsia="Courier New" w:cs="Courier New"/>
-          <w:color w:val="374151"/>
-          <w:sz w:val="19"/>
-        </w:rPr>
-        <w:t>position</w:t>
-      </w:r>
-      <w:r>
-        <w:t>:</w:t>
-      </w:r>
-    </w:p>
-    <w:p>
-      <w:pPr>
-        <w:numPr>
-          <w:ilvl w:val="1"/>
-          <w:numId w:val="940"/>
-        </w:numPr>
-        <w:pStyle w:val="ListParagraph"/>
-      </w:pPr>
-      <w:r>
-        <w:t xml:space="preserve">the direction is relative to the </w:t>
-      </w:r>
-      <w:r>
-        <w:rPr>
-          <w:b/>
-        </w:rPr>
-        <w:t>body</w:t>
-      </w:r>
-      <w:r>
-        <w:t xml:space="preserve"> (chest heading), because "behind you" means behind your body;</w:t>
-      </w:r>
-    </w:p>
-    <w:p>
-      <w:pPr>
-        <w:numPr>
-          <w:ilvl w:val="1"/>
-          <w:numId w:val="940"/>
-        </w:numPr>
-        <w:pStyle w:val="ListParagraph"/>
-      </w:pPr>
-      <w:r>
-        <w:t>clock position = round(relative azimuth / 30°), where 12 o'clock means ahead; 12, 3, 6 and 9 are said as "straight ahead", "on your right", "behind you" and "on your left";</w:t>
-      </w:r>
-    </w:p>
-    <w:p>
-      <w:pPr>
-        <w:numPr>
-          <w:ilvl w:val="1"/>
-          <w:numId w:val="940"/>
-        </w:numPr>
-        <w:pStyle w:val="ListParagraph"/>
-      </w:pPr>
-      <w:r>
-        <w:t>steps = round(horizontal distance / 0.7 m), at least one;</w:t>
-      </w:r>
-    </w:p>
-    <w:p>
-      <w:pPr>
-        <w:numPr>
-          <w:ilvl w:val="1"/>
-          <w:numId w:val="940"/>
-        </w:numPr>
-        <w:pStyle w:val="ListParagraph"/>
-      </w:pPr>
-      <w:r>
-        <w:t xml:space="preserve">within 0.6 m it says </w:t>
-      </w:r>
-      <w:r>
-        <w:rPr>
-          <w:i/>
-        </w:rPr>
-        <w:t>"Polo! Within reach, …"</w:t>
-      </w:r>
-      <w:r>
-        <w:t xml:space="preserve"> instead.</w:t>
-      </w:r>
-    </w:p>
-    <w:p>
-      <w:pPr>
-        <w:numPr>
-          <w:ilvl w:val="0"/>
-          <w:numId w:val="939"/>
-        </w:numPr>
-        <w:pStyle w:val="ListParagraph"/>
-      </w:pPr>
-      <w:r>
-        <w:rPr>
-          <w:b/>
-        </w:rPr>
-        <w:t>Beacon:</w:t>
-      </w:r>
-      <w:r>
-        <w:t xml:space="preserve"> beeps from </w:t>
-      </w:r>
-      <w:r>
-        <w:rPr>
-          <w:rFonts w:ascii="Courier New" w:hAnsi="Courier New" w:eastAsia="Courier New" w:cs="Courier New"/>
-          <w:color w:val="374151"/>
-          <w:sz w:val="19"/>
-        </w:rPr>
-        <w:t>position</w:t>
-      </w:r>
-      <w:r>
-        <w:t xml:space="preserve">, rendered relative to the </w:t>
-      </w:r>
-      <w:r>
-        <w:rPr>
-          <w:b/>
-        </w:rPr>
-        <w:t>head</w:t>
-      </w:r>
-      <w:r>
-        <w:t xml:space="preserve"> (fused yaw). They're muffled and lower while the item is behind the head (|relative azimuth| more than 90°).</w:t>
-      </w:r>
-    </w:p>
-    <w:p>
-      <w:pPr>
-        <w:numPr>
-          <w:ilvl w:val="0"/>
-          <w:numId w:val="939"/>
-        </w:numPr>
-        <w:pStyle w:val="ListParagraph"/>
-      </w:pPr>
-      <w:r>
-        <w:rPr>
-          <w:b/>
-        </w:rPr>
-        <w:t>Facing</w:t>
-      </w:r>
-      <w:r>
-        <w:t xml:space="preserve"> (|relative azimuth| 12° or less): a double ding plus a haptic, once per lock. The lock releases past 20°.</w:t>
-      </w:r>
-    </w:p>
-    <w:p>
-      <w:pPr>
-        <w:numPr>
-          <w:ilvl w:val="0"/>
-          <w:numId w:val="939"/>
-        </w:numPr>
-        <w:pStyle w:val="ListParagraph"/>
-      </w:pPr>
-      <w:r>
-        <w:rPr>
-          <w:b/>
-        </w:rPr>
-        <w:t>Walking:</w:t>
-      </w:r>
-      <w:r>
-        <w:t xml:space="preserve"> the gap between beeps = clamp(0.15 + 0.35 × distance, 0.15, 1.0) s. </w:t>
-      </w:r>
-      <w:r>
-        <w:rPr>
-          <w:i/>
-        </w:rPr>
-        <w:t>"Within reach, on the {surface}"</w:t>
-      </w:r>
-      <w:r>
-        <w:t xml:space="preserve"> is said once at 0.6 m (POC 5).</w:t>
-      </w:r>
-    </w:p>
-    <w:p>
-      <w:pPr>
-        <w:numPr>
-          <w:ilvl w:val="0"/>
-          <w:numId w:val="939"/>
-        </w:numPr>
-        <w:pStyle w:val="ListParagraph"/>
-      </w:pPr>
-      <w:r>
-        <w:rPr>
-          <w:b/>
-        </w:rPr>
-        <w:t>Steady tone</w:t>
-      </w:r>
-      <w:r>
-        <w:t xml:space="preserve"> once </w:t>
-      </w:r>
-      <w:r>
-        <w:rPr>
-          <w:rFonts w:ascii="Courier New" w:hAnsi="Courier New" w:eastAsia="Courier New" w:cs="Courier New"/>
-          <w:color w:val="374151"/>
-          <w:sz w:val="19"/>
-        </w:rPr>
-        <w:t>hand_proximity.distance_m</w:t>
-      </w:r>
-      <w:r>
-        <w:t xml:space="preserve"> is 0.30 or less. It releases above 0.40, or when proximity is older than 0.5 s.</w:t>
-      </w:r>
-    </w:p>
-    <w:p>
-      <w:pPr>
-        <w:numPr>
-          <w:ilvl w:val="0"/>
-          <w:numId w:val="939"/>
-        </w:numPr>
-        <w:pStyle w:val="ListParagraph"/>
-      </w:pPr>
-      <w:r>
-        <w:rPr>
-          <w:b/>
-        </w:rPr>
-        <w:t>On `touch` for that item:</w:t>
-      </w:r>
-      <w:r>
-        <w:t xml:space="preserve"> silence, then the item's typed label or </w:t>
-      </w:r>
-      <w:r>
-        <w:rPr>
-          <w:i/>
-        </w:rPr>
-        <w:t>"Got it."</w:t>
-      </w:r>
-      <w:r>
-        <w:t xml:space="preserve"> through §3.5. The phone's guidance sequence does not wait for cloud speech.</w:t>
-      </w:r>
-    </w:p>
-    <w:p>
-      <w:r>
-        <w:t xml:space="preserve">If an </w:t>
-      </w:r>
-      <w:r>
-        <w:rPr>
-          <w:rFonts w:ascii="Courier New" w:hAnsi="Courier New" w:eastAsia="Courier New" w:cs="Courier New"/>
-          <w:color w:val="374151"/>
-          <w:sz w:val="19"/>
-        </w:rPr>
-        <w:t>event moved</w:t>
-      </w:r>
-      <w:r>
-        <w:t xml:space="preserve"> (or </w:t>
-      </w:r>
-      <w:r>
-        <w:rPr>
-          <w:rFonts w:ascii="Courier New" w:hAnsi="Courier New" w:eastAsia="Courier New" w:cs="Courier New"/>
-          <w:color w:val="374151"/>
-          <w:sz w:val="19"/>
-        </w:rPr>
-        <w:t>put_down</w:t>
-      </w:r>
-      <w:r>
-        <w:t xml:space="preserve">) arrives for the target, retarget to its new </w:t>
-      </w:r>
-      <w:r>
-        <w:rPr>
-          <w:rFonts w:ascii="Courier New" w:hAnsi="Courier New" w:eastAsia="Courier New" w:cs="Courier New"/>
-          <w:color w:val="374151"/>
-          <w:sz w:val="19"/>
-        </w:rPr>
-        <w:t>position</w:t>
-      </w:r>
-      <w:r>
-        <w:t>.</w:t>
-      </w:r>
-    </w:p>
-    <w:p>
-      <w:pPr>
-        <w:pStyle w:val="Heading1"/>
-      </w:pPr>
-      <w:r>
-        <w:t>8. What each person needs from the others</w:t>
-      </w:r>
-    </w:p>
-    <w:p>
-      <w:r>
-        <w:rPr>
-          <w:b/>
-        </w:rPr>
-        <w:t>Vedant needs from Utkarsh:</w:t>
       </w:r>
     </w:p>
     <w:p>
@@ -6333,7 +6428,99 @@
         <w:pStyle w:val="ListParagraph"/>
       </w:pPr>
       <w:r>
-        <w:t>The frame upload (§3.1).</w:t>
+        <w:rPr>
+          <w:b/>
+        </w:rPr>
+        <w:t>The answer arrives.</w:t>
+      </w:r>
+      <w:r>
+        <w:t xml:space="preserve"> The phone speaks </w:t>
+      </w:r>
+      <w:r>
+        <w:rPr>
+          <w:i/>
+        </w:rPr>
+        <w:t>"Polo! Behind you, two steps, on the table,"</w:t>
+      </w:r>
+      <w:r>
+        <w:t xml:space="preserve"> spatialised at </w:t>
+      </w:r>
+      <w:r>
+        <w:rPr>
+          <w:rFonts w:ascii="Courier New" w:hAnsi="Courier New" w:eastAsia="Courier New" w:cs="Courier New"/>
+          <w:color w:val="374151"/>
+          <w:sz w:val="19"/>
+        </w:rPr>
+        <w:t>position</w:t>
+      </w:r>
+      <w:r>
+        <w:t>:</w:t>
+      </w:r>
+    </w:p>
+    <w:p>
+      <w:pPr>
+        <w:numPr>
+          <w:ilvl w:val="1"/>
+          <w:numId w:val="942"/>
+        </w:numPr>
+        <w:pStyle w:val="ListParagraph"/>
+      </w:pPr>
+      <w:r>
+        <w:t xml:space="preserve">the direction is relative to the </w:t>
+      </w:r>
+      <w:r>
+        <w:rPr>
+          <w:b/>
+        </w:rPr>
+        <w:t>body</w:t>
+      </w:r>
+      <w:r>
+        <w:t xml:space="preserve"> (chest heading), because "behind you" means behind your body;</w:t>
+      </w:r>
+    </w:p>
+    <w:p>
+      <w:pPr>
+        <w:numPr>
+          <w:ilvl w:val="1"/>
+          <w:numId w:val="942"/>
+        </w:numPr>
+        <w:pStyle w:val="ListParagraph"/>
+      </w:pPr>
+      <w:r>
+        <w:t>clock position = round(relative azimuth / 30°), where 12 o'clock means ahead; 12, 3, 6 and 9 are said as "straight ahead", "on your right", "behind you" and "on your left";</w:t>
+      </w:r>
+    </w:p>
+    <w:p>
+      <w:pPr>
+        <w:numPr>
+          <w:ilvl w:val="1"/>
+          <w:numId w:val="942"/>
+        </w:numPr>
+        <w:pStyle w:val="ListParagraph"/>
+      </w:pPr>
+      <w:r>
+        <w:t>steps = round(horizontal distance / 0.7 m), at least one;</w:t>
+      </w:r>
+    </w:p>
+    <w:p>
+      <w:pPr>
+        <w:numPr>
+          <w:ilvl w:val="1"/>
+          <w:numId w:val="942"/>
+        </w:numPr>
+        <w:pStyle w:val="ListParagraph"/>
+      </w:pPr>
+      <w:r>
+        <w:t xml:space="preserve">within 0.6 m it says </w:t>
+      </w:r>
+      <w:r>
+        <w:rPr>
+          <w:i/>
+        </w:rPr>
+        <w:t>"Polo! Within reach, …"</w:t>
+      </w:r>
+      <w:r>
+        <w:t xml:space="preserve"> instead.</w:t>
       </w:r>
     </w:p>
     <w:p>
@@ -6345,7 +6532,33 @@
         <w:pStyle w:val="ListParagraph"/>
       </w:pPr>
       <w:r>
-        <w:t>The pose stream and the hand stream (§3.2).</w:t>
+        <w:rPr>
+          <w:b/>
+        </w:rPr>
+        <w:t>Beacon:</w:t>
+      </w:r>
+      <w:r>
+        <w:t xml:space="preserve"> beeps from </w:t>
+      </w:r>
+      <w:r>
+        <w:rPr>
+          <w:rFonts w:ascii="Courier New" w:hAnsi="Courier New" w:eastAsia="Courier New" w:cs="Courier New"/>
+          <w:color w:val="374151"/>
+          <w:sz w:val="19"/>
+        </w:rPr>
+        <w:t>position</w:t>
+      </w:r>
+      <w:r>
+        <w:t xml:space="preserve">, rendered relative to the </w:t>
+      </w:r>
+      <w:r>
+        <w:rPr>
+          <w:b/>
+        </w:rPr>
+        <w:t>head</w:t>
+      </w:r>
+      <w:r>
+        <w:t xml:space="preserve"> (fused yaw). They're muffled and lower while the item is behind the head (|relative azimuth| more than 90°).</w:t>
       </w:r>
     </w:p>
     <w:p>
@@ -6357,18 +6570,13 @@
         <w:pStyle w:val="ListParagraph"/>
       </w:pPr>
       <w:r>
-        <w:t xml:space="preserve">The </w:t>
-      </w:r>
-      <w:r>
-        <w:rPr>
-          <w:rFonts w:ascii="Courier New" w:hAnsi="Courier New" w:eastAsia="Courier New" w:cs="Courier New"/>
-          <w:color w:val="374151"/>
-          <w:sz w:val="19"/>
-        </w:rPr>
-        <w:t>map</w:t>
-      </w:r>
-      <w:r>
-        <w:t xml:space="preserve"> messages (§3.4).</w:t>
+        <w:rPr>
+          <w:b/>
+        </w:rPr>
+        <w:t>Facing</w:t>
+      </w:r>
+      <w:r>
+        <w:t xml:space="preserve"> (|relative azimuth| 12° or less): a double ding plus a haptic, once per lock. The lock releases past 20°.</w:t>
       </w:r>
     </w:p>
     <w:p>
@@ -6380,19 +6588,40 @@
         <w:pStyle w:val="ListParagraph"/>
       </w:pPr>
       <w:r>
-        <w:t>A 5-minute recorded session saved to disk in exactly these formats (frames, poses, hands), so Vedant can build against real data before the app is finished.</w:t>
+        <w:rPr>
+          <w:b/>
+        </w:rPr>
+        <w:t>Walking:</w:t>
+      </w:r>
+      <w:r>
+        <w:t xml:space="preserve"> the gap between beeps = clamp(0.15 + 0.35 × distance, 0.15, 1.0) s. </w:t>
+      </w:r>
+      <w:r>
+        <w:rPr>
+          <w:i/>
+        </w:rPr>
+        <w:t>"Within reach, on the {surface}"</w:t>
+      </w:r>
+      <w:r>
+        <w:t xml:space="preserve"> is said once at 0.6 m (POC 5).</w:t>
       </w:r>
     </w:p>
     <w:p>
       <w:pPr>
         <w:numPr>
-          <w:ilvl w:val="1"/>
-          <w:numId w:val="942"/>
+          <w:ilvl w:val="0"/>
+          <w:numId w:val="941"/>
         </w:numPr>
         <w:pStyle w:val="ListParagraph"/>
       </w:pPr>
       <w:r>
-        <w:t xml:space="preserve">The server records every session it receives under </w:t>
+        <w:rPr>
+          <w:b/>
+        </w:rPr>
+        <w:t>Steady tone</w:t>
+      </w:r>
+      <w:r>
+        <w:t xml:space="preserve"> once </w:t>
       </w:r>
       <w:r>
         <w:rPr>
@@ -6400,22 +6629,42 @@
           <w:color w:val="374151"/>
           <w:sz w:val="19"/>
         </w:rPr>
-        <w:t>server/data/sessions/&lt;session_id&gt;/</w:t>
-      </w:r>
-      <w:r>
-        <w:t>. Running the app against the server is enough.</w:t>
+        <w:t>hand_proximity.distance_m</w:t>
+      </w:r>
+      <w:r>
+        <w:t xml:space="preserve"> is 0.30 or less. It releases above 0.40, or when proximity is older than 0.5 s.</w:t>
       </w:r>
     </w:p>
     <w:p>
       <w:pPr>
         <w:numPr>
-          <w:ilvl w:val="1"/>
-          <w:numId w:val="942"/>
+          <w:ilvl w:val="0"/>
+          <w:numId w:val="941"/>
         </w:numPr>
         <w:pStyle w:val="ListParagraph"/>
       </w:pPr>
       <w:r>
-        <w:t xml:space="preserve">Until then, a Stray Scanner recording converts with </w:t>
+        <w:rPr>
+          <w:b/>
+        </w:rPr>
+        <w:t>On `touch` for that item:</w:t>
+      </w:r>
+      <w:r>
+        <w:t xml:space="preserve"> silence, then the item's typed label or </w:t>
+      </w:r>
+      <w:r>
+        <w:rPr>
+          <w:i/>
+        </w:rPr>
+        <w:t>"Got it."</w:t>
+      </w:r>
+      <w:r>
+        <w:t xml:space="preserve"> through §3.5. The phone's guidance sequence does not wait for cloud speech.</w:t>
+      </w:r>
+    </w:p>
+    <w:p>
+      <w:r>
+        <w:t xml:space="preserve">If an </w:t>
       </w:r>
       <w:r>
         <w:rPr>
@@ -6423,18 +6672,48 @@
           <w:color w:val="374151"/>
           <w:sz w:val="19"/>
         </w:rPr>
-        <w:t>server/tools/stray_session.py</w:t>
+        <w:t>event moved</w:t>
+      </w:r>
+      <w:r>
+        <w:t xml:space="preserve"> (or </w:t>
+      </w:r>
+      <w:r>
+        <w:rPr>
+          <w:rFonts w:ascii="Courier New" w:hAnsi="Courier New" w:eastAsia="Courier New" w:cs="Courier New"/>
+          <w:color w:val="374151"/>
+          <w:sz w:val="19"/>
+        </w:rPr>
+        <w:t>put_down</w:t>
+      </w:r>
+      <w:r>
+        <w:t xml:space="preserve">) arrives for the target, retarget to its new </w:t>
+      </w:r>
+      <w:r>
+        <w:rPr>
+          <w:rFonts w:ascii="Courier New" w:hAnsi="Courier New" w:eastAsia="Courier New" w:cs="Courier New"/>
+          <w:color w:val="374151"/>
+          <w:sz w:val="19"/>
+        </w:rPr>
+        <w:t>position</w:t>
       </w:r>
       <w:r>
         <w:t>.</w:t>
       </w:r>
     </w:p>
     <w:p>
+      <w:pPr>
+        <w:pStyle w:val="Heading1"/>
+      </w:pPr>
+      <w:r>
+        <w:t>8. What each person needs from the others</w:t>
+      </w:r>
+    </w:p>
+    <w:p>
       <w:r>
         <w:rPr>
           <w:b/>
         </w:rPr>
-        <w:t>Utkarsh needs from Vedant:</w:t>
+        <w:t>Vedant needs from Utkarsh:</w:t>
       </w:r>
     </w:p>
     <w:p>
@@ -6446,51 +6725,7 @@
         <w:pStyle w:val="ListParagraph"/>
       </w:pPr>
       <w:r>
-        <w:t xml:space="preserve">A stub server that accepts everything above and returns fake </w:t>
-      </w:r>
-      <w:r>
-        <w:rPr>
-          <w:rFonts w:ascii="Courier New" w:hAnsi="Courier New" w:eastAsia="Courier New" w:cs="Courier New"/>
-          <w:color w:val="374151"/>
-          <w:sz w:val="19"/>
-        </w:rPr>
-        <w:t>answer</w:t>
-      </w:r>
-      <w:r>
-        <w:t xml:space="preserve"> / </w:t>
-      </w:r>
-      <w:r>
-        <w:rPr>
-          <w:rFonts w:ascii="Courier New" w:hAnsi="Courier New" w:eastAsia="Courier New" w:cs="Courier New"/>
-          <w:color w:val="374151"/>
-          <w:sz w:val="19"/>
-        </w:rPr>
-        <w:t>touch</w:t>
-      </w:r>
-      <w:r>
-        <w:t xml:space="preserve"> / </w:t>
-      </w:r>
-      <w:r>
-        <w:rPr>
-          <w:rFonts w:ascii="Courier New" w:hAnsi="Courier New" w:eastAsia="Courier New" w:cs="Courier New"/>
-          <w:color w:val="374151"/>
-          <w:sz w:val="19"/>
-        </w:rPr>
-        <w:t>event</w:t>
-      </w:r>
-      <w:r>
-        <w:t xml:space="preserve"> messages (</w:t>
-      </w:r>
-      <w:r>
-        <w:rPr>
-          <w:rFonts w:ascii="Courier New" w:hAnsi="Courier New" w:eastAsia="Courier New" w:cs="Courier New"/>
-          <w:color w:val="374151"/>
-          <w:sz w:val="19"/>
-        </w:rPr>
-        <w:t>MARCO_MODE=stub</w:t>
-      </w:r>
-      <w:r>
-        <w:t>, the default).</w:t>
+        <w:t>The frame upload (§3.1).</w:t>
       </w:r>
     </w:p>
     <w:p>
@@ -6502,18 +6737,7 @@
         <w:pStyle w:val="ListParagraph"/>
       </w:pPr>
       <w:r>
-        <w:t>Then the real ones (</w:t>
-      </w:r>
-      <w:r>
-        <w:rPr>
-          <w:rFonts w:ascii="Courier New" w:hAnsi="Courier New" w:eastAsia="Courier New" w:cs="Courier New"/>
-          <w:color w:val="374151"/>
-          <w:sz w:val="19"/>
-        </w:rPr>
-        <w:t>MARCO_MODE=real</w:t>
-      </w:r>
-      <w:r>
-        <w:t>).</w:t>
+        <w:t>The pose stream and the hand stream (§3.2).</w:t>
       </w:r>
     </w:p>
     <w:p>
@@ -6525,7 +6749,18 @@
         <w:pStyle w:val="ListParagraph"/>
       </w:pPr>
       <w:r>
-        <w:t>Typed labels and the speech route (§3.5). Legacy label audio URLs remain optional compatibility fields.</w:t>
+        <w:t xml:space="preserve">The </w:t>
+      </w:r>
+      <w:r>
+        <w:rPr>
+          <w:rFonts w:ascii="Courier New" w:hAnsi="Courier New" w:eastAsia="Courier New" w:cs="Courier New"/>
+          <w:color w:val="374151"/>
+          <w:sz w:val="19"/>
+        </w:rPr>
+        <w:t>map</w:t>
+      </w:r>
+      <w:r>
+        <w:t xml:space="preserve"> messages (§3.4).</w:t>
       </w:r>
     </w:p>
     <w:p>
@@ -6537,35 +6772,42 @@
         <w:pStyle w:val="ListParagraph"/>
       </w:pPr>
       <w:r>
+        <w:t>A 5-minute recorded session saved to disk in exactly these formats (frames, poses, hands), so Vedant can build against real data before the app is finished.</w:t>
+      </w:r>
+    </w:p>
+    <w:p>
+      <w:pPr>
+        <w:numPr>
+          <w:ilvl w:val="1"/>
+          <w:numId w:val="944"/>
+        </w:numPr>
+        <w:pStyle w:val="ListParagraph"/>
+      </w:pPr>
+      <w:r>
+        <w:t xml:space="preserve">The server records every session it receives under </w:t>
+      </w:r>
+      <w:r>
         <w:rPr>
           <w:rFonts w:ascii="Courier New" w:hAnsi="Courier New" w:eastAsia="Courier New" w:cs="Courier New"/>
           <w:color w:val="374151"/>
           <w:sz w:val="19"/>
         </w:rPr>
-        <w:t>label_request</w:t>
-      </w:r>
-      <w:r>
-        <w:t xml:space="preserve"> events for Photon.</w:t>
+        <w:t>server/data/sessions/&lt;session_id&gt;/</w:t>
+      </w:r>
+      <w:r>
+        <w:t>. Running the app against the server is enough.</w:t>
       </w:r>
     </w:p>
     <w:p>
-      <w:r>
-        <w:rPr>
-          <w:b/>
-        </w:rPr>
-        <w:t>The dashboard needs from Vedant:</w:t>
-      </w:r>
-    </w:p>
-    <w:p>
       <w:pPr>
         <w:numPr>
-          <w:ilvl w:val="0"/>
+          <w:ilvl w:val="1"/>
           <w:numId w:val="944"/>
         </w:numPr>
         <w:pStyle w:val="ListParagraph"/>
       </w:pPr>
       <w:r>
-        <w:t xml:space="preserve">the </w:t>
+        <w:t xml:space="preserve">Until then, a Stray Scanner recording converts with </w:t>
       </w:r>
       <w:r>
         <w:rPr>
@@ -6573,21 +6815,10 @@
           <w:color w:val="374151"/>
           <w:sz w:val="19"/>
         </w:rPr>
-        <w:t>/v1/dashboard</w:t>
-      </w:r>
-      <w:r>
-        <w:t xml:space="preserve"> feed with recorded or fake data first (</w:t>
-      </w:r>
-      <w:r>
-        <w:rPr>
-          <w:rFonts w:ascii="Courier New" w:hAnsi="Courier New" w:eastAsia="Courier New" w:cs="Courier New"/>
-          <w:color w:val="374151"/>
-          <w:sz w:val="19"/>
-        </w:rPr>
-        <w:t>server/tools/replay.py</w:t>
-      </w:r>
-      <w:r>
-        <w:t>), then live.</w:t>
+        <w:t>server/tools/stray_session.py</w:t>
+      </w:r>
+      <w:r>
+        <w:t>.</w:t>
       </w:r>
     </w:p>
     <w:p>
@@ -6595,10 +6826,7 @@
         <w:rPr>
           <w:b/>
         </w:rPr>
-        <w:t>Everyone:</w:t>
-      </w:r>
-      <w:r>
-        <w:t xml:space="preserve"> the server is private:</w:t>
+        <w:t>Utkarsh needs from Vedant:</w:t>
       </w:r>
     </w:p>
     <w:p>
@@ -6610,7 +6838,7 @@
         <w:pStyle w:val="ListParagraph"/>
       </w:pPr>
       <w:r>
-        <w:t xml:space="preserve">it binds 127.0.0.1 only and is reached through </w:t>
+        <w:t xml:space="preserve">A stub server that accepts everything above and returns fake </w:t>
       </w:r>
       <w:r>
         <w:rPr>
@@ -6618,10 +6846,43 @@
           <w:color w:val="374151"/>
           <w:sz w:val="19"/>
         </w:rPr>
-        <w:t>tailscale serve</w:t>
-      </w:r>
-      <w:r>
-        <w:t>;</w:t>
+        <w:t>answer</w:t>
+      </w:r>
+      <w:r>
+        <w:t xml:space="preserve"> / </w:t>
+      </w:r>
+      <w:r>
+        <w:rPr>
+          <w:rFonts w:ascii="Courier New" w:hAnsi="Courier New" w:eastAsia="Courier New" w:cs="Courier New"/>
+          <w:color w:val="374151"/>
+          <w:sz w:val="19"/>
+        </w:rPr>
+        <w:t>touch</w:t>
+      </w:r>
+      <w:r>
+        <w:t xml:space="preserve"> / </w:t>
+      </w:r>
+      <w:r>
+        <w:rPr>
+          <w:rFonts w:ascii="Courier New" w:hAnsi="Courier New" w:eastAsia="Courier New" w:cs="Courier New"/>
+          <w:color w:val="374151"/>
+          <w:sz w:val="19"/>
+        </w:rPr>
+        <w:t>event</w:t>
+      </w:r>
+      <w:r>
+        <w:t xml:space="preserve"> messages (</w:t>
+      </w:r>
+      <w:r>
+        <w:rPr>
+          <w:rFonts w:ascii="Courier New" w:hAnsi="Courier New" w:eastAsia="Courier New" w:cs="Courier New"/>
+          <w:color w:val="374151"/>
+          <w:sz w:val="19"/>
+        </w:rPr>
+        <w:t>MARCO_MODE=stub</w:t>
+      </w:r>
+      <w:r>
+        <w:t>, the default).</w:t>
       </w:r>
     </w:p>
     <w:p>
@@ -6633,7 +6894,7 @@
         <w:pStyle w:val="ListParagraph"/>
       </w:pPr>
       <w:r>
-        <w:t>every route goes through the fail-closed auth gate (</w:t>
+        <w:t>Then the real ones (</w:t>
       </w:r>
       <w:r>
         <w:rPr>
@@ -6641,29 +6902,50 @@
           <w:color w:val="374151"/>
           <w:sz w:val="19"/>
         </w:rPr>
-        <w:t>server/marco/auth.py</w:t>
-      </w:r>
-      <w:r>
-        <w:t xml:space="preserve">), which admits only </w:t>
-      </w:r>
+        <w:t>MARCO_MODE=real</w:t>
+      </w:r>
+      <w:r>
+        <w:t>).</w:t>
+      </w:r>
+    </w:p>
+    <w:p>
+      <w:pPr>
+        <w:numPr>
+          <w:ilvl w:val="0"/>
+          <w:numId w:val="945"/>
+        </w:numPr>
+        <w:pStyle w:val="ListParagraph"/>
+      </w:pPr>
+      <w:r>
+        <w:t>Typed labels and the speech route (§3.5). Legacy label audio URLs remain optional compatibility fields.</w:t>
+      </w:r>
+    </w:p>
+    <w:p>
+      <w:pPr>
+        <w:numPr>
+          <w:ilvl w:val="0"/>
+          <w:numId w:val="945"/>
+        </w:numPr>
+        <w:pStyle w:val="ListParagraph"/>
+      </w:pPr>
       <w:r>
         <w:rPr>
           <w:rFonts w:ascii="Courier New" w:hAnsi="Courier New" w:eastAsia="Courier New" w:cs="Courier New"/>
           <w:color w:val="374151"/>
           <w:sz w:val="19"/>
         </w:rPr>
-        <w:t>TAILSCALE_ALLOWED_LOGINS</w:t>
-      </w:r>
-      <w:r>
-        <w:t>.</w:t>
+        <w:t>label_request</w:t>
+      </w:r>
+      <w:r>
+        <w:t xml:space="preserve"> events for Photon.</w:t>
       </w:r>
     </w:p>
     <w:p>
-      <w:pPr>
-        <w:pStyle w:val="Heading1"/>
-      </w:pPr>
-      <w:r>
-        <w:t>9. Integration order</w:t>
+      <w:r>
+        <w:rPr>
+          <w:b/>
+        </w:rPr>
+        <w:t>The dashboard needs from Vedant:</w:t>
       </w:r>
     </w:p>
     <w:p>
@@ -6675,108 +6957,105 @@
         <w:pStyle w:val="ListParagraph"/>
       </w:pPr>
       <w:r>
-        <w:rPr>
-          <w:b/>
-        </w:rPr>
-        <w:t>Hour 0–2:</w:t>
-      </w:r>
-      <w:r>
-        <w:t xml:space="preserve"> agree this file. Vedant ships the stub server; Utkarsh gets the ARKit session and frame upload working; the dashboard renders fake feeds.</w:t>
+        <w:t xml:space="preserve">the </w:t>
+      </w:r>
+      <w:r>
+        <w:rPr>
+          <w:rFonts w:ascii="Courier New" w:hAnsi="Courier New" w:eastAsia="Courier New" w:cs="Courier New"/>
+          <w:color w:val="374151"/>
+          <w:sz w:val="19"/>
+        </w:rPr>
+        <w:t>/v1/dashboard</w:t>
+      </w:r>
+      <w:r>
+        <w:t xml:space="preserve"> feed with recorded or fake data first (</w:t>
+      </w:r>
+      <w:r>
+        <w:rPr>
+          <w:rFonts w:ascii="Courier New" w:hAnsi="Courier New" w:eastAsia="Courier New" w:cs="Courier New"/>
+          <w:color w:val="374151"/>
+          <w:sz w:val="19"/>
+        </w:rPr>
+        <w:t>server/tools/replay.py</w:t>
+      </w:r>
+      <w:r>
+        <w:t>), then live.</w:t>
       </w:r>
     </w:p>
     <w:p>
+      <w:r>
+        <w:rPr>
+          <w:b/>
+        </w:rPr>
+        <w:t>Everyone:</w:t>
+      </w:r>
+      <w:r>
+        <w:t xml:space="preserve"> the server is private:</w:t>
+      </w:r>
+    </w:p>
+    <w:p>
       <w:pPr>
         <w:numPr>
           <w:ilvl w:val="0"/>
-          <w:numId w:val="946"/>
-        </w:numPr>
-        <w:pStyle w:val="ListParagraph"/>
-      </w:pPr>
-      <w:r>
-        <w:rPr>
-          <w:b/>
-        </w:rPr>
-        <w:t>Then:</w:t>
-      </w:r>
-      <w:r>
-        <w:t xml:space="preserve"> the recorded 5-minute session from the vest. Vedant runs the real pipeline on it offline; the dashboard replays it.</w:t>
-      </w:r>
-    </w:p>
-    <w:p>
-      <w:pPr>
-        <w:numPr>
-          <w:ilvl w:val="0"/>
-          <w:numId w:val="946"/>
-        </w:numPr>
-        <w:pStyle w:val="ListParagraph"/>
-      </w:pPr>
-      <w:r>
-        <w:rPr>
-          <w:b/>
-        </w:rPr>
-        <w:t>First live path:</w:t>
-      </w:r>
-      <w:r>
-        <w:t xml:space="preserve"> register keys, put them down, ask "where are my keys?", and follow the sound to them, end to end.</w:t>
-      </w:r>
-    </w:p>
-    <w:p>
-      <w:pPr>
-        <w:numPr>
-          <w:ilvl w:val="0"/>
-          <w:numId w:val="946"/>
-        </w:numPr>
-        <w:pStyle w:val="ListParagraph"/>
-      </w:pPr>
-      <w:r>
-        <w:rPr>
-          <w:b/>
-        </w:rPr>
-        <w:t>Then:</w:t>
-      </w:r>
-    </w:p>
-    <w:p>
-      <w:pPr>
-        <w:numPr>
-          <w:ilvl w:val="1"/>
           <w:numId w:val="947"/>
         </w:numPr>
         <w:pStyle w:val="ListParagraph"/>
       </w:pPr>
       <w:r>
-        <w:t>touch and "what is this?" with Photon labeling;</w:t>
+        <w:t xml:space="preserve">it binds 127.0.0.1 only and is reached through </w:t>
+      </w:r>
+      <w:r>
+        <w:rPr>
+          <w:rFonts w:ascii="Courier New" w:hAnsi="Courier New" w:eastAsia="Courier New" w:cs="Courier New"/>
+          <w:color w:val="374151"/>
+          <w:sz w:val="19"/>
+        </w:rPr>
+        <w:t>tailscale serve</w:t>
+      </w:r>
+      <w:r>
+        <w:t>;</w:t>
       </w:r>
     </w:p>
     <w:p>
       <w:pPr>
         <w:numPr>
-          <w:ilvl w:val="1"/>
+          <w:ilvl w:val="0"/>
           <w:numId w:val="947"/>
         </w:numPr>
         <w:pStyle w:val="ListParagraph"/>
       </w:pPr>
       <w:r>
-        <w:t>moved and left-behind events;</w:t>
+        <w:t>every route goes through the fail-closed auth gate (</w:t>
+      </w:r>
+      <w:r>
+        <w:rPr>
+          <w:rFonts w:ascii="Courier New" w:hAnsi="Courier New" w:eastAsia="Courier New" w:cs="Courier New"/>
+          <w:color w:val="374151"/>
+          <w:sz w:val="19"/>
+        </w:rPr>
+        <w:t>server/marco/auth.py</w:t>
+      </w:r>
+      <w:r>
+        <w:t xml:space="preserve">), which admits only </w:t>
+      </w:r>
+      <w:r>
+        <w:rPr>
+          <w:rFonts w:ascii="Courier New" w:hAnsi="Courier New" w:eastAsia="Courier New" w:cs="Courier New"/>
+          <w:color w:val="374151"/>
+          <w:sz w:val="19"/>
+        </w:rPr>
+        <w:t>TAILSCALE_ALLOWED_LOGINS</w:t>
+      </w:r>
+      <w:r>
+        <w:t>.</w:t>
       </w:r>
     </w:p>
     <w:p>
       <w:pPr>
-        <w:numPr>
-          <w:ilvl w:val="1"/>
-          <w:numId w:val="947"/>
-        </w:numPr>
-        <w:pStyle w:val="ListParagraph"/>
-      </w:pPr>
-      <w:r>
-        <w:t>relaunch persistence.</w:t>
-      </w:r>
-    </w:p>
-    <w:p>
-      <w:pPr>
         <w:pStyle w:val="Heading1"/>
       </w:pPr>
       <w:r>
-        <w:t>10. Open questions (decide together)</w:t>
+        <w:t>9. Integration order</w:t>
       </w:r>
     </w:p>
     <w:p>
@@ -6791,32 +7070,10 @@
         <w:rPr>
           <w:b/>
         </w:rPr>
-        <w:t>Vision orientation:</w:t>
-      </w:r>
-      <w:r>
-        <w:t xml:space="preserve"> </w:t>
-      </w:r>
-      <w:r>
-        <w:rPr>
-          <w:rFonts w:ascii="Courier New" w:hAnsi="Courier New" w:eastAsia="Courier New" w:cs="Courier New"/>
-          <w:color w:val="374151"/>
-          <w:sz w:val="19"/>
-        </w:rPr>
-        <w:t>.up</w:t>
-      </w:r>
-      <w:r>
-        <w:t xml:space="preserve"> versus </w:t>
-      </w:r>
-      <w:r>
-        <w:rPr>
-          <w:rFonts w:ascii="Courier New" w:hAnsi="Courier New" w:eastAsia="Courier New" w:cs="Courier New"/>
-          <w:color w:val="374151"/>
-          <w:sz w:val="19"/>
-        </w:rPr>
-        <w:t>.right</w:t>
-      </w:r>
-      <w:r>
-        <w:t xml:space="preserve"> for the hand pose. Test in hour one.</w:t>
+        <w:t>Hour 0–2:</w:t>
+      </w:r>
+      <w:r>
+        <w:t xml:space="preserve"> agree this file. Vedant ships the stub server; Utkarsh gets the ARKit session and frame upload working; the dashboard renders fake feeds.</w:t>
       </w:r>
     </w:p>
     <w:p>
@@ -6831,32 +7088,10 @@
         <w:rPr>
           <w:b/>
         </w:rPr>
-        <w:t>Where the server runs: decided (2026-10-17).</w:t>
-      </w:r>
-      <w:r>
-        <w:t xml:space="preserve"> The Vultr GPU box (</w:t>
-      </w:r>
-      <w:r>
-        <w:rPr>
-          <w:rFonts w:ascii="Courier New" w:hAnsi="Courier New" w:eastAsia="Courier New" w:cs="Courier New"/>
-          <w:color w:val="374151"/>
-          <w:sz w:val="19"/>
-        </w:rPr>
-        <w:t>deploy/vultr/</w:t>
-      </w:r>
-      <w:r>
-        <w:t xml:space="preserve">, </w:t>
-      </w:r>
-      <w:r>
-        <w:rPr>
-          <w:rFonts w:ascii="Courier New" w:hAnsi="Courier New" w:eastAsia="Courier New" w:cs="Courier New"/>
-          <w:color w:val="374151"/>
-          <w:sz w:val="19"/>
-        </w:rPr>
-        <w:t>marco-gpu</w:t>
-      </w:r>
-      <w:r>
-        <w:t>) is the primary server; a laptop at the venue is the fallback. Nothing in this contract changes: clients only change the base URL.</w:t>
+        <w:t>Then:</w:t>
+      </w:r>
+      <w:r>
+        <w:t xml:space="preserve"> the recorded 5-minute session from the vest. Vedant runs the real pipeline on it offline; the dashboard replays it.</w:t>
       </w:r>
     </w:p>
     <w:p>
@@ -6871,10 +7106,10 @@
         <w:rPr>
           <w:b/>
         </w:rPr>
-        <w:t>Who names places</w:t>
-      </w:r>
-      <w:r>
-        <w:t xml:space="preserve"> ("entry table"): the server names them by height, or the user names them during setup.</w:t>
+        <w:t>First live path:</w:t>
+      </w:r>
+      <w:r>
+        <w:t xml:space="preserve"> register keys, put them down, ask "where are my keys?", and follow the sound to them, end to end.</w:t>
       </w:r>
     </w:p>
     <w:p>
@@ -6889,32 +7124,7 @@
         <w:rPr>
           <w:b/>
         </w:rPr>
-        <w:t>Photon and dashboard routes.</w:t>
-      </w:r>
-      <w:r>
-        <w:t xml:space="preserve"> </w:t>
-      </w:r>
-      <w:r>
-        <w:rPr>
-          <w:rFonts w:ascii="Courier New" w:hAnsi="Courier New" w:eastAsia="Courier New" w:cs="Courier New"/>
-          <w:color w:val="374151"/>
-          <w:sz w:val="19"/>
-        </w:rPr>
-        <w:t>photon/</w:t>
-      </w:r>
-      <w:r>
-        <w:t xml:space="preserve"> and </w:t>
-      </w:r>
-      <w:r>
-        <w:rPr>
-          <w:rFonts w:ascii="Courier New" w:hAnsi="Courier New" w:eastAsia="Courier New" w:cs="Courier New"/>
-          <w:color w:val="374151"/>
-          <w:sz w:val="19"/>
-        </w:rPr>
-        <w:t>frontend/</w:t>
-      </w:r>
-      <w:r>
-        <w:t xml:space="preserve"> were built against the earlier requirements and POC 26 paths. Status of each:</w:t>
+        <w:t>Then:</w:t>
       </w:r>
     </w:p>
     <w:p>
@@ -6926,68 +7136,7 @@
         <w:pStyle w:val="ListParagraph"/>
       </w:pPr>
       <w:r>
-        <w:rPr>
-          <w:b/>
-        </w:rPr>
-        <w:t>Photon: decided (2026-10-17).</w:t>
-      </w:r>
-      <w:r>
-        <w:t xml:space="preserve"> </w:t>
-      </w:r>
-      <w:r>
-        <w:rPr>
-          <w:rFonts w:ascii="Courier New" w:hAnsi="Courier New" w:eastAsia="Courier New" w:cs="Courier New"/>
-          <w:color w:val="374151"/>
-          <w:sz w:val="19"/>
-        </w:rPr>
-        <w:t>photon/</w:t>
-      </w:r>
-      <w:r>
-        <w:t xml:space="preserve"> adopted §5 as written, on Photon 2.0, with no format changes. The phone never talks to </w:t>
-      </w:r>
-      <w:r>
-        <w:rPr>
-          <w:rFonts w:ascii="Courier New" w:hAnsi="Courier New" w:eastAsia="Courier New" w:cs="Courier New"/>
-          <w:color w:val="374151"/>
-          <w:sz w:val="19"/>
-        </w:rPr>
-        <w:t>photon/</w:t>
-      </w:r>
-      <w:r>
-        <w:t xml:space="preserve">. Two optional additions are proposed in </w:t>
-      </w:r>
-      <w:r>
-        <w:rPr>
-          <w:rFonts w:ascii="Courier New" w:hAnsi="Courier New" w:eastAsia="Courier New" w:cs="Courier New"/>
-          <w:color w:val="374151"/>
-          <w:sz w:val="19"/>
-        </w:rPr>
-        <w:t>STATUS.md</w:t>
-      </w:r>
-      <w:r>
-        <w:t xml:space="preserve"> (</w:t>
-      </w:r>
-      <w:r>
-        <w:rPr>
-          <w:rFonts w:ascii="Courier New" w:hAnsi="Courier New" w:eastAsia="Courier New" w:cs="Courier New"/>
-          <w:color w:val="374151"/>
-          <w:sz w:val="19"/>
-        </w:rPr>
-        <w:t>label_request_seen</w:t>
-      </w:r>
-      <w:r>
-        <w:t xml:space="preserve">, </w:t>
-      </w:r>
-      <w:r>
-        <w:rPr>
-          <w:rFonts w:ascii="Courier New" w:hAnsi="Courier New" w:eastAsia="Courier New" w:cs="Courier New"/>
-          <w:color w:val="374151"/>
-          <w:sz w:val="19"/>
-        </w:rPr>
-        <w:t>label_unknown</w:t>
-      </w:r>
-      <w:r>
-        <w:t>); they are not part of this contract.</w:t>
+        <w:t>touch and "what is this?" with Photon labeling;</w:t>
       </w:r>
     </w:p>
     <w:p>
@@ -6999,65 +7148,27 @@
         <w:pStyle w:val="ListParagraph"/>
       </w:pPr>
       <w:r>
-        <w:rPr>
-          <w:b/>
-        </w:rPr>
-        <w:t>Dashboard: decided (2026-10-18).</w:t>
-      </w:r>
-      <w:r>
-        <w:t xml:space="preserve"> The server serves </w:t>
-      </w:r>
-      <w:r>
-        <w:rPr>
-          <w:rFonts w:ascii="Courier New" w:hAnsi="Courier New" w:eastAsia="Courier New" w:cs="Courier New"/>
-          <w:color w:val="374151"/>
-          <w:sz w:val="19"/>
-        </w:rPr>
-        <w:t>frontend/</w:t>
-      </w:r>
-      <w:r>
-        <w:t xml:space="preserve">'s own contract (§6, </w:t>
-      </w:r>
-      <w:r>
-        <w:rPr>
-          <w:rFonts w:ascii="Courier New" w:hAnsi="Courier New" w:eastAsia="Courier New" w:cs="Courier New"/>
-          <w:color w:val="374151"/>
-          <w:sz w:val="19"/>
-        </w:rPr>
-        <w:t>marco/dashboard.py</w:t>
-      </w:r>
-      <w:r>
-        <w:t xml:space="preserve">). The phone gained </w:t>
-      </w:r>
-      <w:r>
-        <w:rPr>
-          <w:rFonts w:ascii="Courier New" w:hAnsi="Courier New" w:eastAsia="Courier New" w:cs="Courier New"/>
-          <w:color w:val="374151"/>
-          <w:sz w:val="19"/>
-        </w:rPr>
-        <w:t>command</w:t>
-      </w:r>
-      <w:r>
-        <w:t xml:space="preserve"> and </w:t>
-      </w:r>
-      <w:r>
-        <w:rPr>
-          <w:rFonts w:ascii="Courier New" w:hAnsi="Courier New" w:eastAsia="Courier New" w:cs="Courier New"/>
-          <w:color w:val="374151"/>
-          <w:sz w:val="19"/>
-        </w:rPr>
-        <w:t>command_ack</w:t>
-      </w:r>
-      <w:r>
-        <w:t xml:space="preserve"> for Find and Stop.</w:t>
+        <w:t>moved and left-behind events;</w:t>
       </w:r>
     </w:p>
     <w:p>
       <w:pPr>
+        <w:numPr>
+          <w:ilvl w:val="1"/>
+          <w:numId w:val="949"/>
+        </w:numPr>
+        <w:pStyle w:val="ListParagraph"/>
+      </w:pPr>
+      <w:r>
+        <w:t>relaunch persistence.</w:t>
+      </w:r>
+    </w:p>
+    <w:p>
+      <w:pPr>
         <w:pStyle w:val="Heading1"/>
       </w:pPr>
       <w:r>
-        <w:t>11. Changes since v0.1</w:t>
+        <w:t>10. Open questions (decide together)</w:t>
       </w:r>
     </w:p>
     <w:p>
@@ -7072,10 +7183,10 @@
         <w:rPr>
           <w:b/>
         </w:rPr>
-        <w:t>Compression:</w:t>
-      </w:r>
-      <w:r>
-        <w:t xml:space="preserve"> DEFLATE, where raw DEFLATE (Apple's </w:t>
+        <w:t>Vision orientation:</w:t>
+      </w:r>
+      <w:r>
+        <w:t xml:space="preserve"> </w:t>
       </w:r>
       <w:r>
         <w:rPr>
@@ -7083,10 +7194,21 @@
           <w:color w:val="374151"/>
           <w:sz w:val="19"/>
         </w:rPr>
-        <w:t>.zlib</w:t>
-      </w:r>
-      <w:r>
-        <w:t>) and zlib are both accepted.</w:t>
+        <w:t>.up</w:t>
+      </w:r>
+      <w:r>
+        <w:t xml:space="preserve"> versus </w:t>
+      </w:r>
+      <w:r>
+        <w:rPr>
+          <w:rFonts w:ascii="Courier New" w:hAnsi="Courier New" w:eastAsia="Courier New" w:cs="Courier New"/>
+          <w:color w:val="374151"/>
+          <w:sz w:val="19"/>
+        </w:rPr>
+        <w:t>.right</w:t>
+      </w:r>
+      <w:r>
+        <w:t xml:space="preserve"> for the hand pose. Test in hour one.</w:t>
       </w:r>
     </w:p>
     <w:p>
@@ -7101,10 +7223,32 @@
         <w:rPr>
           <w:b/>
         </w:rPr>
-        <w:t>`session_id`</w:t>
-      </w:r>
-      <w:r>
-        <w:t xml:space="preserve"> is on every phone message (hand, guidance, query and map too).</w:t>
+        <w:t>Where the server runs: decided (2026-10-17).</w:t>
+      </w:r>
+      <w:r>
+        <w:t xml:space="preserve"> The Vultr GPU box (</w:t>
+      </w:r>
+      <w:r>
+        <w:rPr>
+          <w:rFonts w:ascii="Courier New" w:hAnsi="Courier New" w:eastAsia="Courier New" w:cs="Courier New"/>
+          <w:color w:val="374151"/>
+          <w:sz w:val="19"/>
+        </w:rPr>
+        <w:t>deploy/vultr/</w:t>
+      </w:r>
+      <w:r>
+        <w:t xml:space="preserve">, </w:t>
+      </w:r>
+      <w:r>
+        <w:rPr>
+          <w:rFonts w:ascii="Courier New" w:hAnsi="Courier New" w:eastAsia="Courier New" w:cs="Courier New"/>
+          <w:color w:val="374151"/>
+          <w:sz w:val="19"/>
+        </w:rPr>
+        <w:t>marco-gpu</w:t>
+      </w:r>
+      <w:r>
+        <w:t>) is the primary server; a laptop at the venue is the fallback. Nothing in this contract changes: clients only change the base URL.</w:t>
       </w:r>
     </w:p>
     <w:p>
@@ -7119,21 +7263,10 @@
         <w:rPr>
           <w:b/>
         </w:rPr>
-        <w:t>Hand message:</w:t>
-      </w:r>
-      <w:r>
-        <w:t xml:space="preserve"> gains </w:t>
-      </w:r>
-      <w:r>
-        <w:rPr>
-          <w:rFonts w:ascii="Courier New" w:hAnsi="Courier New" w:eastAsia="Courier New" w:cs="Courier New"/>
-          <w:color w:val="374151"/>
-          <w:sz w:val="19"/>
-        </w:rPr>
-        <w:t>map_id</w:t>
-      </w:r>
-      <w:r>
-        <w:t>. The server uses the latest frame's intrinsics, and the joint names are spelled out.</w:t>
+        <w:t>Who names places</w:t>
+      </w:r>
+      <w:r>
+        <w:t xml:space="preserve"> ("entry table"): the server names them by height, or the user names them during setup.</w:t>
       </w:r>
     </w:p>
     <w:p>
@@ -7148,7 +7281,7 @@
         <w:rPr>
           <w:b/>
         </w:rPr>
-        <w:t>New query</w:t>
+        <w:t>Photon and dashboard routes.</w:t>
       </w:r>
       <w:r>
         <w:t xml:space="preserve"> </w:t>
@@ -7159,25 +7292,21 @@
           <w:color w:val="374151"/>
           <w:sz w:val="19"/>
         </w:rPr>
-        <w:t>set_place door</w:t>
-      </w:r>
-      <w:r>
-        <w:t>, with its answer.</w:t>
-      </w:r>
-    </w:p>
-    <w:p>
-      <w:pPr>
-        <w:numPr>
-          <w:ilvl w:val="0"/>
-          <w:numId w:val="950"/>
-        </w:numPr>
-        <w:pStyle w:val="ListParagraph"/>
-      </w:pPr>
-      <w:r>
-        <w:rPr>
-          <w:b/>
-        </w:rPr>
-        <w:t>Find answers:</w:t>
+        <w:t>photon/</w:t>
+      </w:r>
+      <w:r>
+        <w:t xml:space="preserve"> and </w:t>
+      </w:r>
+      <w:r>
+        <w:rPr>
+          <w:rFonts w:ascii="Courier New" w:hAnsi="Courier New" w:eastAsia="Courier New" w:cs="Courier New"/>
+          <w:color w:val="374151"/>
+          <w:sz w:val="19"/>
+        </w:rPr>
+        <w:t>frontend/</w:t>
+      </w:r>
+      <w:r>
+        <w:t xml:space="preserve"> were built against the earlier requirements and POC 26 paths. Status of each:</w:t>
       </w:r>
     </w:p>
     <w:p>
@@ -7190,14 +7319,23 @@
       </w:pPr>
       <w:r>
         <w:rPr>
+          <w:b/>
+        </w:rPr>
+        <w:t>Photon: decided (2026-10-17).</w:t>
+      </w:r>
+      <w:r>
+        <w:t xml:space="preserve"> </w:t>
+      </w:r>
+      <w:r>
+        <w:rPr>
           <w:rFonts w:ascii="Courier New" w:hAnsi="Courier New" w:eastAsia="Courier New" w:cs="Courier New"/>
           <w:color w:val="374151"/>
           <w:sz w:val="19"/>
         </w:rPr>
-        <w:t>reason</w:t>
-      </w:r>
-      <w:r>
-        <w:t xml:space="preserve"> adds </w:t>
+        <w:t>photon/</w:t>
+      </w:r>
+      <w:r>
+        <w:t xml:space="preserve"> adopted §5 as written, on Photon 2.0, with no format changes. The phone never talks to </w:t>
       </w:r>
       <w:r>
         <w:rPr>
@@ -7205,10 +7343,43 @@
           <w:color w:val="374151"/>
           <w:sz w:val="19"/>
         </w:rPr>
-        <w:t>not_registered</w:t>
-      </w:r>
-      <w:r>
-        <w:t>;</w:t>
+        <w:t>photon/</w:t>
+      </w:r>
+      <w:r>
+        <w:t xml:space="preserve">. Two optional additions are proposed in </w:t>
+      </w:r>
+      <w:r>
+        <w:rPr>
+          <w:rFonts w:ascii="Courier New" w:hAnsi="Courier New" w:eastAsia="Courier New" w:cs="Courier New"/>
+          <w:color w:val="374151"/>
+          <w:sz w:val="19"/>
+        </w:rPr>
+        <w:t>STATUS.md</w:t>
+      </w:r>
+      <w:r>
+        <w:t xml:space="preserve"> (</w:t>
+      </w:r>
+      <w:r>
+        <w:rPr>
+          <w:rFonts w:ascii="Courier New" w:hAnsi="Courier New" w:eastAsia="Courier New" w:cs="Courier New"/>
+          <w:color w:val="374151"/>
+          <w:sz w:val="19"/>
+        </w:rPr>
+        <w:t>label_request_seen</w:t>
+      </w:r>
+      <w:r>
+        <w:t xml:space="preserve">, </w:t>
+      </w:r>
+      <w:r>
+        <w:rPr>
+          <w:rFonts w:ascii="Courier New" w:hAnsi="Courier New" w:eastAsia="Courier New" w:cs="Courier New"/>
+          <w:color w:val="374151"/>
+          <w:sz w:val="19"/>
+        </w:rPr>
+        <w:t>label_unknown</w:t>
+      </w:r>
+      <w:r>
+        <w:t>); they are not part of this contract.</w:t>
       </w:r>
     </w:p>
     <w:p>
@@ -7221,14 +7392,23 @@
       </w:pPr>
       <w:r>
         <w:rPr>
+          <w:b/>
+        </w:rPr>
+        <w:t>Dashboard: decided (2026-10-18).</w:t>
+      </w:r>
+      <w:r>
+        <w:t xml:space="preserve"> The server serves </w:t>
+      </w:r>
+      <w:r>
+        <w:rPr>
           <w:rFonts w:ascii="Courier New" w:hAnsi="Courier New" w:eastAsia="Courier New" w:cs="Courier New"/>
           <w:color w:val="374151"/>
           <w:sz w:val="19"/>
         </w:rPr>
-        <w:t>not_where_last_seen</w:t>
-      </w:r>
-      <w:r>
-        <w:t xml:space="preserve"> carries </w:t>
+        <w:t>frontend/</w:t>
+      </w:r>
+      <w:r>
+        <w:t xml:space="preserve">'s own contract (§6, </w:t>
       </w:r>
       <w:r>
         <w:rPr>
@@ -7236,10 +7416,10 @@
           <w:color w:val="374151"/>
           <w:sz w:val="19"/>
         </w:rPr>
-        <w:t>last_position</w:t>
-      </w:r>
-      <w:r>
-        <w:t xml:space="preserve"> and </w:t>
+        <w:t>marco/dashboard.py</w:t>
+      </w:r>
+      <w:r>
+        <w:t xml:space="preserve">). The phone gained </w:t>
       </w:r>
       <w:r>
         <w:rPr>
@@ -7247,22 +7427,10 @@
           <w:color w:val="374151"/>
           <w:sz w:val="19"/>
         </w:rPr>
-        <w:t>surface</w:t>
-      </w:r>
-      <w:r>
-        <w:t>;</w:t>
-      </w:r>
-    </w:p>
-    <w:p>
-      <w:pPr>
-        <w:numPr>
-          <w:ilvl w:val="1"/>
-          <w:numId w:val="951"/>
-        </w:numPr>
-        <w:pStyle w:val="ListParagraph"/>
-      </w:pPr>
-      <w:r>
-        <w:t xml:space="preserve">found answers carry </w:t>
+        <w:t>command</w:t>
+      </w:r>
+      <w:r>
+        <w:t xml:space="preserve"> and </w:t>
       </w:r>
       <w:r>
         <w:rPr>
@@ -7270,174 +7438,18 @@
           <w:color w:val="374151"/>
           <w:sz w:val="19"/>
         </w:rPr>
-        <w:t>state</w:t>
-      </w:r>
-      <w:r>
-        <w:t>.</w:t>
+        <w:t>command_ack</w:t>
+      </w:r>
+      <w:r>
+        <w:t xml:space="preserve"> for Find and Stop.</w:t>
       </w:r>
     </w:p>
     <w:p>
       <w:pPr>
-        <w:numPr>
-          <w:ilvl w:val="0"/>
-          <w:numId w:val="950"/>
-        </w:numPr>
-        <w:pStyle w:val="ListParagraph"/>
-      </w:pPr>
-      <w:r>
-        <w:rPr>
-          <w:b/>
-        </w:rPr>
-        <w:t>Event kinds:</w:t>
-      </w:r>
-      <w:r>
-        <w:t xml:space="preserve"> added </w:t>
-      </w:r>
-      <w:r>
-        <w:rPr>
-          <w:rFonts w:ascii="Courier New" w:hAnsi="Courier New" w:eastAsia="Courier New" w:cs="Courier New"/>
-          <w:color w:val="374151"/>
-          <w:sz w:val="19"/>
-        </w:rPr>
-        <w:t>seen</w:t>
-      </w:r>
-      <w:r>
-        <w:t xml:space="preserve">, </w:t>
-      </w:r>
-      <w:r>
-        <w:rPr>
-          <w:rFonts w:ascii="Courier New" w:hAnsi="Courier New" w:eastAsia="Courier New" w:cs="Courier New"/>
-          <w:color w:val="374151"/>
-          <w:sz w:val="19"/>
-        </w:rPr>
-        <w:t>missing</w:t>
-      </w:r>
-      <w:r>
-        <w:t xml:space="preserve"> and </w:t>
-      </w:r>
-      <w:r>
-        <w:rPr>
-          <w:rFonts w:ascii="Courier New" w:hAnsi="Courier New" w:eastAsia="Courier New" w:cs="Courier New"/>
-          <w:color w:val="374151"/>
-          <w:sz w:val="19"/>
-        </w:rPr>
-        <w:t>label_added</w:t>
-      </w:r>
-      <w:r>
-        <w:t>.</w:t>
-      </w:r>
-    </w:p>
-    <w:p>
-      <w:pPr>
-        <w:numPr>
-          <w:ilvl w:val="0"/>
-          <w:numId w:val="950"/>
-        </w:numPr>
-        <w:pStyle w:val="ListParagraph"/>
-      </w:pPr>
-      <w:r>
-        <w:rPr>
-          <w:b/>
-        </w:rPr>
-        <w:t>`POST /v1/labels`:</w:t>
-      </w:r>
-      <w:r>
-        <w:t xml:space="preserve"> takes </w:t>
-      </w:r>
-      <w:r>
-        <w:rPr>
-          <w:rFonts w:ascii="Courier New" w:hAnsi="Courier New" w:eastAsia="Courier New" w:cs="Courier New"/>
-          <w:color w:val="374151"/>
-          <w:sz w:val="19"/>
-        </w:rPr>
-        <w:t>text</w:t>
-      </w:r>
-      <w:r>
-        <w:t xml:space="preserve">, and </w:t>
-      </w:r>
-      <w:r>
-        <w:rPr>
-          <w:rFonts w:ascii="Courier New" w:hAnsi="Courier New" w:eastAsia="Courier New" w:cs="Courier New"/>
-          <w:color w:val="374151"/>
-          <w:sz w:val="19"/>
-        </w:rPr>
-        <w:t>item_id</w:t>
-      </w:r>
-      <w:r>
-        <w:t xml:space="preserve"> for a follow-up voice note; it returns </w:t>
-      </w:r>
-      <w:r>
-        <w:rPr>
-          <w:rFonts w:ascii="Courier New" w:hAnsi="Courier New" w:eastAsia="Courier New" w:cs="Courier New"/>
-          <w:color w:val="374151"/>
-          <w:sz w:val="19"/>
-        </w:rPr>
-        <w:t>item_id</w:t>
-      </w:r>
-      <w:r>
-        <w:t>.</w:t>
-      </w:r>
-    </w:p>
-    <w:p>
-      <w:pPr>
-        <w:numPr>
-          <w:ilvl w:val="0"/>
-          <w:numId w:val="950"/>
-        </w:numPr>
-        <w:pStyle w:val="ListParagraph"/>
-      </w:pPr>
-      <w:r>
-        <w:rPr>
-          <w:b/>
-        </w:rPr>
-        <w:t>`GET /v1/items` fields</w:t>
-      </w:r>
-      <w:r>
-        <w:t xml:space="preserve"> are listed.</w:t>
-      </w:r>
-    </w:p>
-    <w:p>
-      <w:pPr>
-        <w:numPr>
-          <w:ilvl w:val="0"/>
-          <w:numId w:val="950"/>
-        </w:numPr>
-        <w:pStyle w:val="ListParagraph"/>
-      </w:pPr>
-      <w:r>
-        <w:rPr>
-          <w:b/>
-        </w:rPr>
-        <w:t>§7:</w:t>
-      </w:r>
-      <w:r>
-        <w:t xml:space="preserve"> directions are relative to the body and sound to the head; there is a "within reach" line, the facing lock releases past 20°, and the steady tone releases above 40 cm.</w:t>
-      </w:r>
-    </w:p>
-    <w:p>
-      <w:pPr>
-        <w:numPr>
-          <w:ilvl w:val="0"/>
-          <w:numId w:val="950"/>
-        </w:numPr>
-        <w:pStyle w:val="ListParagraph"/>
-      </w:pPr>
-      <w:r>
-        <w:rPr>
-          <w:b/>
-        </w:rPr>
-        <w:t>"Getting my bearings."</w:t>
-      </w:r>
-      <w:r>
-        <w:t xml:space="preserve"> replaces "Marco is getting its bearings."</w:t>
-      </w:r>
-    </w:p>
-    <w:p>
-      <w:pPr>
         <w:pStyle w:val="Heading1"/>
       </w:pPr>
       <w:r>
-        <w:t>12. Changes since v0.2</w:t>
+        <w:t>11. Changes since v0.1</w:t>
       </w:r>
     </w:p>
     <w:p>
@@ -7452,10 +7464,10 @@
         <w:rPr>
           <w:b/>
         </w:rPr>
-        <w:t>Registrations and labels persist</w:t>
-      </w:r>
-      <w:r>
-        <w:t xml:space="preserve"> across server restarts (§3.3), under </w:t>
+        <w:t>Compression:</w:t>
+      </w:r>
+      <w:r>
+        <w:t xml:space="preserve"> DEFLATE, where raw DEFLATE (Apple's </w:t>
       </w:r>
       <w:r>
         <w:rPr>
@@ -7463,10 +7475,10 @@
           <w:color w:val="374151"/>
           <w:sz w:val="19"/>
         </w:rPr>
-        <w:t>MARCO_DATA/registry/</w:t>
-      </w:r>
-      <w:r>
-        <w:t>.</w:t>
+        <w:t>.zlib</w:t>
+      </w:r>
+      <w:r>
+        <w:t>) and zlib are both accepted.</w:t>
       </w:r>
     </w:p>
     <w:p>
@@ -7481,7 +7493,83 @@
         <w:rPr>
           <w:b/>
         </w:rPr>
-        <w:t>`source`:</w:t>
+        <w:t>`session_id`</w:t>
+      </w:r>
+      <w:r>
+        <w:t xml:space="preserve"> is on every phone message (hand, guidance, query and map too).</w:t>
+      </w:r>
+    </w:p>
+    <w:p>
+      <w:pPr>
+        <w:numPr>
+          <w:ilvl w:val="0"/>
+          <w:numId w:val="952"/>
+        </w:numPr>
+        <w:pStyle w:val="ListParagraph"/>
+      </w:pPr>
+      <w:r>
+        <w:rPr>
+          <w:b/>
+        </w:rPr>
+        <w:t>Hand message:</w:t>
+      </w:r>
+      <w:r>
+        <w:t xml:space="preserve"> gains </w:t>
+      </w:r>
+      <w:r>
+        <w:rPr>
+          <w:rFonts w:ascii="Courier New" w:hAnsi="Courier New" w:eastAsia="Courier New" w:cs="Courier New"/>
+          <w:color w:val="374151"/>
+          <w:sz w:val="19"/>
+        </w:rPr>
+        <w:t>map_id</w:t>
+      </w:r>
+      <w:r>
+        <w:t>. The server uses the latest frame's intrinsics, and the joint names are spelled out.</w:t>
+      </w:r>
+    </w:p>
+    <w:p>
+      <w:pPr>
+        <w:numPr>
+          <w:ilvl w:val="0"/>
+          <w:numId w:val="952"/>
+        </w:numPr>
+        <w:pStyle w:val="ListParagraph"/>
+      </w:pPr>
+      <w:r>
+        <w:rPr>
+          <w:b/>
+        </w:rPr>
+        <w:t>New query</w:t>
+      </w:r>
+      <w:r>
+        <w:t xml:space="preserve"> </w:t>
+      </w:r>
+      <w:r>
+        <w:rPr>
+          <w:rFonts w:ascii="Courier New" w:hAnsi="Courier New" w:eastAsia="Courier New" w:cs="Courier New"/>
+          <w:color w:val="374151"/>
+          <w:sz w:val="19"/>
+        </w:rPr>
+        <w:t>set_place door</w:t>
+      </w:r>
+      <w:r>
+        <w:t>, with its answer.</w:t>
+      </w:r>
+    </w:p>
+    <w:p>
+      <w:pPr>
+        <w:numPr>
+          <w:ilvl w:val="0"/>
+          <w:numId w:val="952"/>
+        </w:numPr>
+        <w:pStyle w:val="ListParagraph"/>
+      </w:pPr>
+      <w:r>
+        <w:rPr>
+          <w:b/>
+        </w:rPr>
+        <w:t>Find answers:</w:t>
       </w:r>
     </w:p>
     <w:p>
@@ -7493,18 +7581,15 @@
         <w:pStyle w:val="ListParagraph"/>
       </w:pPr>
       <w:r>
-        <w:t xml:space="preserve">optional on </w:t>
-      </w:r>
-      <w:r>
         <w:rPr>
           <w:rFonts w:ascii="Courier New" w:hAnsi="Courier New" w:eastAsia="Courier New" w:cs="Courier New"/>
           <w:color w:val="374151"/>
           <w:sz w:val="19"/>
         </w:rPr>
-        <w:t>POST /v1/items</w:t>
-      </w:r>
-      <w:r>
-        <w:t xml:space="preserve"> (default </w:t>
+        <w:t>reason</w:t>
+      </w:r>
+      <w:r>
+        <w:t xml:space="preserve"> adds </w:t>
       </w:r>
       <w:r>
         <w:rPr>
@@ -7512,32 +7597,10 @@
           <w:color w:val="374151"/>
           <w:sz w:val="19"/>
         </w:rPr>
-        <w:t>app</w:t>
-      </w:r>
-      <w:r>
-        <w:t xml:space="preserve">) and </w:t>
-      </w:r>
-      <w:r>
-        <w:rPr>
-          <w:rFonts w:ascii="Courier New" w:hAnsi="Courier New" w:eastAsia="Courier New" w:cs="Courier New"/>
-          <w:color w:val="374151"/>
-          <w:sz w:val="19"/>
-        </w:rPr>
-        <w:t>POST /v1/labels</w:t>
-      </w:r>
-      <w:r>
-        <w:t xml:space="preserve"> (default </w:t>
-      </w:r>
-      <w:r>
-        <w:rPr>
-          <w:rFonts w:ascii="Courier New" w:hAnsi="Courier New" w:eastAsia="Courier New" w:cs="Courier New"/>
-          <w:color w:val="374151"/>
-          <w:sz w:val="19"/>
-        </w:rPr>
-        <w:t>photon</w:t>
-      </w:r>
-      <w:r>
-        <w:t>);</w:t>
+        <w:t>not_registered</w:t>
+      </w:r>
+      <w:r>
+        <w:t>;</w:t>
       </w:r>
     </w:p>
     <w:p>
@@ -7549,15 +7612,57 @@
         <w:pStyle w:val="ListParagraph"/>
       </w:pPr>
       <w:r>
-        <w:t xml:space="preserve">listed in </w:t>
-      </w:r>
-      <w:r>
         <w:rPr>
           <w:rFonts w:ascii="Courier New" w:hAnsi="Courier New" w:eastAsia="Courier New" w:cs="Courier New"/>
           <w:color w:val="374151"/>
           <w:sz w:val="19"/>
         </w:rPr>
-        <w:t>GET /v1/items</w:t>
+        <w:t>not_where_last_seen</w:t>
+      </w:r>
+      <w:r>
+        <w:t xml:space="preserve"> carries </w:t>
+      </w:r>
+      <w:r>
+        <w:rPr>
+          <w:rFonts w:ascii="Courier New" w:hAnsi="Courier New" w:eastAsia="Courier New" w:cs="Courier New"/>
+          <w:color w:val="374151"/>
+          <w:sz w:val="19"/>
+        </w:rPr>
+        <w:t>last_position</w:t>
+      </w:r>
+      <w:r>
+        <w:t xml:space="preserve"> and </w:t>
+      </w:r>
+      <w:r>
+        <w:rPr>
+          <w:rFonts w:ascii="Courier New" w:hAnsi="Courier New" w:eastAsia="Courier New" w:cs="Courier New"/>
+          <w:color w:val="374151"/>
+          <w:sz w:val="19"/>
+        </w:rPr>
+        <w:t>surface</w:t>
+      </w:r>
+      <w:r>
+        <w:t>;</w:t>
+      </w:r>
+    </w:p>
+    <w:p>
+      <w:pPr>
+        <w:numPr>
+          <w:ilvl w:val="1"/>
+          <w:numId w:val="953"/>
+        </w:numPr>
+        <w:pStyle w:val="ListParagraph"/>
+      </w:pPr>
+      <w:r>
+        <w:t xml:space="preserve">found answers carry </w:t>
+      </w:r>
+      <w:r>
+        <w:rPr>
+          <w:rFonts w:ascii="Courier New" w:hAnsi="Courier New" w:eastAsia="Courier New" w:cs="Courier New"/>
+          <w:color w:val="374151"/>
+          <w:sz w:val="19"/>
+        </w:rPr>
+        <w:t>state</w:t>
       </w:r>
       <w:r>
         <w:t>.</w:t>
@@ -7575,10 +7680,10 @@
         <w:rPr>
           <w:b/>
         </w:rPr>
-        <w:t>New route</w:t>
-      </w:r>
-      <w:r>
-        <w:t xml:space="preserve"> </w:t>
+        <w:t>Event kinds:</w:t>
+      </w:r>
+      <w:r>
+        <w:t xml:space="preserve"> added </w:t>
       </w:r>
       <w:r>
         <w:rPr>
@@ -7586,10 +7691,10 @@
           <w:color w:val="374151"/>
           <w:sz w:val="19"/>
         </w:rPr>
-        <w:t>DELETE /v1/items?source=…</w:t>
-      </w:r>
-      <w:r>
-        <w:t xml:space="preserve">, which forgets one source's items. Photon's </w:t>
+        <w:t>seen</w:t>
+      </w:r>
+      <w:r>
+        <w:t xml:space="preserve">, </w:t>
       </w:r>
       <w:r>
         <w:rPr>
@@ -7597,10 +7702,21 @@
           <w:color w:val="374151"/>
           <w:sz w:val="19"/>
         </w:rPr>
-        <w:t>/restart</w:t>
-      </w:r>
-      <w:r>
-        <w:t xml:space="preserve"> command uses it (§5).</w:t>
+        <w:t>missing</w:t>
+      </w:r>
+      <w:r>
+        <w:t xml:space="preserve"> and </w:t>
+      </w:r>
+      <w:r>
+        <w:rPr>
+          <w:rFonts w:ascii="Courier New" w:hAnsi="Courier New" w:eastAsia="Courier New" w:cs="Courier New"/>
+          <w:color w:val="374151"/>
+          <w:sz w:val="19"/>
+        </w:rPr>
+        <w:t>label_added</w:t>
+      </w:r>
+      <w:r>
+        <w:t>.</w:t>
       </w:r>
     </w:p>
     <w:p>
@@ -7615,10 +7731,10 @@
         <w:rPr>
           <w:b/>
         </w:rPr>
-        <w:t>Dashboard API</w:t>
-      </w:r>
-      <w:r>
-        <w:t xml:space="preserve"> (§6): </w:t>
+        <w:t>`POST /v1/labels`:</w:t>
+      </w:r>
+      <w:r>
+        <w:t xml:space="preserve"> takes </w:t>
       </w:r>
       <w:r>
         <w:rPr>
@@ -7626,10 +7742,10 @@
           <w:color w:val="374151"/>
           <w:sz w:val="19"/>
         </w:rPr>
-        <w:t>GET /dashboard/snapshot</w:t>
-      </w:r>
-      <w:r>
-        <w:t xml:space="preserve">, </w:t>
+        <w:t>text</w:t>
+      </w:r>
+      <w:r>
+        <w:t xml:space="preserve">, and </w:t>
       </w:r>
       <w:r>
         <w:rPr>
@@ -7637,10 +7753,10 @@
           <w:color w:val="374151"/>
           <w:sz w:val="19"/>
         </w:rPr>
-        <w:t>WS /events</w:t>
-      </w:r>
-      <w:r>
-        <w:t xml:space="preserve">, </w:t>
+        <w:t>item_id</w:t>
+      </w:r>
+      <w:r>
+        <w:t xml:space="preserve"> for a follow-up voice note; it returns </w:t>
       </w:r>
       <w:r>
         <w:rPr>
@@ -7648,43 +7764,10 @@
           <w:color w:val="374151"/>
           <w:sz w:val="19"/>
         </w:rPr>
-        <w:t>POST /dashboard/commands</w:t>
-      </w:r>
-      <w:r>
-        <w:t xml:space="preserve">, </w:t>
-      </w:r>
-      <w:r>
-        <w:rPr>
-          <w:rFonts w:ascii="Courier New" w:hAnsi="Courier New" w:eastAsia="Courier New" w:cs="Courier New"/>
-          <w:color w:val="374151"/>
-          <w:sz w:val="19"/>
-        </w:rPr>
-        <w:t>GET /media/…</w:t>
-      </w:r>
-      <w:r>
-        <w:t xml:space="preserve"> and </w:t>
-      </w:r>
-      <w:r>
-        <w:rPr>
-          <w:rFonts w:ascii="Courier New" w:hAnsi="Courier New" w:eastAsia="Courier New" w:cs="Courier New"/>
-          <w:color w:val="374151"/>
-          <w:sz w:val="19"/>
-        </w:rPr>
-        <w:t>/app/…</w:t>
-      </w:r>
-      <w:r>
-        <w:t xml:space="preserve">, each also under </w:t>
-      </w:r>
-      <w:r>
-        <w:rPr>
-          <w:rFonts w:ascii="Courier New" w:hAnsi="Courier New" w:eastAsia="Courier New" w:cs="Courier New"/>
-          <w:color w:val="374151"/>
-          <w:sz w:val="19"/>
-        </w:rPr>
-        <w:t>/api/…</w:t>
-      </w:r>
-      <w:r>
-        <w:t>, all behind the auth gate.</w:t>
+        <w:t>item_id</w:t>
+      </w:r>
+      <w:r>
+        <w:t>.</w:t>
       </w:r>
     </w:p>
     <w:p>
@@ -7699,40 +7782,54 @@
         <w:rPr>
           <w:b/>
         </w:rPr>
-        <w:t>New phone messages for dashboard Find and Stop:</w:t>
-      </w:r>
-      <w:r>
-        <w:t xml:space="preserve"> </w:t>
-      </w:r>
-      <w:r>
-        <w:rPr>
-          <w:rFonts w:ascii="Courier New" w:hAnsi="Courier New" w:eastAsia="Courier New" w:cs="Courier New"/>
-          <w:color w:val="374151"/>
-          <w:sz w:val="19"/>
-        </w:rPr>
-        <w:t>command</w:t>
-      </w:r>
-      <w:r>
-        <w:t xml:space="preserve"> (server to phone, §4) and </w:t>
-      </w:r>
-      <w:r>
-        <w:rPr>
-          <w:rFonts w:ascii="Courier New" w:hAnsi="Courier New" w:eastAsia="Courier New" w:cs="Courier New"/>
-          <w:color w:val="374151"/>
-          <w:sz w:val="19"/>
-        </w:rPr>
-        <w:t>command_ack</w:t>
-      </w:r>
-      <w:r>
-        <w:t xml:space="preserve"> (phone to server, §3.2).</w:t>
+        <w:t>`GET /v1/items` fields</w:t>
+      </w:r>
+      <w:r>
+        <w:t xml:space="preserve"> are listed.</w:t>
       </w:r>
     </w:p>
     <w:p>
       <w:pPr>
+        <w:numPr>
+          <w:ilvl w:val="0"/>
+          <w:numId w:val="952"/>
+        </w:numPr>
+        <w:pStyle w:val="ListParagraph"/>
+      </w:pPr>
+      <w:r>
+        <w:rPr>
+          <w:b/>
+        </w:rPr>
+        <w:t>§7:</w:t>
+      </w:r>
+      <w:r>
+        <w:t xml:space="preserve"> directions are relative to the body and sound to the head; there is a "within reach" line, the facing lock releases past 20°, and the steady tone releases above 40 cm.</w:t>
+      </w:r>
+    </w:p>
+    <w:p>
+      <w:pPr>
+        <w:numPr>
+          <w:ilvl w:val="0"/>
+          <w:numId w:val="952"/>
+        </w:numPr>
+        <w:pStyle w:val="ListParagraph"/>
+      </w:pPr>
+      <w:r>
+        <w:rPr>
+          <w:b/>
+        </w:rPr>
+        <w:t>"Getting my bearings."</w:t>
+      </w:r>
+      <w:r>
+        <w:t xml:space="preserve"> replaces "Marco is getting its bearings."</w:t>
+      </w:r>
+    </w:p>
+    <w:p>
+      <w:pPr>
         <w:pStyle w:val="Heading1"/>
       </w:pPr>
       <w:r>
-        <w:t>13. Changes since v0.3</w:t>
+        <w:t>12. Changes since v0.2</w:t>
       </w:r>
     </w:p>
     <w:p>
@@ -7747,10 +7844,10 @@
         <w:rPr>
           <w:b/>
         </w:rPr>
-        <w:t>Output-only ElevenLabs:</w:t>
-      </w:r>
-      <w:r>
-        <w:t xml:space="preserve"> authenticated </w:t>
+        <w:t>Registrations and labels persist</w:t>
+      </w:r>
+      <w:r>
+        <w:t xml:space="preserve"> across server restarts (§3.3), under </w:t>
       </w:r>
       <w:r>
         <w:rPr>
@@ -7758,10 +7855,10 @@
           <w:color w:val="374151"/>
           <w:sz w:val="19"/>
         </w:rPr>
-        <w:t>POST /v1/speech</w:t>
-      </w:r>
-      <w:r>
-        <w:t xml:space="preserve"> (§3.5), short exact text to mono WAV, bounded caching/timeouts and Apple fallback. iOS plays it through the existing spatial voice node.</w:t>
+        <w:t>MARCO_DATA/registry/</w:t>
+      </w:r>
+      <w:r>
+        <w:t>.</w:t>
       </w:r>
     </w:p>
     <w:p>
@@ -7776,10 +7873,403 @@
         <w:rPr>
           <w:b/>
         </w:rPr>
+        <w:t>`source`:</w:t>
+      </w:r>
+    </w:p>
+    <w:p>
+      <w:pPr>
+        <w:numPr>
+          <w:ilvl w:val="1"/>
+          <w:numId w:val="955"/>
+        </w:numPr>
+        <w:pStyle w:val="ListParagraph"/>
+      </w:pPr>
+      <w:r>
+        <w:t xml:space="preserve">optional on </w:t>
+      </w:r>
+      <w:r>
+        <w:rPr>
+          <w:rFonts w:ascii="Courier New" w:hAnsi="Courier New" w:eastAsia="Courier New" w:cs="Courier New"/>
+          <w:color w:val="374151"/>
+          <w:sz w:val="19"/>
+        </w:rPr>
+        <w:t>POST /v1/items</w:t>
+      </w:r>
+      <w:r>
+        <w:t xml:space="preserve"> (default </w:t>
+      </w:r>
+      <w:r>
+        <w:rPr>
+          <w:rFonts w:ascii="Courier New" w:hAnsi="Courier New" w:eastAsia="Courier New" w:cs="Courier New"/>
+          <w:color w:val="374151"/>
+          <w:sz w:val="19"/>
+        </w:rPr>
+        <w:t>app</w:t>
+      </w:r>
+      <w:r>
+        <w:t xml:space="preserve">) and </w:t>
+      </w:r>
+      <w:r>
+        <w:rPr>
+          <w:rFonts w:ascii="Courier New" w:hAnsi="Courier New" w:eastAsia="Courier New" w:cs="Courier New"/>
+          <w:color w:val="374151"/>
+          <w:sz w:val="19"/>
+        </w:rPr>
+        <w:t>POST /v1/labels</w:t>
+      </w:r>
+      <w:r>
+        <w:t xml:space="preserve"> (default </w:t>
+      </w:r>
+      <w:r>
+        <w:rPr>
+          <w:rFonts w:ascii="Courier New" w:hAnsi="Courier New" w:eastAsia="Courier New" w:cs="Courier New"/>
+          <w:color w:val="374151"/>
+          <w:sz w:val="19"/>
+        </w:rPr>
+        <w:t>photon</w:t>
+      </w:r>
+      <w:r>
+        <w:t>);</w:t>
+      </w:r>
+    </w:p>
+    <w:p>
+      <w:pPr>
+        <w:numPr>
+          <w:ilvl w:val="1"/>
+          <w:numId w:val="955"/>
+        </w:numPr>
+        <w:pStyle w:val="ListParagraph"/>
+      </w:pPr>
+      <w:r>
+        <w:t xml:space="preserve">listed in </w:t>
+      </w:r>
+      <w:r>
+        <w:rPr>
+          <w:rFonts w:ascii="Courier New" w:hAnsi="Courier New" w:eastAsia="Courier New" w:cs="Courier New"/>
+          <w:color w:val="374151"/>
+          <w:sz w:val="19"/>
+        </w:rPr>
+        <w:t>GET /v1/items</w:t>
+      </w:r>
+      <w:r>
+        <w:t>.</w:t>
+      </w:r>
+    </w:p>
+    <w:p>
+      <w:pPr>
+        <w:numPr>
+          <w:ilvl w:val="0"/>
+          <w:numId w:val="954"/>
+        </w:numPr>
+        <w:pStyle w:val="ListParagraph"/>
+      </w:pPr>
+      <w:r>
+        <w:rPr>
+          <w:b/>
+        </w:rPr>
+        <w:t>New route</w:t>
+      </w:r>
+      <w:r>
+        <w:t xml:space="preserve"> </w:t>
+      </w:r>
+      <w:r>
+        <w:rPr>
+          <w:rFonts w:ascii="Courier New" w:hAnsi="Courier New" w:eastAsia="Courier New" w:cs="Courier New"/>
+          <w:color w:val="374151"/>
+          <w:sz w:val="19"/>
+        </w:rPr>
+        <w:t>DELETE /v1/items?source=…</w:t>
+      </w:r>
+      <w:r>
+        <w:t xml:space="preserve">, which forgets one source's items. Photon's </w:t>
+      </w:r>
+      <w:r>
+        <w:rPr>
+          <w:rFonts w:ascii="Courier New" w:hAnsi="Courier New" w:eastAsia="Courier New" w:cs="Courier New"/>
+          <w:color w:val="374151"/>
+          <w:sz w:val="19"/>
+        </w:rPr>
+        <w:t>/restart</w:t>
+      </w:r>
+      <w:r>
+        <w:t xml:space="preserve"> command uses it (§5).</w:t>
+      </w:r>
+    </w:p>
+    <w:p>
+      <w:pPr>
+        <w:numPr>
+          <w:ilvl w:val="0"/>
+          <w:numId w:val="954"/>
+        </w:numPr>
+        <w:pStyle w:val="ListParagraph"/>
+      </w:pPr>
+      <w:r>
+        <w:rPr>
+          <w:b/>
+        </w:rPr>
+        <w:t>Dashboard API</w:t>
+      </w:r>
+      <w:r>
+        <w:t xml:space="preserve"> (§6): </w:t>
+      </w:r>
+      <w:r>
+        <w:rPr>
+          <w:rFonts w:ascii="Courier New" w:hAnsi="Courier New" w:eastAsia="Courier New" w:cs="Courier New"/>
+          <w:color w:val="374151"/>
+          <w:sz w:val="19"/>
+        </w:rPr>
+        <w:t>GET /dashboard/snapshot</w:t>
+      </w:r>
+      <w:r>
+        <w:t xml:space="preserve">, </w:t>
+      </w:r>
+      <w:r>
+        <w:rPr>
+          <w:rFonts w:ascii="Courier New" w:hAnsi="Courier New" w:eastAsia="Courier New" w:cs="Courier New"/>
+          <w:color w:val="374151"/>
+          <w:sz w:val="19"/>
+        </w:rPr>
+        <w:t>WS /events</w:t>
+      </w:r>
+      <w:r>
+        <w:t xml:space="preserve">, </w:t>
+      </w:r>
+      <w:r>
+        <w:rPr>
+          <w:rFonts w:ascii="Courier New" w:hAnsi="Courier New" w:eastAsia="Courier New" w:cs="Courier New"/>
+          <w:color w:val="374151"/>
+          <w:sz w:val="19"/>
+        </w:rPr>
+        <w:t>POST /dashboard/commands</w:t>
+      </w:r>
+      <w:r>
+        <w:t xml:space="preserve">, </w:t>
+      </w:r>
+      <w:r>
+        <w:rPr>
+          <w:rFonts w:ascii="Courier New" w:hAnsi="Courier New" w:eastAsia="Courier New" w:cs="Courier New"/>
+          <w:color w:val="374151"/>
+          <w:sz w:val="19"/>
+        </w:rPr>
+        <w:t>GET /media/…</w:t>
+      </w:r>
+      <w:r>
+        <w:t xml:space="preserve"> and </w:t>
+      </w:r>
+      <w:r>
+        <w:rPr>
+          <w:rFonts w:ascii="Courier New" w:hAnsi="Courier New" w:eastAsia="Courier New" w:cs="Courier New"/>
+          <w:color w:val="374151"/>
+          <w:sz w:val="19"/>
+        </w:rPr>
+        <w:t>/app/…</w:t>
+      </w:r>
+      <w:r>
+        <w:t xml:space="preserve">, each also under </w:t>
+      </w:r>
+      <w:r>
+        <w:rPr>
+          <w:rFonts w:ascii="Courier New" w:hAnsi="Courier New" w:eastAsia="Courier New" w:cs="Courier New"/>
+          <w:color w:val="374151"/>
+          <w:sz w:val="19"/>
+        </w:rPr>
+        <w:t>/api/…</w:t>
+      </w:r>
+      <w:r>
+        <w:t>, all behind the auth gate.</w:t>
+      </w:r>
+    </w:p>
+    <w:p>
+      <w:pPr>
+        <w:numPr>
+          <w:ilvl w:val="0"/>
+          <w:numId w:val="954"/>
+        </w:numPr>
+        <w:pStyle w:val="ListParagraph"/>
+      </w:pPr>
+      <w:r>
+        <w:rPr>
+          <w:b/>
+        </w:rPr>
+        <w:t>New phone messages for dashboard Find and Stop:</w:t>
+      </w:r>
+      <w:r>
+        <w:t xml:space="preserve"> </w:t>
+      </w:r>
+      <w:r>
+        <w:rPr>
+          <w:rFonts w:ascii="Courier New" w:hAnsi="Courier New" w:eastAsia="Courier New" w:cs="Courier New"/>
+          <w:color w:val="374151"/>
+          <w:sz w:val="19"/>
+        </w:rPr>
+        <w:t>command</w:t>
+      </w:r>
+      <w:r>
+        <w:t xml:space="preserve"> (server to phone, §4) and </w:t>
+      </w:r>
+      <w:r>
+        <w:rPr>
+          <w:rFonts w:ascii="Courier New" w:hAnsi="Courier New" w:eastAsia="Courier New" w:cs="Courier New"/>
+          <w:color w:val="374151"/>
+          <w:sz w:val="19"/>
+        </w:rPr>
+        <w:t>command_ack</w:t>
+      </w:r>
+      <w:r>
+        <w:t xml:space="preserve"> (phone to server, §3.2).</w:t>
+      </w:r>
+    </w:p>
+    <w:p>
+      <w:pPr>
+        <w:pStyle w:val="Heading1"/>
+      </w:pPr>
+      <w:r>
+        <w:t>13. Changes since v0.3</w:t>
+      </w:r>
+    </w:p>
+    <w:p>
+      <w:pPr>
+        <w:numPr>
+          <w:ilvl w:val="0"/>
+          <w:numId w:val="956"/>
+        </w:numPr>
+        <w:pStyle w:val="ListParagraph"/>
+      </w:pPr>
+      <w:r>
+        <w:rPr>
+          <w:b/>
+        </w:rPr>
+        <w:t>Output-only ElevenLabs:</w:t>
+      </w:r>
+      <w:r>
+        <w:t xml:space="preserve"> authenticated </w:t>
+      </w:r>
+      <w:r>
+        <w:rPr>
+          <w:rFonts w:ascii="Courier New" w:hAnsi="Courier New" w:eastAsia="Courier New" w:cs="Courier New"/>
+          <w:color w:val="374151"/>
+          <w:sz w:val="19"/>
+        </w:rPr>
+        <w:t>POST /v1/speech</w:t>
+      </w:r>
+      <w:r>
+        <w:t xml:space="preserve"> (§3.5), short exact text to mono WAV, bounded caching/timeouts and Apple fallback. iOS plays it through the existing spatial voice node.</w:t>
+      </w:r>
+    </w:p>
+    <w:p>
+      <w:pPr>
+        <w:numPr>
+          <w:ilvl w:val="0"/>
+          <w:numId w:val="956"/>
+        </w:numPr>
+        <w:pStyle w:val="ListParagraph"/>
+      </w:pPr>
+      <w:r>
+        <w:rPr>
+          <w:b/>
+        </w:rPr>
         <w:t>Typed Photon labels:</w:t>
       </w:r>
       <w:r>
         <w:t xml:space="preserve"> no Scribe, transcription or new caregiver audio labels. Photos and typed names, retries, corrections and source attribution stay. Stored legacy media and optional wire fields remain compatible.</w:t>
+      </w:r>
+    </w:p>
+    <w:p>
+      <w:pPr>
+        <w:numPr>
+          <w:ilvl w:val="0"/>
+          <w:numId w:val="956"/>
+        </w:numPr>
+        <w:pStyle w:val="ListParagraph"/>
+      </w:pPr>
+      <w:r>
+        <w:rPr>
+          <w:b/>
+        </w:rPr>
+        <w:t>Room layout on the dashboard map</w:t>
+      </w:r>
+      <w:r>
+        <w:t xml:space="preserve"> (§6):</w:t>
+      </w:r>
+    </w:p>
+    <w:p>
+      <w:pPr>
+        <w:numPr>
+          <w:ilvl w:val="1"/>
+          <w:numId w:val="957"/>
+        </w:numPr>
+        <w:pStyle w:val="ListParagraph"/>
+      </w:pPr>
+      <w:r>
+        <w:t xml:space="preserve">a new raw-feed message, </w:t>
+      </w:r>
+      <w:r>
+        <w:rPr>
+          <w:rFonts w:ascii="Courier New" w:hAnsi="Courier New" w:eastAsia="Courier New" w:cs="Courier New"/>
+          <w:color w:val="374151"/>
+          <w:sz w:val="19"/>
+        </w:rPr>
+        <w:t>room_layout</w:t>
+      </w:r>
+      <w:r>
+        <w:t>;</w:t>
+      </w:r>
+    </w:p>
+    <w:p>
+      <w:pPr>
+        <w:numPr>
+          <w:ilvl w:val="1"/>
+          <w:numId w:val="957"/>
+        </w:numPr>
+        <w:pStyle w:val="ListParagraph"/>
+      </w:pPr>
+      <w:r>
+        <w:t xml:space="preserve">in the snapshot, </w:t>
+      </w:r>
+      <w:r>
+        <w:rPr>
+          <w:rFonts w:ascii="Courier New" w:hAnsi="Courier New" w:eastAsia="Courier New" w:cs="Courier New"/>
+          <w:color w:val="374151"/>
+          <w:sz w:val="19"/>
+        </w:rPr>
+        <w:t>map.walls</w:t>
+      </w:r>
+      <w:r>
+        <w:t xml:space="preserve"> is filled, and there is a new optional </w:t>
+      </w:r>
+      <w:r>
+        <w:rPr>
+          <w:rFonts w:ascii="Courier New" w:hAnsi="Courier New" w:eastAsia="Courier New" w:cs="Courier New"/>
+          <w:color w:val="374151"/>
+          <w:sz w:val="19"/>
+        </w:rPr>
+        <w:t>map.landmarks</w:t>
+      </w:r>
+      <w:r>
+        <w:t>;</w:t>
+      </w:r>
+    </w:p>
+    <w:p>
+      <w:pPr>
+        <w:numPr>
+          <w:ilvl w:val="1"/>
+          <w:numId w:val="957"/>
+        </w:numPr>
+        <w:pStyle w:val="ListParagraph"/>
+      </w:pPr>
+      <w:r>
+        <w:t xml:space="preserve">a new </w:t>
+      </w:r>
+      <w:r>
+        <w:rPr>
+          <w:rFonts w:ascii="Courier New" w:hAnsi="Courier New" w:eastAsia="Courier New" w:cs="Courier New"/>
+          <w:color w:val="374151"/>
+          <w:sz w:val="19"/>
+        </w:rPr>
+        <w:t>map_id</w:t>
+      </w:r>
+      <w:r>
+        <w:t xml:space="preserve"> on a frame now starts a fresh room map (old-frame voxels used to stay).</w:t>
       </w:r>
     </w:p>
     <w:sectPr>
@@ -8449,14 +8939,14 @@
     </w:lvlOverride>
   </w:num>
   <w:num w:numId="939">
-    <w:abstractNumId w:val="901"/>
-    <w:lvlOverride w:ilvl="0">
+    <w:abstractNumId w:val="900"/>
+    <w:lvlOverride w:ilvl="2">
       <w:startOverride w:val="1"/>
     </w:lvlOverride>
   </w:num>
   <w:num w:numId="940">
     <w:abstractNumId w:val="900"/>
-    <w:lvlOverride w:ilvl="1">
+    <w:lvlOverride w:ilvl="0">
       <w:startOverride w:val="1"/>
     </w:lvlOverride>
   </w:num>
@@ -8480,30 +8970,30 @@
   </w:num>
   <w:num w:numId="944">
     <w:abstractNumId w:val="900"/>
-    <w:lvlOverride w:ilvl="0">
+    <w:lvlOverride w:ilvl="1">
       <w:startOverride w:val="1"/>
     </w:lvlOverride>
   </w:num>
   <w:num w:numId="945">
-    <w:abstractNumId w:val="900"/>
+    <w:abstractNumId w:val="901"/>
     <w:lvlOverride w:ilvl="0">
       <w:startOverride w:val="1"/>
     </w:lvlOverride>
   </w:num>
   <w:num w:numId="946">
-    <w:abstractNumId w:val="901"/>
+    <w:abstractNumId w:val="900"/>
     <w:lvlOverride w:ilvl="0">
       <w:startOverride w:val="1"/>
     </w:lvlOverride>
   </w:num>
   <w:num w:numId="947">
     <w:abstractNumId w:val="900"/>
-    <w:lvlOverride w:ilvl="1">
+    <w:lvlOverride w:ilvl="0">
       <w:startOverride w:val="1"/>
     </w:lvlOverride>
   </w:num>
   <w:num w:numId="948">
-    <w:abstractNumId w:val="900"/>
+    <w:abstractNumId w:val="901"/>
     <w:lvlOverride w:ilvl="0">
       <w:startOverride w:val="1"/>
     </w:lvlOverride>
@@ -8541,6 +9031,24 @@
   <w:num w:numId="954">
     <w:abstractNumId w:val="900"/>
     <w:lvlOverride w:ilvl="0">
+      <w:startOverride w:val="1"/>
+    </w:lvlOverride>
+  </w:num>
+  <w:num w:numId="955">
+    <w:abstractNumId w:val="900"/>
+    <w:lvlOverride w:ilvl="1">
+      <w:startOverride w:val="1"/>
+    </w:lvlOverride>
+  </w:num>
+  <w:num w:numId="956">
+    <w:abstractNumId w:val="900"/>
+    <w:lvlOverride w:ilvl="0">
+      <w:startOverride w:val="1"/>
+    </w:lvlOverride>
+  </w:num>
+  <w:num w:numId="957">
+    <w:abstractNumId w:val="900"/>
+    <w:lvlOverride w:ilvl="1">
       <w:startOverride w:val="1"/>
     </w:lvlOverride>
   </w:num>

</xml_diff>

<commit_message>
Touching the guided item ends the search again: a hand over an item is not a miss
While the hand covers the item, the detector can't see it; after 3 frames the item became 'missing',
which took it out of touch matching, so the touch (and the end of guidance) never came. Reproduced in
tests/test_touch_guidance.py. Now frames with a hand within 35 cm of an item don't count as misses,
an item gone after a hand was at it is 'picked_up', and hand_proximity falls back to the knuckles
when the back of the hand hides the fingertip. A really missing item still goes missing, and touching
its empty spot is still not a find.
</commit_message>
<xml_diff>
--- a/docs/INTERFACES.docx
+++ b/docs/INTERFACES.docx
@@ -3374,7 +3374,7 @@
         <w:t>hand_proximity</w:t>
       </w:r>
       <w:r>
-        <w:t xml:space="preserve"> is sent 15 times a second while guiding: the fingertip's distance to the target, which drives the steady tone in §7.</w:t>
+        <w:t xml:space="preserve"> is sent 15 times a second while guiding: the hand's distance to the target, which drives the steady tone in §7. It's measured from the fingertip, or from the knuckles or wrist when the back of the hand hides the fingertip from the chest camera.</w:t>
       </w:r>
     </w:p>
     <w:p>
@@ -8186,10 +8186,21 @@
         <w:rPr>
           <w:b/>
         </w:rPr>
-        <w:t>Room layout on the dashboard map</w:t>
-      </w:r>
-      <w:r>
-        <w:t xml:space="preserve"> (§6):</w:t>
+        <w:t>A hand over the guided item no longer makes it `missing`</w:t>
+      </w:r>
+      <w:r>
+        <w:t xml:space="preserve"> (§7 step 7). Close up, the detector usually can't see the item under the hand. That used to mark the item </w:t>
+      </w:r>
+      <w:r>
+        <w:rPr>
+          <w:rFonts w:ascii="Courier New" w:hAnsi="Courier New" w:eastAsia="Courier New" w:cs="Courier New"/>
+          <w:color w:val="374151"/>
+          <w:sz w:val="19"/>
+        </w:rPr>
+        <w:t>missing</w:t>
+      </w:r>
+      <w:r>
+        <w:t xml:space="preserve"> after 3 frames, which took it out of touch matching, so the touch, and with it the end of the search, never came.</w:t>
       </w:r>
     </w:p>
     <w:p>
@@ -8201,18 +8212,7 @@
         <w:pStyle w:val="ListParagraph"/>
       </w:pPr>
       <w:r>
-        <w:t xml:space="preserve">a new raw-feed message, </w:t>
-      </w:r>
-      <w:r>
-        <w:rPr>
-          <w:rFonts w:ascii="Courier New" w:hAnsi="Courier New" w:eastAsia="Courier New" w:cs="Courier New"/>
-          <w:color w:val="374151"/>
-          <w:sz w:val="19"/>
-        </w:rPr>
-        <w:t>room_layout</w:t>
-      </w:r>
-      <w:r>
-        <w:t>;</w:t>
+        <w:t>Frames where a hand is within 35 cm of an item don't count as misses.</w:t>
       </w:r>
     </w:p>
     <w:p>
@@ -8224,7 +8224,7 @@
         <w:pStyle w:val="ListParagraph"/>
       </w:pPr>
       <w:r>
-        <w:t xml:space="preserve">in the snapshot, </w:t>
+        <w:t xml:space="preserve">An item that disappears after a hand was at it is </w:t>
       </w:r>
       <w:r>
         <w:rPr>
@@ -8232,10 +8232,10 @@
           <w:color w:val="374151"/>
           <w:sz w:val="19"/>
         </w:rPr>
-        <w:t>map.walls</w:t>
-      </w:r>
-      <w:r>
-        <w:t xml:space="preserve"> is filled, and there is a new optional </w:t>
+        <w:t>picked_up</w:t>
+      </w:r>
+      <w:r>
+        <w:t xml:space="preserve">, not </w:t>
       </w:r>
       <w:r>
         <w:rPr>
@@ -8243,17 +8243,92 @@
           <w:color w:val="374151"/>
           <w:sz w:val="19"/>
         </w:rPr>
-        <w:t>map.landmarks</w:t>
-      </w:r>
-      <w:r>
-        <w:t>;</w:t>
+        <w:t>missing</w:t>
+      </w:r>
+      <w:r>
+        <w:t>.</w:t>
       </w:r>
     </w:p>
     <w:p>
       <w:pPr>
         <w:numPr>
+          <w:ilvl w:val="0"/>
+          <w:numId w:val="956"/>
+        </w:numPr>
+        <w:pStyle w:val="ListParagraph"/>
+      </w:pPr>
+      <w:r>
+        <w:rPr>
+          <w:b/>
+        </w:rPr>
+        <w:t>Room layout on the dashboard map</w:t>
+      </w:r>
+      <w:r>
+        <w:t xml:space="preserve"> (§6):</w:t>
+      </w:r>
+    </w:p>
+    <w:p>
+      <w:pPr>
+        <w:numPr>
           <w:ilvl w:val="1"/>
-          <w:numId w:val="957"/>
+          <w:numId w:val="958"/>
+        </w:numPr>
+        <w:pStyle w:val="ListParagraph"/>
+      </w:pPr>
+      <w:r>
+        <w:t xml:space="preserve">a new raw-feed message, </w:t>
+      </w:r>
+      <w:r>
+        <w:rPr>
+          <w:rFonts w:ascii="Courier New" w:hAnsi="Courier New" w:eastAsia="Courier New" w:cs="Courier New"/>
+          <w:color w:val="374151"/>
+          <w:sz w:val="19"/>
+        </w:rPr>
+        <w:t>room_layout</w:t>
+      </w:r>
+      <w:r>
+        <w:t>;</w:t>
+      </w:r>
+    </w:p>
+    <w:p>
+      <w:pPr>
+        <w:numPr>
+          <w:ilvl w:val="1"/>
+          <w:numId w:val="958"/>
+        </w:numPr>
+        <w:pStyle w:val="ListParagraph"/>
+      </w:pPr>
+      <w:r>
+        <w:t xml:space="preserve">in the snapshot, </w:t>
+      </w:r>
+      <w:r>
+        <w:rPr>
+          <w:rFonts w:ascii="Courier New" w:hAnsi="Courier New" w:eastAsia="Courier New" w:cs="Courier New"/>
+          <w:color w:val="374151"/>
+          <w:sz w:val="19"/>
+        </w:rPr>
+        <w:t>map.walls</w:t>
+      </w:r>
+      <w:r>
+        <w:t xml:space="preserve"> is filled, and there is a new optional </w:t>
+      </w:r>
+      <w:r>
+        <w:rPr>
+          <w:rFonts w:ascii="Courier New" w:hAnsi="Courier New" w:eastAsia="Courier New" w:cs="Courier New"/>
+          <w:color w:val="374151"/>
+          <w:sz w:val="19"/>
+        </w:rPr>
+        <w:t>map.landmarks</w:t>
+      </w:r>
+      <w:r>
+        <w:t>;</w:t>
+      </w:r>
+    </w:p>
+    <w:p>
+      <w:pPr>
+        <w:numPr>
+          <w:ilvl w:val="1"/>
+          <w:numId w:val="958"/>
         </w:numPr>
         <w:pStyle w:val="ListParagraph"/>
       </w:pPr>
@@ -9047,6 +9122,12 @@
     </w:lvlOverride>
   </w:num>
   <w:num w:numId="957">
+    <w:abstractNumId w:val="900"/>
+    <w:lvlOverride w:ilvl="1">
+      <w:startOverride w:val="1"/>
+    </w:lvlOverride>
+  </w:num>
+  <w:num w:numId="958">
     <w:abstractNumId w:val="900"/>
     <w:lvlOverride w:ilvl="1">
       <w:startOverride w:val="1"/>

</xml_diff>

<commit_message>
Detection: TH_DINO 0.30, and GET /v1/debug/detection to see live why an item isn't found
Live report: nothing found even pointing at the object. Replaying the recorded iPhone clips through a
real-mode server (loopback, tools/live_check.py) works end to end, and float16 (the A16's mode) moves
scores by ~0.05, so neither the code path nor the GPU explains it. The consistent failure is the
DINOv2 crop check, which rejected 13 of 19 correct boxes at 0.38 (calibrated on handheld ORBIT photos).
At 0.30 the venue clips find 8 of them instead of 5 with no extra false alarm; rec2 now finds all three
items, the wallet included.

/v1/debug/detection (gated) and a per-frame INFO log line say, per item and frame, its scores and
where it was placed, or which check failed (or 'no LiDAR depth', 'beyond 4 m'), plus the detector's
models, precision, thresholds, registrations and any item it lost. MARCO_DINO_TURNS=4 (opt-in)
matches the registration crop at four rotations.
</commit_message>
<xml_diff>
--- a/docs/INTERFACES.docx
+++ b/docs/INTERFACES.docx
@@ -7270,6 +7270,28 @@
           <w:sz w:val="19"/>
         </w:rPr>
         <w:t>GET /v1/items</w:t>
+      </w:r>
+      <w:r>
+        <w:t xml:space="preserve">. For debugging, </w:t>
+      </w:r>
+      <w:r>
+        <w:rPr>
+          <w:rFonts w:ascii="Courier New" w:hAnsi="Courier New" w:eastAsia="Courier New" w:cs="Courier New"/>
+          <w:color w:val="374151"/>
+          <w:sz w:val="19"/>
+        </w:rPr>
+        <w:t>GET /v1/debug/detection</w:t>
+      </w:r>
+      <w:r>
+        <w:t xml:space="preserve"> gives, for the last 30 frames, each item's presence scores and where it was placed (or why not); see </w:t>
+      </w:r>
+      <w:r>
+        <w:rPr>
+          <w:rFonts w:ascii="Courier New" w:hAnsi="Courier New" w:eastAsia="Courier New" w:cs="Courier New"/>
+          <w:color w:val="374151"/>
+          <w:sz w:val="19"/>
+        </w:rPr>
+        <w:t>server/README.md</w:t>
       </w:r>
       <w:r>
         <w:t xml:space="preserve">. The pre-recorded outside-view 3D video can be rendered from </w:t>

</xml_diff>

<commit_message>
Stabilize iOS facing confirmation against small movements
Require steady alignment, sustained-away rearming and a minimum repeat interval while preserving responsive beacon guidance. Keep confirmation state across same-item position updates.

Validation: 495 Swift checks, 11 iOS/server contract and touch-guidance tests, and unsigned iOS Release build passed. Backend redeployment is unnecessary; install a rebuilt iOS app.
</commit_message>
<xml_diff>
--- a/docs/INTERFACES.docx
+++ b/docs/INTERFACES.docx
@@ -7588,7 +7588,76 @@
         <w:t>On the beam</w:t>
       </w:r>
       <w:r>
-        <w:t xml:space="preserve"> (|relative azimuth| within max(12°, atan(0.3 m / distance)), a corridor 30 cm either side of the item): a double ding plus a haptic, once per lock. The lock releases 8° outside that, and drifting off swaps to the plain beep at once.</w:t>
+        <w:t xml:space="preserve"> (|relative azimuth| within max(12°, atan(0.3 m / distance)), a corridor 30 cm either side of the item): the ordinary beacon switches to bright pulses without a confirmation dwell; the beacon lock releases 8° outside that, and drifting off swaps to the plain beep at once. The special </w:t>
+      </w:r>
+      <w:r>
+        <w:rPr>
+          <w:b/>
+        </w:rPr>
+        <w:t>alignment confirmation</w:t>
+      </w:r>
+      <w:r>
+        <w:t xml:space="preserve"> is separate:</w:t>
+      </w:r>
+    </w:p>
+    <w:p>
+      <w:pPr>
+        <w:numPr>
+          <w:ilvl w:val="1"/>
+          <w:numId w:val="949"/>
+        </w:numPr>
+        <w:pStyle w:val="ListParagraph"/>
+      </w:pPr>
+      <w:r>
+        <w:t>hold inside the beam for 0.35 s to get one double ding and haptic;</w:t>
+      </w:r>
+    </w:p>
+    <w:p>
+      <w:pPr>
+        <w:numPr>
+          <w:ilvl w:val="1"/>
+          <w:numId w:val="949"/>
+        </w:numPr>
+        <w:pStyle w:val="ListParagraph"/>
+      </w:pPr>
+      <w:r>
+        <w:t>rearm only after remaining more than 15° outside the beam boundary for 0.7 s (27° from the target far away, wider up close), then returning for another 0.35 s dwell;</w:t>
+      </w:r>
+    </w:p>
+    <w:p>
+      <w:pPr>
+        <w:numPr>
+          <w:ilvl w:val="1"/>
+          <w:numId w:val="949"/>
+        </w:numPr>
+        <w:pStyle w:val="ListParagraph"/>
+      </w:pPr>
+      <w:r>
+        <w:t>leave at least 3 s between confirmation dings; holding alignment after cooldown alone does not repeat one;</w:t>
+      </w:r>
+    </w:p>
+    <w:p>
+      <w:pPr>
+        <w:numPr>
+          <w:ilvl w:val="1"/>
+          <w:numId w:val="949"/>
+        </w:numPr>
+        <w:pStyle w:val="ListParagraph"/>
+      </w:pPr>
+      <w:r>
+        <w:t>coordinate updates for the same target preserve the latch and cooldown; a new Find resets them;</w:t>
+      </w:r>
+    </w:p>
+    <w:p>
+      <w:pPr>
+        <w:numPr>
+          <w:ilvl w:val="1"/>
+          <w:numId w:val="949"/>
+        </w:numPr>
+        <w:pStyle w:val="ListParagraph"/>
+      </w:pPr>
+      <w:r>
+        <w:t>gaps longer than 0.2 s restart pending dwell timers. Confirmation pauses during the opening speech, arrival and hand guidance; these stages do not count toward dwell. Arrival and reach keep their own cues. Spatial placement and ordinary beeps still use the current angle every tick.</w:t>
       </w:r>
     </w:p>
     <w:p>
@@ -7741,7 +7810,7 @@
       <w:pPr>
         <w:numPr>
           <w:ilvl w:val="0"/>
-          <w:numId w:val="949"/>
+          <w:numId w:val="950"/>
         </w:numPr>
         <w:pStyle w:val="ListParagraph"/>
       </w:pPr>
@@ -7753,7 +7822,7 @@
       <w:pPr>
         <w:numPr>
           <w:ilvl w:val="0"/>
-          <w:numId w:val="949"/>
+          <w:numId w:val="950"/>
         </w:numPr>
         <w:pStyle w:val="ListParagraph"/>
       </w:pPr>
@@ -7765,7 +7834,7 @@
       <w:pPr>
         <w:numPr>
           <w:ilvl w:val="0"/>
-          <w:numId w:val="949"/>
+          <w:numId w:val="950"/>
         </w:numPr>
         <w:pStyle w:val="ListParagraph"/>
       </w:pPr>
@@ -7788,23 +7857,23 @@
       <w:pPr>
         <w:numPr>
           <w:ilvl w:val="0"/>
-          <w:numId w:val="949"/>
-        </w:numPr>
-        <w:pStyle w:val="ListParagraph"/>
-      </w:pPr>
-      <w:r>
-        <w:t>A 5-minute recorded session saved to disk in exactly these formats (frames, poses, hands), so Vedant can build against real data before the app is finished.</w:t>
-      </w:r>
-    </w:p>
-    <w:p>
-      <w:pPr>
-        <w:numPr>
-          <w:ilvl w:val="1"/>
           <w:numId w:val="950"/>
         </w:numPr>
         <w:pStyle w:val="ListParagraph"/>
       </w:pPr>
       <w:r>
+        <w:t>A 5-minute recorded session saved to disk in exactly these formats (frames, poses, hands), so Vedant can build against real data before the app is finished.</w:t>
+      </w:r>
+    </w:p>
+    <w:p>
+      <w:pPr>
+        <w:numPr>
+          <w:ilvl w:val="1"/>
+          <w:numId w:val="951"/>
+        </w:numPr>
+        <w:pStyle w:val="ListParagraph"/>
+      </w:pPr>
+      <w:r>
         <w:t xml:space="preserve">The server records every session it receives under </w:t>
       </w:r>
       <w:r>
@@ -7823,7 +7892,7 @@
       <w:pPr>
         <w:numPr>
           <w:ilvl w:val="1"/>
-          <w:numId w:val="950"/>
+          <w:numId w:val="951"/>
         </w:numPr>
         <w:pStyle w:val="ListParagraph"/>
       </w:pPr>
@@ -7848,125 +7917,6 @@
           <w:b/>
         </w:rPr>
         <w:t>Utkarsh needs from Vedant:</w:t>
-      </w:r>
-    </w:p>
-    <w:p>
-      <w:pPr>
-        <w:numPr>
-          <w:ilvl w:val="0"/>
-          <w:numId w:val="951"/>
-        </w:numPr>
-        <w:pStyle w:val="ListParagraph"/>
-      </w:pPr>
-      <w:r>
-        <w:t xml:space="preserve">A stub server that accepts everything above and returns fake </w:t>
-      </w:r>
-      <w:r>
-        <w:rPr>
-          <w:rFonts w:ascii="Courier New" w:hAnsi="Courier New" w:eastAsia="Courier New" w:cs="Courier New"/>
-          <w:color w:val="374151"/>
-          <w:sz w:val="19"/>
-        </w:rPr>
-        <w:t>answer</w:t>
-      </w:r>
-      <w:r>
-        <w:t xml:space="preserve"> / </w:t>
-      </w:r>
-      <w:r>
-        <w:rPr>
-          <w:rFonts w:ascii="Courier New" w:hAnsi="Courier New" w:eastAsia="Courier New" w:cs="Courier New"/>
-          <w:color w:val="374151"/>
-          <w:sz w:val="19"/>
-        </w:rPr>
-        <w:t>touch</w:t>
-      </w:r>
-      <w:r>
-        <w:t xml:space="preserve"> / </w:t>
-      </w:r>
-      <w:r>
-        <w:rPr>
-          <w:rFonts w:ascii="Courier New" w:hAnsi="Courier New" w:eastAsia="Courier New" w:cs="Courier New"/>
-          <w:color w:val="374151"/>
-          <w:sz w:val="19"/>
-        </w:rPr>
-        <w:t>event</w:t>
-      </w:r>
-      <w:r>
-        <w:t xml:space="preserve"> messages (</w:t>
-      </w:r>
-      <w:r>
-        <w:rPr>
-          <w:rFonts w:ascii="Courier New" w:hAnsi="Courier New" w:eastAsia="Courier New" w:cs="Courier New"/>
-          <w:color w:val="374151"/>
-          <w:sz w:val="19"/>
-        </w:rPr>
-        <w:t>MARCO_MODE=stub</w:t>
-      </w:r>
-      <w:r>
-        <w:t>, the default).</w:t>
-      </w:r>
-    </w:p>
-    <w:p>
-      <w:pPr>
-        <w:numPr>
-          <w:ilvl w:val="0"/>
-          <w:numId w:val="951"/>
-        </w:numPr>
-        <w:pStyle w:val="ListParagraph"/>
-      </w:pPr>
-      <w:r>
-        <w:t>Then the real ones (</w:t>
-      </w:r>
-      <w:r>
-        <w:rPr>
-          <w:rFonts w:ascii="Courier New" w:hAnsi="Courier New" w:eastAsia="Courier New" w:cs="Courier New"/>
-          <w:color w:val="374151"/>
-          <w:sz w:val="19"/>
-        </w:rPr>
-        <w:t>MARCO_MODE=real</w:t>
-      </w:r>
-      <w:r>
-        <w:t>).</w:t>
-      </w:r>
-    </w:p>
-    <w:p>
-      <w:pPr>
-        <w:numPr>
-          <w:ilvl w:val="0"/>
-          <w:numId w:val="951"/>
-        </w:numPr>
-        <w:pStyle w:val="ListParagraph"/>
-      </w:pPr>
-      <w:r>
-        <w:t>Typed labels and the speech route (§3.5). Legacy label audio URLs remain optional compatibility fields.</w:t>
-      </w:r>
-    </w:p>
-    <w:p>
-      <w:pPr>
-        <w:numPr>
-          <w:ilvl w:val="0"/>
-          <w:numId w:val="951"/>
-        </w:numPr>
-        <w:pStyle w:val="ListParagraph"/>
-      </w:pPr>
-      <w:r>
-        <w:rPr>
-          <w:rFonts w:ascii="Courier New" w:hAnsi="Courier New" w:eastAsia="Courier New" w:cs="Courier New"/>
-          <w:color w:val="374151"/>
-          <w:sz w:val="19"/>
-        </w:rPr>
-        <w:t>label_request</w:t>
-      </w:r>
-      <w:r>
-        <w:t xml:space="preserve"> events for Photon.</w:t>
-      </w:r>
-    </w:p>
-    <w:p>
-      <w:r>
-        <w:rPr>
-          <w:b/>
-        </w:rPr>
-        <w:t>The dashboard needs from Vedant:</w:t>
       </w:r>
     </w:p>
     <w:p>
@@ -7978,7 +7928,7 @@
         <w:pStyle w:val="ListParagraph"/>
       </w:pPr>
       <w:r>
-        <w:t xml:space="preserve">the </w:t>
+        <w:t xml:space="preserve">A stub server that accepts everything above and returns fake </w:t>
       </w:r>
       <w:r>
         <w:rPr>
@@ -7986,10 +7936,10 @@
           <w:color w:val="374151"/>
           <w:sz w:val="19"/>
         </w:rPr>
-        <w:t>/v1/dashboard</w:t>
-      </w:r>
-      <w:r>
-        <w:t xml:space="preserve"> feed with recorded or fake data first (</w:t>
+        <w:t>answer</w:t>
+      </w:r>
+      <w:r>
+        <w:t xml:space="preserve"> / </w:t>
       </w:r>
       <w:r>
         <w:rPr>
@@ -7997,21 +7947,95 @@
           <w:color w:val="374151"/>
           <w:sz w:val="19"/>
         </w:rPr>
-        <w:t>server/tools/replay.py</w:t>
-      </w:r>
-      <w:r>
-        <w:t>), then live.</w:t>
+        <w:t>touch</w:t>
+      </w:r>
+      <w:r>
+        <w:t xml:space="preserve"> / </w:t>
+      </w:r>
+      <w:r>
+        <w:rPr>
+          <w:rFonts w:ascii="Courier New" w:hAnsi="Courier New" w:eastAsia="Courier New" w:cs="Courier New"/>
+          <w:color w:val="374151"/>
+          <w:sz w:val="19"/>
+        </w:rPr>
+        <w:t>event</w:t>
+      </w:r>
+      <w:r>
+        <w:t xml:space="preserve"> messages (</w:t>
+      </w:r>
+      <w:r>
+        <w:rPr>
+          <w:rFonts w:ascii="Courier New" w:hAnsi="Courier New" w:eastAsia="Courier New" w:cs="Courier New"/>
+          <w:color w:val="374151"/>
+          <w:sz w:val="19"/>
+        </w:rPr>
+        <w:t>MARCO_MODE=stub</w:t>
+      </w:r>
+      <w:r>
+        <w:t>, the default).</w:t>
       </w:r>
     </w:p>
     <w:p>
+      <w:pPr>
+        <w:numPr>
+          <w:ilvl w:val="0"/>
+          <w:numId w:val="952"/>
+        </w:numPr>
+        <w:pStyle w:val="ListParagraph"/>
+      </w:pPr>
+      <w:r>
+        <w:t>Then the real ones (</w:t>
+      </w:r>
+      <w:r>
+        <w:rPr>
+          <w:rFonts w:ascii="Courier New" w:hAnsi="Courier New" w:eastAsia="Courier New" w:cs="Courier New"/>
+          <w:color w:val="374151"/>
+          <w:sz w:val="19"/>
+        </w:rPr>
+        <w:t>MARCO_MODE=real</w:t>
+      </w:r>
+      <w:r>
+        <w:t>).</w:t>
+      </w:r>
+    </w:p>
+    <w:p>
+      <w:pPr>
+        <w:numPr>
+          <w:ilvl w:val="0"/>
+          <w:numId w:val="952"/>
+        </w:numPr>
+        <w:pStyle w:val="ListParagraph"/>
+      </w:pPr>
+      <w:r>
+        <w:t>Typed labels and the speech route (§3.5). Legacy label audio URLs remain optional compatibility fields.</w:t>
+      </w:r>
+    </w:p>
+    <w:p>
+      <w:pPr>
+        <w:numPr>
+          <w:ilvl w:val="0"/>
+          <w:numId w:val="952"/>
+        </w:numPr>
+        <w:pStyle w:val="ListParagraph"/>
+      </w:pPr>
+      <w:r>
+        <w:rPr>
+          <w:rFonts w:ascii="Courier New" w:hAnsi="Courier New" w:eastAsia="Courier New" w:cs="Courier New"/>
+          <w:color w:val="374151"/>
+          <w:sz w:val="19"/>
+        </w:rPr>
+        <w:t>label_request</w:t>
+      </w:r>
+      <w:r>
+        <w:t xml:space="preserve"> events for Photon.</w:t>
+      </w:r>
+    </w:p>
+    <w:p>
       <w:r>
         <w:rPr>
           <w:b/>
         </w:rPr>
-        <w:t>Everyone:</w:t>
-      </w:r>
-      <w:r>
-        <w:t xml:space="preserve"> the server is private:</w:t>
+        <w:t>The dashboard needs from Vedant:</w:t>
       </w:r>
     </w:p>
     <w:p>
@@ -8023,7 +8047,7 @@
         <w:pStyle w:val="ListParagraph"/>
       </w:pPr>
       <w:r>
-        <w:t xml:space="preserve">it binds 127.0.0.1 only and is reached through </w:t>
+        <w:t xml:space="preserve">the </w:t>
       </w:r>
       <w:r>
         <w:rPr>
@@ -8031,22 +8055,10 @@
           <w:color w:val="374151"/>
           <w:sz w:val="19"/>
         </w:rPr>
-        <w:t>tailscale serve</w:t>
-      </w:r>
-      <w:r>
-        <w:t>;</w:t>
-      </w:r>
-    </w:p>
-    <w:p>
-      <w:pPr>
-        <w:numPr>
-          <w:ilvl w:val="0"/>
-          <w:numId w:val="953"/>
-        </w:numPr>
-        <w:pStyle w:val="ListParagraph"/>
-      </w:pPr>
-      <w:r>
-        <w:t>every route goes through the fail-closed auth gate (</w:t>
+        <w:t>/v1/dashboard</w:t>
+      </w:r>
+      <w:r>
+        <w:t xml:space="preserve"> feed with recorded or fake data first (</w:t>
       </w:r>
       <w:r>
         <w:rPr>
@@ -8054,29 +8066,21 @@
           <w:color w:val="374151"/>
           <w:sz w:val="19"/>
         </w:rPr>
-        <w:t>server/marco/auth.py</w:t>
-      </w:r>
-      <w:r>
-        <w:t xml:space="preserve">), which admits only </w:t>
-      </w:r>
-      <w:r>
-        <w:rPr>
-          <w:rFonts w:ascii="Courier New" w:hAnsi="Courier New" w:eastAsia="Courier New" w:cs="Courier New"/>
-          <w:color w:val="374151"/>
-          <w:sz w:val="19"/>
-        </w:rPr>
-        <w:t>TAILSCALE_ALLOWED_LOGINS</w:t>
-      </w:r>
-      <w:r>
-        <w:t>.</w:t>
+        <w:t>server/tools/replay.py</w:t>
+      </w:r>
+      <w:r>
+        <w:t>), then live.</w:t>
       </w:r>
     </w:p>
     <w:p>
-      <w:pPr>
-        <w:pStyle w:val="Heading1"/>
-      </w:pPr>
-      <w:r>
-        <w:t>9. Integration order</w:t>
+      <w:r>
+        <w:rPr>
+          <w:b/>
+        </w:rPr>
+        <w:t>Everyone:</w:t>
+      </w:r>
+      <w:r>
+        <w:t xml:space="preserve"> the server is private:</w:t>
       </w:r>
     </w:p>
     <w:p>
@@ -8088,13 +8092,18 @@
         <w:pStyle w:val="ListParagraph"/>
       </w:pPr>
       <w:r>
-        <w:rPr>
-          <w:b/>
-        </w:rPr>
-        <w:t>Hour 0–2:</w:t>
-      </w:r>
-      <w:r>
-        <w:t xml:space="preserve"> agree this file. Vedant ships the stub server; Utkarsh gets the ARKit session and frame upload working; the dashboard renders fake feeds.</w:t>
+        <w:t xml:space="preserve">it binds 127.0.0.1 only and is reached through </w:t>
+      </w:r>
+      <w:r>
+        <w:rPr>
+          <w:rFonts w:ascii="Courier New" w:hAnsi="Courier New" w:eastAsia="Courier New" w:cs="Courier New"/>
+          <w:color w:val="374151"/>
+          <w:sz w:val="19"/>
+        </w:rPr>
+        <w:t>tailscale serve</w:t>
+      </w:r>
+      <w:r>
+        <w:t>;</w:t>
       </w:r>
     </w:p>
     <w:p>
@@ -8106,101 +8115,161 @@
         <w:pStyle w:val="ListParagraph"/>
       </w:pPr>
       <w:r>
-        <w:rPr>
-          <w:b/>
-        </w:rPr>
-        <w:t>Then:</w:t>
-      </w:r>
-      <w:r>
-        <w:t xml:space="preserve"> the recorded 5-minute session from the vest. Vedant runs the real pipeline on it offline; the dashboard replays it.</w:t>
+        <w:t>every route goes through the fail-closed auth gate (</w:t>
+      </w:r>
+      <w:r>
+        <w:rPr>
+          <w:rFonts w:ascii="Courier New" w:hAnsi="Courier New" w:eastAsia="Courier New" w:cs="Courier New"/>
+          <w:color w:val="374151"/>
+          <w:sz w:val="19"/>
+        </w:rPr>
+        <w:t>server/marco/auth.py</w:t>
+      </w:r>
+      <w:r>
+        <w:t xml:space="preserve">), which admits only </w:t>
+      </w:r>
+      <w:r>
+        <w:rPr>
+          <w:rFonts w:ascii="Courier New" w:hAnsi="Courier New" w:eastAsia="Courier New" w:cs="Courier New"/>
+          <w:color w:val="374151"/>
+          <w:sz w:val="19"/>
+        </w:rPr>
+        <w:t>TAILSCALE_ALLOWED_LOGINS</w:t>
+      </w:r>
+      <w:r>
+        <w:t>.</w:t>
       </w:r>
     </w:p>
     <w:p>
       <w:pPr>
+        <w:pStyle w:val="Heading1"/>
+      </w:pPr>
+      <w:r>
+        <w:t>9. Integration order</w:t>
+      </w:r>
+    </w:p>
+    <w:p>
+      <w:pPr>
         <w:numPr>
           <w:ilvl w:val="0"/>
-          <w:numId w:val="954"/>
-        </w:numPr>
-        <w:pStyle w:val="ListParagraph"/>
-      </w:pPr>
-      <w:r>
-        <w:rPr>
-          <w:b/>
-        </w:rPr>
-        <w:t>First live path:</w:t>
-      </w:r>
-      <w:r>
-        <w:t xml:space="preserve"> register keys, put them down, ask "where are my keys?", and follow the sound to them, end to end.</w:t>
-      </w:r>
-    </w:p>
-    <w:p>
-      <w:pPr>
-        <w:numPr>
-          <w:ilvl w:val="0"/>
-          <w:numId w:val="954"/>
-        </w:numPr>
-        <w:pStyle w:val="ListParagraph"/>
-      </w:pPr>
-      <w:r>
-        <w:rPr>
-          <w:b/>
-        </w:rPr>
-        <w:t>Then:</w:t>
-      </w:r>
-    </w:p>
-    <w:p>
-      <w:pPr>
-        <w:numPr>
-          <w:ilvl w:val="1"/>
           <w:numId w:val="955"/>
         </w:numPr>
         <w:pStyle w:val="ListParagraph"/>
       </w:pPr>
       <w:r>
-        <w:t>touch and "what is this?" with Photon labeling;</w:t>
+        <w:rPr>
+          <w:b/>
+        </w:rPr>
+        <w:t>Hour 0–2:</w:t>
+      </w:r>
+      <w:r>
+        <w:t xml:space="preserve"> agree this file. Vedant ships the stub server; Utkarsh gets the ARKit session and frame upload working; the dashboard renders fake feeds.</w:t>
       </w:r>
     </w:p>
     <w:p>
       <w:pPr>
         <w:numPr>
-          <w:ilvl w:val="1"/>
+          <w:ilvl w:val="0"/>
           <w:numId w:val="955"/>
         </w:numPr>
         <w:pStyle w:val="ListParagraph"/>
       </w:pPr>
       <w:r>
-        <w:t>moved and left-behind events;</w:t>
+        <w:rPr>
+          <w:b/>
+        </w:rPr>
+        <w:t>Then:</w:t>
+      </w:r>
+      <w:r>
+        <w:t xml:space="preserve"> the recorded 5-minute session from the vest. Vedant runs the real pipeline on it offline; the dashboard replays it.</w:t>
       </w:r>
     </w:p>
     <w:p>
       <w:pPr>
         <w:numPr>
-          <w:ilvl w:val="1"/>
+          <w:ilvl w:val="0"/>
           <w:numId w:val="955"/>
         </w:numPr>
         <w:pStyle w:val="ListParagraph"/>
       </w:pPr>
       <w:r>
-        <w:t>relaunch persistence.</w:t>
+        <w:rPr>
+          <w:b/>
+        </w:rPr>
+        <w:t>First live path:</w:t>
+      </w:r>
+      <w:r>
+        <w:t xml:space="preserve"> register keys, put them down, ask "where are my keys?", and follow the sound to them, end to end.</w:t>
       </w:r>
     </w:p>
     <w:p>
       <w:pPr>
-        <w:pStyle w:val="Heading1"/>
-      </w:pPr>
-      <w:r>
-        <w:t>10. Open questions (decide together)</w:t>
+        <w:numPr>
+          <w:ilvl w:val="0"/>
+          <w:numId w:val="955"/>
+        </w:numPr>
+        <w:pStyle w:val="ListParagraph"/>
+      </w:pPr>
+      <w:r>
+        <w:rPr>
+          <w:b/>
+        </w:rPr>
+        <w:t>Then:</w:t>
       </w:r>
     </w:p>
     <w:p>
       <w:pPr>
         <w:numPr>
-          <w:ilvl w:val="0"/>
+          <w:ilvl w:val="1"/>
           <w:numId w:val="956"/>
         </w:numPr>
         <w:pStyle w:val="ListParagraph"/>
       </w:pPr>
       <w:r>
+        <w:t>touch and "what is this?" with Photon labeling;</w:t>
+      </w:r>
+    </w:p>
+    <w:p>
+      <w:pPr>
+        <w:numPr>
+          <w:ilvl w:val="1"/>
+          <w:numId w:val="956"/>
+        </w:numPr>
+        <w:pStyle w:val="ListParagraph"/>
+      </w:pPr>
+      <w:r>
+        <w:t>moved and left-behind events;</w:t>
+      </w:r>
+    </w:p>
+    <w:p>
+      <w:pPr>
+        <w:numPr>
+          <w:ilvl w:val="1"/>
+          <w:numId w:val="956"/>
+        </w:numPr>
+        <w:pStyle w:val="ListParagraph"/>
+      </w:pPr>
+      <w:r>
+        <w:t>relaunch persistence.</w:t>
+      </w:r>
+    </w:p>
+    <w:p>
+      <w:pPr>
+        <w:pStyle w:val="Heading1"/>
+      </w:pPr>
+      <w:r>
+        <w:t>10. Open questions (decide together)</w:t>
+      </w:r>
+    </w:p>
+    <w:p>
+      <w:pPr>
+        <w:numPr>
+          <w:ilvl w:val="0"/>
+          <w:numId w:val="957"/>
+        </w:numPr>
+        <w:pStyle w:val="ListParagraph"/>
+      </w:pPr>
+      <w:r>
         <w:rPr>
           <w:b/>
         </w:rPr>
@@ -8236,7 +8305,7 @@
       <w:pPr>
         <w:numPr>
           <w:ilvl w:val="0"/>
-          <w:numId w:val="956"/>
+          <w:numId w:val="957"/>
         </w:numPr>
         <w:pStyle w:val="ListParagraph"/>
       </w:pPr>
@@ -8276,7 +8345,7 @@
       <w:pPr>
         <w:numPr>
           <w:ilvl w:val="0"/>
-          <w:numId w:val="956"/>
+          <w:numId w:val="957"/>
         </w:numPr>
         <w:pStyle w:val="ListParagraph"/>
       </w:pPr>
@@ -8294,7 +8363,7 @@
       <w:pPr>
         <w:numPr>
           <w:ilvl w:val="0"/>
-          <w:numId w:val="956"/>
+          <w:numId w:val="957"/>
         </w:numPr>
         <w:pStyle w:val="ListParagraph"/>
       </w:pPr>
@@ -8334,7 +8403,7 @@
       <w:pPr>
         <w:numPr>
           <w:ilvl w:val="1"/>
-          <w:numId w:val="957"/>
+          <w:numId w:val="958"/>
         </w:numPr>
         <w:pStyle w:val="ListParagraph"/>
       </w:pPr>
@@ -8407,7 +8476,7 @@
       <w:pPr>
         <w:numPr>
           <w:ilvl w:val="1"/>
-          <w:numId w:val="957"/>
+          <w:numId w:val="958"/>
         </w:numPr>
         <w:pStyle w:val="ListParagraph"/>
       </w:pPr>
@@ -8477,7 +8546,7 @@
       <w:pPr>
         <w:numPr>
           <w:ilvl w:val="0"/>
-          <w:numId w:val="958"/>
+          <w:numId w:val="959"/>
         </w:numPr>
         <w:pStyle w:val="ListParagraph"/>
       </w:pPr>
@@ -8506,7 +8575,7 @@
       <w:pPr>
         <w:numPr>
           <w:ilvl w:val="0"/>
-          <w:numId w:val="958"/>
+          <w:numId w:val="959"/>
         </w:numPr>
         <w:pStyle w:val="ListParagraph"/>
       </w:pPr>
@@ -8524,7 +8593,7 @@
       <w:pPr>
         <w:numPr>
           <w:ilvl w:val="0"/>
-          <w:numId w:val="958"/>
+          <w:numId w:val="959"/>
         </w:numPr>
         <w:pStyle w:val="ListParagraph"/>
       </w:pPr>
@@ -8553,7 +8622,7 @@
       <w:pPr>
         <w:numPr>
           <w:ilvl w:val="0"/>
-          <w:numId w:val="958"/>
+          <w:numId w:val="959"/>
         </w:numPr>
         <w:pStyle w:val="ListParagraph"/>
       </w:pPr>
@@ -8582,27 +8651,27 @@
       <w:pPr>
         <w:numPr>
           <w:ilvl w:val="0"/>
-          <w:numId w:val="958"/>
-        </w:numPr>
-        <w:pStyle w:val="ListParagraph"/>
-      </w:pPr>
-      <w:r>
-        <w:rPr>
-          <w:b/>
-        </w:rPr>
-        <w:t>Find answers:</w:t>
-      </w:r>
-    </w:p>
-    <w:p>
-      <w:pPr>
-        <w:numPr>
-          <w:ilvl w:val="1"/>
           <w:numId w:val="959"/>
         </w:numPr>
         <w:pStyle w:val="ListParagraph"/>
       </w:pPr>
       <w:r>
         <w:rPr>
+          <w:b/>
+        </w:rPr>
+        <w:t>Find answers:</w:t>
+      </w:r>
+    </w:p>
+    <w:p>
+      <w:pPr>
+        <w:numPr>
+          <w:ilvl w:val="1"/>
+          <w:numId w:val="960"/>
+        </w:numPr>
+        <w:pStyle w:val="ListParagraph"/>
+      </w:pPr>
+      <w:r>
+        <w:rPr>
           <w:rFonts w:ascii="Courier New" w:hAnsi="Courier New" w:eastAsia="Courier New" w:cs="Courier New"/>
           <w:color w:val="374151"/>
           <w:sz w:val="19"/>
@@ -8628,20 +8697,94 @@
       <w:pPr>
         <w:numPr>
           <w:ilvl w:val="1"/>
+          <w:numId w:val="960"/>
+        </w:numPr>
+        <w:pStyle w:val="ListParagraph"/>
+      </w:pPr>
+      <w:r>
+        <w:rPr>
+          <w:rFonts w:ascii="Courier New" w:hAnsi="Courier New" w:eastAsia="Courier New" w:cs="Courier New"/>
+          <w:color w:val="374151"/>
+          <w:sz w:val="19"/>
+        </w:rPr>
+        <w:t>not_where_last_seen</w:t>
+      </w:r>
+      <w:r>
+        <w:t xml:space="preserve"> carries </w:t>
+      </w:r>
+      <w:r>
+        <w:rPr>
+          <w:rFonts w:ascii="Courier New" w:hAnsi="Courier New" w:eastAsia="Courier New" w:cs="Courier New"/>
+          <w:color w:val="374151"/>
+          <w:sz w:val="19"/>
+        </w:rPr>
+        <w:t>last_position</w:t>
+      </w:r>
+      <w:r>
+        <w:t xml:space="preserve"> and </w:t>
+      </w:r>
+      <w:r>
+        <w:rPr>
+          <w:rFonts w:ascii="Courier New" w:hAnsi="Courier New" w:eastAsia="Courier New" w:cs="Courier New"/>
+          <w:color w:val="374151"/>
+          <w:sz w:val="19"/>
+        </w:rPr>
+        <w:t>surface</w:t>
+      </w:r>
+      <w:r>
+        <w:t>;</w:t>
+      </w:r>
+    </w:p>
+    <w:p>
+      <w:pPr>
+        <w:numPr>
+          <w:ilvl w:val="1"/>
+          <w:numId w:val="960"/>
+        </w:numPr>
+        <w:pStyle w:val="ListParagraph"/>
+      </w:pPr>
+      <w:r>
+        <w:t xml:space="preserve">found answers carry </w:t>
+      </w:r>
+      <w:r>
+        <w:rPr>
+          <w:rFonts w:ascii="Courier New" w:hAnsi="Courier New" w:eastAsia="Courier New" w:cs="Courier New"/>
+          <w:color w:val="374151"/>
+          <w:sz w:val="19"/>
+        </w:rPr>
+        <w:t>state</w:t>
+      </w:r>
+      <w:r>
+        <w:t>.</w:t>
+      </w:r>
+    </w:p>
+    <w:p>
+      <w:pPr>
+        <w:numPr>
+          <w:ilvl w:val="0"/>
           <w:numId w:val="959"/>
         </w:numPr>
         <w:pStyle w:val="ListParagraph"/>
       </w:pPr>
       <w:r>
         <w:rPr>
+          <w:b/>
+        </w:rPr>
+        <w:t>Event kinds:</w:t>
+      </w:r>
+      <w:r>
+        <w:t xml:space="preserve"> added </w:t>
+      </w:r>
+      <w:r>
+        <w:rPr>
           <w:rFonts w:ascii="Courier New" w:hAnsi="Courier New" w:eastAsia="Courier New" w:cs="Courier New"/>
           <w:color w:val="374151"/>
           <w:sz w:val="19"/>
         </w:rPr>
-        <w:t>not_where_last_seen</w:t>
-      </w:r>
-      <w:r>
-        <w:t xml:space="preserve"> carries </w:t>
+        <w:t>seen</w:t>
+      </w:r>
+      <w:r>
+        <w:t xml:space="preserve">, </w:t>
       </w:r>
       <w:r>
         <w:rPr>
@@ -8649,7 +8792,7 @@
           <w:color w:val="374151"/>
           <w:sz w:val="19"/>
         </w:rPr>
-        <w:t>last_position</w:t>
+        <w:t>missing</w:t>
       </w:r>
       <w:r>
         <w:t xml:space="preserve"> and </w:t>
@@ -8660,22 +8803,28 @@
           <w:color w:val="374151"/>
           <w:sz w:val="19"/>
         </w:rPr>
-        <w:t>surface</w:t>
-      </w:r>
-      <w:r>
-        <w:t>;</w:t>
+        <w:t>label_added</w:t>
+      </w:r>
+      <w:r>
+        <w:t>.</w:t>
       </w:r>
     </w:p>
     <w:p>
       <w:pPr>
         <w:numPr>
-          <w:ilvl w:val="1"/>
+          <w:ilvl w:val="0"/>
           <w:numId w:val="959"/>
         </w:numPr>
         <w:pStyle w:val="ListParagraph"/>
       </w:pPr>
       <w:r>
-        <w:t xml:space="preserve">found answers carry </w:t>
+        <w:rPr>
+          <w:b/>
+        </w:rPr>
+        <w:t>`POST /v1/labels`:</w:t>
+      </w:r>
+      <w:r>
+        <w:t xml:space="preserve"> takes </w:t>
       </w:r>
       <w:r>
         <w:rPr>
@@ -8683,28 +8832,10 @@
           <w:color w:val="374151"/>
           <w:sz w:val="19"/>
         </w:rPr>
-        <w:t>state</w:t>
-      </w:r>
-      <w:r>
-        <w:t>.</w:t>
-      </w:r>
-    </w:p>
-    <w:p>
-      <w:pPr>
-        <w:numPr>
-          <w:ilvl w:val="0"/>
-          <w:numId w:val="958"/>
-        </w:numPr>
-        <w:pStyle w:val="ListParagraph"/>
-      </w:pPr>
-      <w:r>
-        <w:rPr>
-          <w:b/>
-        </w:rPr>
-        <w:t>Event kinds:</w:t>
-      </w:r>
-      <w:r>
-        <w:t xml:space="preserve"> added </w:t>
+        <w:t>text</w:t>
+      </w:r>
+      <w:r>
+        <w:t xml:space="preserve">, and </w:t>
       </w:r>
       <w:r>
         <w:rPr>
@@ -8712,10 +8843,10 @@
           <w:color w:val="374151"/>
           <w:sz w:val="19"/>
         </w:rPr>
-        <w:t>seen</w:t>
-      </w:r>
-      <w:r>
-        <w:t xml:space="preserve">, </w:t>
+        <w:t>item_id</w:t>
+      </w:r>
+      <w:r>
+        <w:t xml:space="preserve"> for a follow-up voice note; it returns </w:t>
       </w:r>
       <w:r>
         <w:rPr>
@@ -8723,10 +8854,90 @@
           <w:color w:val="374151"/>
           <w:sz w:val="19"/>
         </w:rPr>
-        <w:t>missing</w:t>
-      </w:r>
-      <w:r>
-        <w:t xml:space="preserve"> and </w:t>
+        <w:t>item_id</w:t>
+      </w:r>
+      <w:r>
+        <w:t>.</w:t>
+      </w:r>
+    </w:p>
+    <w:p>
+      <w:pPr>
+        <w:numPr>
+          <w:ilvl w:val="0"/>
+          <w:numId w:val="959"/>
+        </w:numPr>
+        <w:pStyle w:val="ListParagraph"/>
+      </w:pPr>
+      <w:r>
+        <w:rPr>
+          <w:b/>
+        </w:rPr>
+        <w:t>`GET /v1/items` fields</w:t>
+      </w:r>
+      <w:r>
+        <w:t xml:space="preserve"> are listed.</w:t>
+      </w:r>
+    </w:p>
+    <w:p>
+      <w:pPr>
+        <w:numPr>
+          <w:ilvl w:val="0"/>
+          <w:numId w:val="959"/>
+        </w:numPr>
+        <w:pStyle w:val="ListParagraph"/>
+      </w:pPr>
+      <w:r>
+        <w:rPr>
+          <w:b/>
+        </w:rPr>
+        <w:t>§7:</w:t>
+      </w:r>
+      <w:r>
+        <w:t xml:space="preserve"> directions are relative to the body and sound to the head; there is a "within reach" line, the facing lock releases past 20°, and the steady tone releases above 40 cm.</w:t>
+      </w:r>
+    </w:p>
+    <w:p>
+      <w:pPr>
+        <w:numPr>
+          <w:ilvl w:val="0"/>
+          <w:numId w:val="959"/>
+        </w:numPr>
+        <w:pStyle w:val="ListParagraph"/>
+      </w:pPr>
+      <w:r>
+        <w:rPr>
+          <w:b/>
+        </w:rPr>
+        <w:t>"Getting my bearings."</w:t>
+      </w:r>
+      <w:r>
+        <w:t xml:space="preserve"> replaces "Marco is getting its bearings."</w:t>
+      </w:r>
+    </w:p>
+    <w:p>
+      <w:pPr>
+        <w:pStyle w:val="Heading1"/>
+      </w:pPr>
+      <w:r>
+        <w:t>12. Changes since v0.2</w:t>
+      </w:r>
+    </w:p>
+    <w:p>
+      <w:pPr>
+        <w:numPr>
+          <w:ilvl w:val="0"/>
+          <w:numId w:val="961"/>
+        </w:numPr>
+        <w:pStyle w:val="ListParagraph"/>
+      </w:pPr>
+      <w:r>
+        <w:rPr>
+          <w:b/>
+        </w:rPr>
+        <w:t>Registrations and labels persist</w:t>
+      </w:r>
+      <w:r>
+        <w:t xml:space="preserve"> across server restarts (§3.3), under </w:t>
       </w:r>
       <w:r>
         <w:rPr>
@@ -8734,7 +8945,7 @@
           <w:color w:val="374151"/>
           <w:sz w:val="19"/>
         </w:rPr>
-        <w:t>label_added</w:t>
+        <w:t>MARCO_DATA/registry/</w:t>
       </w:r>
       <w:r>
         <w:t>.</w:t>
@@ -8744,7 +8955,7 @@
       <w:pPr>
         <w:numPr>
           <w:ilvl w:val="0"/>
-          <w:numId w:val="958"/>
+          <w:numId w:val="961"/>
         </w:numPr>
         <w:pStyle w:val="ListParagraph"/>
       </w:pPr>
@@ -8752,10 +8963,19 @@
         <w:rPr>
           <w:b/>
         </w:rPr>
-        <w:t>`POST /v1/labels`:</w:t>
-      </w:r>
-      <w:r>
-        <w:t xml:space="preserve"> takes </w:t>
+        <w:t>`source`:</w:t>
+      </w:r>
+    </w:p>
+    <w:p>
+      <w:pPr>
+        <w:numPr>
+          <w:ilvl w:val="1"/>
+          <w:numId w:val="962"/>
+        </w:numPr>
+        <w:pStyle w:val="ListParagraph"/>
+      </w:pPr>
+      <w:r>
+        <w:t xml:space="preserve">optional on </w:t>
       </w:r>
       <w:r>
         <w:rPr>
@@ -8763,10 +8983,10 @@
           <w:color w:val="374151"/>
           <w:sz w:val="19"/>
         </w:rPr>
-        <w:t>text</w:t>
-      </w:r>
-      <w:r>
-        <w:t xml:space="preserve">, and </w:t>
+        <w:t>POST /v1/items</w:t>
+      </w:r>
+      <w:r>
+        <w:t xml:space="preserve"> (default </w:t>
       </w:r>
       <w:r>
         <w:rPr>
@@ -8774,10 +8994,10 @@
           <w:color w:val="374151"/>
           <w:sz w:val="19"/>
         </w:rPr>
-        <w:t>item_id</w:t>
-      </w:r>
-      <w:r>
-        <w:t xml:space="preserve"> for a follow-up voice note; it returns </w:t>
+        <w:t>app</w:t>
+      </w:r>
+      <w:r>
+        <w:t xml:space="preserve">) and </w:t>
       </w:r>
       <w:r>
         <w:rPr>
@@ -8785,90 +9005,10 @@
           <w:color w:val="374151"/>
           <w:sz w:val="19"/>
         </w:rPr>
-        <w:t>item_id</w:t>
-      </w:r>
-      <w:r>
-        <w:t>.</w:t>
-      </w:r>
-    </w:p>
-    <w:p>
-      <w:pPr>
-        <w:numPr>
-          <w:ilvl w:val="0"/>
-          <w:numId w:val="958"/>
-        </w:numPr>
-        <w:pStyle w:val="ListParagraph"/>
-      </w:pPr>
-      <w:r>
-        <w:rPr>
-          <w:b/>
-        </w:rPr>
-        <w:t>`GET /v1/items` fields</w:t>
-      </w:r>
-      <w:r>
-        <w:t xml:space="preserve"> are listed.</w:t>
-      </w:r>
-    </w:p>
-    <w:p>
-      <w:pPr>
-        <w:numPr>
-          <w:ilvl w:val="0"/>
-          <w:numId w:val="958"/>
-        </w:numPr>
-        <w:pStyle w:val="ListParagraph"/>
-      </w:pPr>
-      <w:r>
-        <w:rPr>
-          <w:b/>
-        </w:rPr>
-        <w:t>§7:</w:t>
-      </w:r>
-      <w:r>
-        <w:t xml:space="preserve"> directions are relative to the body and sound to the head; there is a "within reach" line, the facing lock releases past 20°, and the steady tone releases above 40 cm.</w:t>
-      </w:r>
-    </w:p>
-    <w:p>
-      <w:pPr>
-        <w:numPr>
-          <w:ilvl w:val="0"/>
-          <w:numId w:val="958"/>
-        </w:numPr>
-        <w:pStyle w:val="ListParagraph"/>
-      </w:pPr>
-      <w:r>
-        <w:rPr>
-          <w:b/>
-        </w:rPr>
-        <w:t>"Getting my bearings."</w:t>
-      </w:r>
-      <w:r>
-        <w:t xml:space="preserve"> replaces "Marco is getting its bearings."</w:t>
-      </w:r>
-    </w:p>
-    <w:p>
-      <w:pPr>
-        <w:pStyle w:val="Heading1"/>
-      </w:pPr>
-      <w:r>
-        <w:t>12. Changes since v0.2</w:t>
-      </w:r>
-    </w:p>
-    <w:p>
-      <w:pPr>
-        <w:numPr>
-          <w:ilvl w:val="0"/>
-          <w:numId w:val="960"/>
-        </w:numPr>
-        <w:pStyle w:val="ListParagraph"/>
-      </w:pPr>
-      <w:r>
-        <w:rPr>
-          <w:b/>
-        </w:rPr>
-        <w:t>Registrations and labels persist</w:t>
-      </w:r>
-      <w:r>
-        <w:t xml:space="preserve"> across server restarts (§3.3), under </w:t>
+        <w:t>POST /v1/labels</w:t>
+      </w:r>
+      <w:r>
+        <w:t xml:space="preserve"> (default </w:t>
       </w:r>
       <w:r>
         <w:rPr>
@@ -8876,37 +9016,51 @@
           <w:color w:val="374151"/>
           <w:sz w:val="19"/>
         </w:rPr>
-        <w:t>MARCO_DATA/registry/</w:t>
-      </w:r>
-      <w:r>
-        <w:t>.</w:t>
+        <w:t>photon</w:t>
+      </w:r>
+      <w:r>
+        <w:t>);</w:t>
       </w:r>
     </w:p>
     <w:p>
       <w:pPr>
         <w:numPr>
-          <w:ilvl w:val="0"/>
-          <w:numId w:val="960"/>
+          <w:ilvl w:val="1"/>
+          <w:numId w:val="962"/>
         </w:numPr>
         <w:pStyle w:val="ListParagraph"/>
       </w:pPr>
       <w:r>
-        <w:rPr>
-          <w:b/>
-        </w:rPr>
-        <w:t>`source`:</w:t>
+        <w:t xml:space="preserve">listed in </w:t>
+      </w:r>
+      <w:r>
+        <w:rPr>
+          <w:rFonts w:ascii="Courier New" w:hAnsi="Courier New" w:eastAsia="Courier New" w:cs="Courier New"/>
+          <w:color w:val="374151"/>
+          <w:sz w:val="19"/>
+        </w:rPr>
+        <w:t>GET /v1/items</w:t>
+      </w:r>
+      <w:r>
+        <w:t>.</w:t>
       </w:r>
     </w:p>
     <w:p>
       <w:pPr>
         <w:numPr>
-          <w:ilvl w:val="1"/>
+          <w:ilvl w:val="0"/>
           <w:numId w:val="961"/>
         </w:numPr>
         <w:pStyle w:val="ListParagraph"/>
       </w:pPr>
       <w:r>
-        <w:t xml:space="preserve">optional on </w:t>
+        <w:rPr>
+          <w:b/>
+        </w:rPr>
+        <w:t>New route</w:t>
+      </w:r>
+      <w:r>
+        <w:t xml:space="preserve"> </w:t>
       </w:r>
       <w:r>
         <w:rPr>
@@ -8914,10 +9068,10 @@
           <w:color w:val="374151"/>
           <w:sz w:val="19"/>
         </w:rPr>
-        <w:t>POST /v1/items</w:t>
-      </w:r>
-      <w:r>
-        <w:t xml:space="preserve"> (default </w:t>
+        <w:t>DELETE /v1/items?source=…</w:t>
+      </w:r>
+      <w:r>
+        <w:t xml:space="preserve">, which forgets one source's items. Photon's </w:t>
       </w:r>
       <w:r>
         <w:rPr>
@@ -8925,10 +9079,28 @@
           <w:color w:val="374151"/>
           <w:sz w:val="19"/>
         </w:rPr>
-        <w:t>app</w:t>
-      </w:r>
-      <w:r>
-        <w:t xml:space="preserve">) and </w:t>
+        <w:t>/restart</w:t>
+      </w:r>
+      <w:r>
+        <w:t xml:space="preserve"> command uses it (§5).</w:t>
+      </w:r>
+    </w:p>
+    <w:p>
+      <w:pPr>
+        <w:numPr>
+          <w:ilvl w:val="0"/>
+          <w:numId w:val="961"/>
+        </w:numPr>
+        <w:pStyle w:val="ListParagraph"/>
+      </w:pPr>
+      <w:r>
+        <w:rPr>
+          <w:b/>
+        </w:rPr>
+        <w:t>Dashboard API</w:t>
+      </w:r>
+      <w:r>
+        <w:t xml:space="preserve"> (§6): </w:t>
       </w:r>
       <w:r>
         <w:rPr>
@@ -8936,10 +9108,10 @@
           <w:color w:val="374151"/>
           <w:sz w:val="19"/>
         </w:rPr>
-        <w:t>POST /v1/labels</w:t>
-      </w:r>
-      <w:r>
-        <w:t xml:space="preserve"> (default </w:t>
+        <w:t>GET /dashboard/snapshot</w:t>
+      </w:r>
+      <w:r>
+        <w:t xml:space="preserve">, </w:t>
       </w:r>
       <w:r>
         <w:rPr>
@@ -8947,22 +9119,72 @@
           <w:color w:val="374151"/>
           <w:sz w:val="19"/>
         </w:rPr>
-        <w:t>photon</w:t>
-      </w:r>
-      <w:r>
-        <w:t>);</w:t>
+        <w:t>WS /events</w:t>
+      </w:r>
+      <w:r>
+        <w:t xml:space="preserve">, </w:t>
+      </w:r>
+      <w:r>
+        <w:rPr>
+          <w:rFonts w:ascii="Courier New" w:hAnsi="Courier New" w:eastAsia="Courier New" w:cs="Courier New"/>
+          <w:color w:val="374151"/>
+          <w:sz w:val="19"/>
+        </w:rPr>
+        <w:t>POST /dashboard/commands</w:t>
+      </w:r>
+      <w:r>
+        <w:t xml:space="preserve">, </w:t>
+      </w:r>
+      <w:r>
+        <w:rPr>
+          <w:rFonts w:ascii="Courier New" w:hAnsi="Courier New" w:eastAsia="Courier New" w:cs="Courier New"/>
+          <w:color w:val="374151"/>
+          <w:sz w:val="19"/>
+        </w:rPr>
+        <w:t>GET /media/…</w:t>
+      </w:r>
+      <w:r>
+        <w:t xml:space="preserve"> and </w:t>
+      </w:r>
+      <w:r>
+        <w:rPr>
+          <w:rFonts w:ascii="Courier New" w:hAnsi="Courier New" w:eastAsia="Courier New" w:cs="Courier New"/>
+          <w:color w:val="374151"/>
+          <w:sz w:val="19"/>
+        </w:rPr>
+        <w:t>/app/…</w:t>
+      </w:r>
+      <w:r>
+        <w:t xml:space="preserve">, each also under </w:t>
+      </w:r>
+      <w:r>
+        <w:rPr>
+          <w:rFonts w:ascii="Courier New" w:hAnsi="Courier New" w:eastAsia="Courier New" w:cs="Courier New"/>
+          <w:color w:val="374151"/>
+          <w:sz w:val="19"/>
+        </w:rPr>
+        <w:t>/api/…</w:t>
+      </w:r>
+      <w:r>
+        <w:t>, all behind the auth gate.</w:t>
       </w:r>
     </w:p>
     <w:p>
       <w:pPr>
         <w:numPr>
-          <w:ilvl w:val="1"/>
+          <w:ilvl w:val="0"/>
           <w:numId w:val="961"/>
         </w:numPr>
         <w:pStyle w:val="ListParagraph"/>
       </w:pPr>
       <w:r>
-        <w:t xml:space="preserve">listed in </w:t>
+        <w:rPr>
+          <w:b/>
+        </w:rPr>
+        <w:t>New phone messages for dashboard Find and Stop:</w:t>
+      </w:r>
+      <w:r>
+        <w:t xml:space="preserve"> </w:t>
       </w:r>
       <w:r>
         <w:rPr>
@@ -8970,28 +9192,10 @@
           <w:color w:val="374151"/>
           <w:sz w:val="19"/>
         </w:rPr>
-        <w:t>GET /v1/items</w:t>
-      </w:r>
-      <w:r>
-        <w:t>.</w:t>
-      </w:r>
-    </w:p>
-    <w:p>
-      <w:pPr>
-        <w:numPr>
-          <w:ilvl w:val="0"/>
-          <w:numId w:val="960"/>
-        </w:numPr>
-        <w:pStyle w:val="ListParagraph"/>
-      </w:pPr>
-      <w:r>
-        <w:rPr>
-          <w:b/>
-        </w:rPr>
-        <w:t>New route</w:t>
-      </w:r>
-      <w:r>
-        <w:t xml:space="preserve"> </w:t>
+        <w:t>command</w:t>
+      </w:r>
+      <w:r>
+        <w:t xml:space="preserve"> (server to phone, §4) and </w:t>
       </w:r>
       <w:r>
         <w:rPr>
@@ -8999,10 +9203,36 @@
           <w:color w:val="374151"/>
           <w:sz w:val="19"/>
         </w:rPr>
-        <w:t>DELETE /v1/items?source=…</w:t>
-      </w:r>
-      <w:r>
-        <w:t xml:space="preserve">, which forgets one source's items. Photon's </w:t>
+        <w:t>command_ack</w:t>
+      </w:r>
+      <w:r>
+        <w:t xml:space="preserve"> (phone to server, §3.2).</w:t>
+      </w:r>
+    </w:p>
+    <w:p>
+      <w:pPr>
+        <w:pStyle w:val="Heading1"/>
+      </w:pPr>
+      <w:r>
+        <w:t>13. Changes since v0.3</w:t>
+      </w:r>
+    </w:p>
+    <w:p>
+      <w:pPr>
+        <w:numPr>
+          <w:ilvl w:val="0"/>
+          <w:numId w:val="963"/>
+        </w:numPr>
+        <w:pStyle w:val="ListParagraph"/>
+      </w:pPr>
+      <w:r>
+        <w:rPr>
+          <w:b/>
+        </w:rPr>
+        <w:t>Output-only ElevenLabs:</w:t>
+      </w:r>
+      <w:r>
+        <w:t xml:space="preserve"> authenticated </w:t>
       </w:r>
       <w:r>
         <w:rPr>
@@ -9010,17 +9240,17 @@
           <w:color w:val="374151"/>
           <w:sz w:val="19"/>
         </w:rPr>
-        <w:t>/restart</w:t>
-      </w:r>
-      <w:r>
-        <w:t xml:space="preserve"> command uses it (§5).</w:t>
+        <w:t>POST /v1/speech</w:t>
+      </w:r>
+      <w:r>
+        <w:t xml:space="preserve"> (§3.5), short exact text to mono WAV, bounded caching/timeouts and Apple fallback. iOS plays it through the existing spatial voice node.</w:t>
       </w:r>
     </w:p>
     <w:p>
       <w:pPr>
         <w:numPr>
           <w:ilvl w:val="0"/>
-          <w:numId w:val="960"/>
+          <w:numId w:val="963"/>
         </w:numPr>
         <w:pStyle w:val="ListParagraph"/>
       </w:pPr>
@@ -9028,10 +9258,64 @@
         <w:rPr>
           <w:b/>
         </w:rPr>
-        <w:t>Dashboard API</w:t>
-      </w:r>
-      <w:r>
-        <w:t xml:space="preserve"> (§6): </w:t>
+        <w:t>§7 guidance sounds</w:t>
+      </w:r>
+      <w:r>
+        <w:t xml:space="preserve"> (phone only; no message format changed): a beam that widens to 30 cm either side up close, three beacon sounds, a beacon never played behind, distance pace across the whole room, a speed-compensated stop (notes and a haptic, no words), graded reach pings with the steady tone at contact (5 cm), and head yaw advanced by the audio latency. The only words during a find are the opening line and the touch.</w:t>
+      </w:r>
+    </w:p>
+    <w:p>
+      <w:pPr>
+        <w:numPr>
+          <w:ilvl w:val="0"/>
+          <w:numId w:val="963"/>
+        </w:numPr>
+        <w:pStyle w:val="ListParagraph"/>
+      </w:pPr>
+      <w:r>
+        <w:rPr>
+          <w:b/>
+        </w:rPr>
+        <w:t>Stable facing confirmation</w:t>
+      </w:r>
+      <w:r>
+        <w:t xml:space="preserve"> (§7 step 4; phone only): 0.35 s entry dwell, a wider sustained-away rearm and a 3 s repeat limit prevent repeated dings from small movements. Ordinary beacon direction/cadence remain responsive, and same-item position updates preserve the confirmation latch.</w:t>
+      </w:r>
+    </w:p>
+    <w:p>
+      <w:pPr>
+        <w:numPr>
+          <w:ilvl w:val="0"/>
+          <w:numId w:val="963"/>
+        </w:numPr>
+        <w:pStyle w:val="ListParagraph"/>
+      </w:pPr>
+      <w:r>
+        <w:rPr>
+          <w:b/>
+        </w:rPr>
+        <w:t>Typed Photon labels:</w:t>
+      </w:r>
+      <w:r>
+        <w:t xml:space="preserve"> no Scribe, transcription or new caregiver audio labels. Photos and typed names, retries, corrections and source attribution stay. Stored legacy media and optional wire fields remain compatible.</w:t>
+      </w:r>
+    </w:p>
+    <w:p>
+      <w:pPr>
+        <w:numPr>
+          <w:ilvl w:val="0"/>
+          <w:numId w:val="963"/>
+        </w:numPr>
+        <w:pStyle w:val="ListParagraph"/>
+      </w:pPr>
+      <w:r>
+        <w:rPr>
+          <w:b/>
+        </w:rPr>
+        <w:t>A hand over the guided item no longer makes it `missing`</w:t>
+      </w:r>
+      <w:r>
+        <w:t xml:space="preserve"> (§7 step 7). Close up, the detector usually can't see the item under the hand. That used to mark the item </w:t>
       </w:r>
       <w:r>
         <w:rPr>
@@ -9039,271 +9323,10 @@
           <w:color w:val="374151"/>
           <w:sz w:val="19"/>
         </w:rPr>
-        <w:t>GET /dashboard/snapshot</w:t>
-      </w:r>
-      <w:r>
-        <w:t xml:space="preserve">, </w:t>
-      </w:r>
-      <w:r>
-        <w:rPr>
-          <w:rFonts w:ascii="Courier New" w:hAnsi="Courier New" w:eastAsia="Courier New" w:cs="Courier New"/>
-          <w:color w:val="374151"/>
-          <w:sz w:val="19"/>
-        </w:rPr>
-        <w:t>WS /events</w:t>
-      </w:r>
-      <w:r>
-        <w:t xml:space="preserve">, </w:t>
-      </w:r>
-      <w:r>
-        <w:rPr>
-          <w:rFonts w:ascii="Courier New" w:hAnsi="Courier New" w:eastAsia="Courier New" w:cs="Courier New"/>
-          <w:color w:val="374151"/>
-          <w:sz w:val="19"/>
-        </w:rPr>
-        <w:t>POST /dashboard/commands</w:t>
-      </w:r>
-      <w:r>
-        <w:t xml:space="preserve">, </w:t>
-      </w:r>
-      <w:r>
-        <w:rPr>
-          <w:rFonts w:ascii="Courier New" w:hAnsi="Courier New" w:eastAsia="Courier New" w:cs="Courier New"/>
-          <w:color w:val="374151"/>
-          <w:sz w:val="19"/>
-        </w:rPr>
-        <w:t>GET /media/…</w:t>
-      </w:r>
-      <w:r>
-        <w:t xml:space="preserve"> and </w:t>
-      </w:r>
-      <w:r>
-        <w:rPr>
-          <w:rFonts w:ascii="Courier New" w:hAnsi="Courier New" w:eastAsia="Courier New" w:cs="Courier New"/>
-          <w:color w:val="374151"/>
-          <w:sz w:val="19"/>
-        </w:rPr>
-        <w:t>/app/…</w:t>
-      </w:r>
-      <w:r>
-        <w:t xml:space="preserve">, each also under </w:t>
-      </w:r>
-      <w:r>
-        <w:rPr>
-          <w:rFonts w:ascii="Courier New" w:hAnsi="Courier New" w:eastAsia="Courier New" w:cs="Courier New"/>
-          <w:color w:val="374151"/>
-          <w:sz w:val="19"/>
-        </w:rPr>
-        <w:t>/api/…</w:t>
-      </w:r>
-      <w:r>
-        <w:t>, all behind the auth gate.</w:t>
-      </w:r>
-    </w:p>
-    <w:p>
-      <w:pPr>
-        <w:numPr>
-          <w:ilvl w:val="0"/>
-          <w:numId w:val="960"/>
-        </w:numPr>
-        <w:pStyle w:val="ListParagraph"/>
-      </w:pPr>
-      <w:r>
-        <w:rPr>
-          <w:b/>
-        </w:rPr>
-        <w:t>New phone messages for dashboard Find and Stop:</w:t>
-      </w:r>
-      <w:r>
-        <w:t xml:space="preserve"> </w:t>
-      </w:r>
-      <w:r>
-        <w:rPr>
-          <w:rFonts w:ascii="Courier New" w:hAnsi="Courier New" w:eastAsia="Courier New" w:cs="Courier New"/>
-          <w:color w:val="374151"/>
-          <w:sz w:val="19"/>
-        </w:rPr>
-        <w:t>command</w:t>
-      </w:r>
-      <w:r>
-        <w:t xml:space="preserve"> (server to phone, §4) and </w:t>
-      </w:r>
-      <w:r>
-        <w:rPr>
-          <w:rFonts w:ascii="Courier New" w:hAnsi="Courier New" w:eastAsia="Courier New" w:cs="Courier New"/>
-          <w:color w:val="374151"/>
-          <w:sz w:val="19"/>
-        </w:rPr>
-        <w:t>command_ack</w:t>
-      </w:r>
-      <w:r>
-        <w:t xml:space="preserve"> (phone to server, §3.2).</w:t>
-      </w:r>
-    </w:p>
-    <w:p>
-      <w:pPr>
-        <w:pStyle w:val="Heading1"/>
-      </w:pPr>
-      <w:r>
-        <w:t>13. Changes since v0.3</w:t>
-      </w:r>
-    </w:p>
-    <w:p>
-      <w:pPr>
-        <w:numPr>
-          <w:ilvl w:val="0"/>
-          <w:numId w:val="962"/>
-        </w:numPr>
-        <w:pStyle w:val="ListParagraph"/>
-      </w:pPr>
-      <w:r>
-        <w:rPr>
-          <w:b/>
-        </w:rPr>
-        <w:t>Output-only ElevenLabs:</w:t>
-      </w:r>
-      <w:r>
-        <w:t xml:space="preserve"> authenticated </w:t>
-      </w:r>
-      <w:r>
-        <w:rPr>
-          <w:rFonts w:ascii="Courier New" w:hAnsi="Courier New" w:eastAsia="Courier New" w:cs="Courier New"/>
-          <w:color w:val="374151"/>
-          <w:sz w:val="19"/>
-        </w:rPr>
-        <w:t>POST /v1/speech</w:t>
-      </w:r>
-      <w:r>
-        <w:t xml:space="preserve"> (§3.5), short exact text to mono WAV, bounded caching/timeouts and Apple fallback. iOS plays it through the existing spatial voice node.</w:t>
-      </w:r>
-    </w:p>
-    <w:p>
-      <w:pPr>
-        <w:numPr>
-          <w:ilvl w:val="0"/>
-          <w:numId w:val="962"/>
-        </w:numPr>
-        <w:pStyle w:val="ListParagraph"/>
-      </w:pPr>
-      <w:r>
-        <w:rPr>
-          <w:b/>
-        </w:rPr>
-        <w:t>§7 guidance sounds</w:t>
-      </w:r>
-      <w:r>
-        <w:t xml:space="preserve"> (phone only; no message format changed): a beam that widens to 30 cm either side up close, three beacon sounds, a beacon never played behind, distance pace across the whole room, a speed-compensated stop (notes and a haptic, no words), graded reach pings with the steady tone at contact (5 cm), and head yaw advanced by the audio latency. The only words during a find are the opening line and the touch.</w:t>
-      </w:r>
-    </w:p>
-    <w:p>
-      <w:pPr>
-        <w:numPr>
-          <w:ilvl w:val="0"/>
-          <w:numId w:val="962"/>
-        </w:numPr>
-        <w:pStyle w:val="ListParagraph"/>
-      </w:pPr>
-      <w:r>
-        <w:rPr>
-          <w:b/>
-        </w:rPr>
-        <w:t>Typed Photon labels:</w:t>
-      </w:r>
-      <w:r>
-        <w:t xml:space="preserve"> no Scribe, transcription or new caregiver audio labels. Photos and typed names, retries, corrections and source attribution stay. Stored legacy media and optional wire fields remain compatible.</w:t>
-      </w:r>
-    </w:p>
-    <w:p>
-      <w:pPr>
-        <w:numPr>
-          <w:ilvl w:val="0"/>
-          <w:numId w:val="962"/>
-        </w:numPr>
-        <w:pStyle w:val="ListParagraph"/>
-      </w:pPr>
-      <w:r>
-        <w:rPr>
-          <w:b/>
-        </w:rPr>
-        <w:t>A hand over the guided item no longer makes it `missing`</w:t>
-      </w:r>
-      <w:r>
-        <w:t xml:space="preserve"> (§7 step 7). Close up, the detector usually can't see the item under the hand. That used to mark the item </w:t>
-      </w:r>
-      <w:r>
-        <w:rPr>
-          <w:rFonts w:ascii="Courier New" w:hAnsi="Courier New" w:eastAsia="Courier New" w:cs="Courier New"/>
-          <w:color w:val="374151"/>
-          <w:sz w:val="19"/>
-        </w:rPr>
         <w:t>missing</w:t>
       </w:r>
       <w:r>
         <w:t xml:space="preserve"> after 3 frames, which took it out of touch matching, so the touch, and with it the end of the search, never came.</w:t>
-      </w:r>
-    </w:p>
-    <w:p>
-      <w:pPr>
-        <w:numPr>
-          <w:ilvl w:val="1"/>
-          <w:numId w:val="963"/>
-        </w:numPr>
-        <w:pStyle w:val="ListParagraph"/>
-      </w:pPr>
-      <w:r>
-        <w:t>Frames where a hand is within 35 cm of an item don't count as misses.</w:t>
-      </w:r>
-    </w:p>
-    <w:p>
-      <w:pPr>
-        <w:numPr>
-          <w:ilvl w:val="1"/>
-          <w:numId w:val="963"/>
-        </w:numPr>
-        <w:pStyle w:val="ListParagraph"/>
-      </w:pPr>
-      <w:r>
-        <w:t xml:space="preserve">An item that disappears after a hand was at it is </w:t>
-      </w:r>
-      <w:r>
-        <w:rPr>
-          <w:rFonts w:ascii="Courier New" w:hAnsi="Courier New" w:eastAsia="Courier New" w:cs="Courier New"/>
-          <w:color w:val="374151"/>
-          <w:sz w:val="19"/>
-        </w:rPr>
-        <w:t>picked_up</w:t>
-      </w:r>
-      <w:r>
-        <w:t xml:space="preserve">, not </w:t>
-      </w:r>
-      <w:r>
-        <w:rPr>
-          <w:rFonts w:ascii="Courier New" w:hAnsi="Courier New" w:eastAsia="Courier New" w:cs="Courier New"/>
-          <w:color w:val="374151"/>
-          <w:sz w:val="19"/>
-        </w:rPr>
-        <w:t>missing</w:t>
-      </w:r>
-      <w:r>
-        <w:t>.</w:t>
-      </w:r>
-    </w:p>
-    <w:p>
-      <w:pPr>
-        <w:numPr>
-          <w:ilvl w:val="0"/>
-          <w:numId w:val="962"/>
-        </w:numPr>
-        <w:pStyle w:val="ListParagraph"/>
-      </w:pPr>
-      <w:r>
-        <w:rPr>
-          <w:b/>
-        </w:rPr>
-        <w:t>Room layout on the dashboard map</w:t>
-      </w:r>
-      <w:r>
-        <w:t xml:space="preserve"> (§6):</w:t>
       </w:r>
     </w:p>
     <w:p>
@@ -9315,18 +9338,7 @@
         <w:pStyle w:val="ListParagraph"/>
       </w:pPr>
       <w:r>
-        <w:t xml:space="preserve">a new raw-feed message, </w:t>
-      </w:r>
-      <w:r>
-        <w:rPr>
-          <w:rFonts w:ascii="Courier New" w:hAnsi="Courier New" w:eastAsia="Courier New" w:cs="Courier New"/>
-          <w:color w:val="374151"/>
-          <w:sz w:val="19"/>
-        </w:rPr>
-        <w:t>room_layout</w:t>
-      </w:r>
-      <w:r>
-        <w:t>;</w:t>
+        <w:t>Frames where a hand is within 35 cm of an item don't count as misses.</w:t>
       </w:r>
     </w:p>
     <w:p>
@@ -9338,7 +9350,7 @@
         <w:pStyle w:val="ListParagraph"/>
       </w:pPr>
       <w:r>
-        <w:t xml:space="preserve">in the snapshot, </w:t>
+        <w:t xml:space="preserve">An item that disappears after a hand was at it is </w:t>
       </w:r>
       <w:r>
         <w:rPr>
@@ -9346,10 +9358,10 @@
           <w:color w:val="374151"/>
           <w:sz w:val="19"/>
         </w:rPr>
-        <w:t>map.walls</w:t>
-      </w:r>
-      <w:r>
-        <w:t xml:space="preserve"> is filled, and there is a new optional </w:t>
+        <w:t>picked_up</w:t>
+      </w:r>
+      <w:r>
+        <w:t xml:space="preserve">, not </w:t>
       </w:r>
       <w:r>
         <w:rPr>
@@ -9357,22 +9369,40 @@
           <w:color w:val="374151"/>
           <w:sz w:val="19"/>
         </w:rPr>
-        <w:t>map.landmarks</w:t>
-      </w:r>
-      <w:r>
-        <w:t>;</w:t>
+        <w:t>missing</w:t>
+      </w:r>
+      <w:r>
+        <w:t>.</w:t>
       </w:r>
     </w:p>
     <w:p>
       <w:pPr>
         <w:numPr>
-          <w:ilvl w:val="1"/>
-          <w:numId w:val="964"/>
+          <w:ilvl w:val="0"/>
+          <w:numId w:val="963"/>
         </w:numPr>
         <w:pStyle w:val="ListParagraph"/>
       </w:pPr>
       <w:r>
-        <w:t xml:space="preserve">a new </w:t>
+        <w:rPr>
+          <w:b/>
+        </w:rPr>
+        <w:t>Room layout on the dashboard map</w:t>
+      </w:r>
+      <w:r>
+        <w:t xml:space="preserve"> (§6):</w:t>
+      </w:r>
+    </w:p>
+    <w:p>
+      <w:pPr>
+        <w:numPr>
+          <w:ilvl w:val="1"/>
+          <w:numId w:val="965"/>
+        </w:numPr>
+        <w:pStyle w:val="ListParagraph"/>
+      </w:pPr>
+      <w:r>
+        <w:t xml:space="preserve">a new raw-feed message, </w:t>
       </w:r>
       <w:r>
         <w:rPr>
@@ -9380,17 +9410,74 @@
           <w:color w:val="374151"/>
           <w:sz w:val="19"/>
         </w:rPr>
-        <w:t>map_id</w:t>
-      </w:r>
-      <w:r>
-        <w:t xml:space="preserve"> on a frame now starts a fresh room map (old-frame voxels used to stay).</w:t>
+        <w:t>room_layout</w:t>
+      </w:r>
+      <w:r>
+        <w:t>;</w:t>
       </w:r>
     </w:p>
     <w:p>
       <w:pPr>
         <w:numPr>
+          <w:ilvl w:val="1"/>
+          <w:numId w:val="965"/>
+        </w:numPr>
+        <w:pStyle w:val="ListParagraph"/>
+      </w:pPr>
+      <w:r>
+        <w:t xml:space="preserve">in the snapshot, </w:t>
+      </w:r>
+      <w:r>
+        <w:rPr>
+          <w:rFonts w:ascii="Courier New" w:hAnsi="Courier New" w:eastAsia="Courier New" w:cs="Courier New"/>
+          <w:color w:val="374151"/>
+          <w:sz w:val="19"/>
+        </w:rPr>
+        <w:t>map.walls</w:t>
+      </w:r>
+      <w:r>
+        <w:t xml:space="preserve"> is filled, and there is a new optional </w:t>
+      </w:r>
+      <w:r>
+        <w:rPr>
+          <w:rFonts w:ascii="Courier New" w:hAnsi="Courier New" w:eastAsia="Courier New" w:cs="Courier New"/>
+          <w:color w:val="374151"/>
+          <w:sz w:val="19"/>
+        </w:rPr>
+        <w:t>map.landmarks</w:t>
+      </w:r>
+      <w:r>
+        <w:t>;</w:t>
+      </w:r>
+    </w:p>
+    <w:p>
+      <w:pPr>
+        <w:numPr>
+          <w:ilvl w:val="1"/>
+          <w:numId w:val="965"/>
+        </w:numPr>
+        <w:pStyle w:val="ListParagraph"/>
+      </w:pPr>
+      <w:r>
+        <w:t xml:space="preserve">a new </w:t>
+      </w:r>
+      <w:r>
+        <w:rPr>
+          <w:rFonts w:ascii="Courier New" w:hAnsi="Courier New" w:eastAsia="Courier New" w:cs="Courier New"/>
+          <w:color w:val="374151"/>
+          <w:sz w:val="19"/>
+        </w:rPr>
+        <w:t>map_id</w:t>
+      </w:r>
+      <w:r>
+        <w:t xml:space="preserve"> on a frame now starts a fresh room map (old-frame voxels used to stay).</w:t>
+      </w:r>
+    </w:p>
+    <w:p>
+      <w:pPr>
+        <w:numPr>
           <w:ilvl w:val="0"/>
-          <w:numId w:val="962"/>
+          <w:numId w:val="963"/>
         </w:numPr>
         <w:pStyle w:val="ListParagraph"/>
       </w:pPr>
@@ -10186,25 +10273,25 @@
     </w:lvlOverride>
   </w:num>
   <w:num w:numId="949">
+    <w:abstractNumId w:val="900"/>
+    <w:lvlOverride w:ilvl="1">
+      <w:startOverride w:val="1"/>
+    </w:lvlOverride>
+  </w:num>
+  <w:num w:numId="950">
     <w:abstractNumId w:val="901"/>
     <w:lvlOverride w:ilvl="0">
       <w:startOverride w:val="1"/>
     </w:lvlOverride>
   </w:num>
-  <w:num w:numId="950">
+  <w:num w:numId="951">
     <w:abstractNumId w:val="900"/>
     <w:lvlOverride w:ilvl="1">
       <w:startOverride w:val="1"/>
     </w:lvlOverride>
   </w:num>
-  <w:num w:numId="951">
+  <w:num w:numId="952">
     <w:abstractNumId w:val="901"/>
-    <w:lvlOverride w:ilvl="0">
-      <w:startOverride w:val="1"/>
-    </w:lvlOverride>
-  </w:num>
-  <w:num w:numId="952">
-    <w:abstractNumId w:val="900"/>
     <w:lvlOverride w:ilvl="0">
       <w:startOverride w:val="1"/>
     </w:lvlOverride>
@@ -10216,66 +10303,72 @@
     </w:lvlOverride>
   </w:num>
   <w:num w:numId="954">
+    <w:abstractNumId w:val="900"/>
+    <w:lvlOverride w:ilvl="0">
+      <w:startOverride w:val="1"/>
+    </w:lvlOverride>
+  </w:num>
+  <w:num w:numId="955">
     <w:abstractNumId w:val="901"/>
     <w:lvlOverride w:ilvl="0">
       <w:startOverride w:val="1"/>
     </w:lvlOverride>
   </w:num>
-  <w:num w:numId="955">
+  <w:num w:numId="956">
     <w:abstractNumId w:val="900"/>
     <w:lvlOverride w:ilvl="1">
       <w:startOverride w:val="1"/>
     </w:lvlOverride>
   </w:num>
-  <w:num w:numId="956">
+  <w:num w:numId="957">
     <w:abstractNumId w:val="900"/>
     <w:lvlOverride w:ilvl="0">
       <w:startOverride w:val="1"/>
     </w:lvlOverride>
   </w:num>
-  <w:num w:numId="957">
+  <w:num w:numId="958">
     <w:abstractNumId w:val="900"/>
     <w:lvlOverride w:ilvl="1">
       <w:startOverride w:val="1"/>
     </w:lvlOverride>
   </w:num>
-  <w:num w:numId="958">
+  <w:num w:numId="959">
     <w:abstractNumId w:val="900"/>
     <w:lvlOverride w:ilvl="0">
       <w:startOverride w:val="1"/>
     </w:lvlOverride>
   </w:num>
-  <w:num w:numId="959">
+  <w:num w:numId="960">
     <w:abstractNumId w:val="900"/>
     <w:lvlOverride w:ilvl="1">
       <w:startOverride w:val="1"/>
     </w:lvlOverride>
   </w:num>
-  <w:num w:numId="960">
+  <w:num w:numId="961">
     <w:abstractNumId w:val="900"/>
     <w:lvlOverride w:ilvl="0">
       <w:startOverride w:val="1"/>
     </w:lvlOverride>
   </w:num>
-  <w:num w:numId="961">
+  <w:num w:numId="962">
     <w:abstractNumId w:val="900"/>
     <w:lvlOverride w:ilvl="1">
       <w:startOverride w:val="1"/>
     </w:lvlOverride>
   </w:num>
-  <w:num w:numId="962">
+  <w:num w:numId="963">
     <w:abstractNumId w:val="900"/>
     <w:lvlOverride w:ilvl="0">
       <w:startOverride w:val="1"/>
     </w:lvlOverride>
   </w:num>
-  <w:num w:numId="963">
+  <w:num w:numId="964">
     <w:abstractNumId w:val="900"/>
     <w:lvlOverride w:ilvl="1">
       <w:startOverride w:val="1"/>
     </w:lvlOverride>
   </w:num>
-  <w:num w:numId="964">
+  <w:num w:numId="965">
     <w:abstractNumId w:val="900"/>
     <w:lvlOverride w:ilvl="1">
       <w:startOverride w:val="1"/>

</xml_diff>

<commit_message>
Preserve current phone guidance sounds in dashboard Listen in
</commit_message>
<xml_diff>
--- a/docs/INTERFACES.docx
+++ b/docs/INTERFACES.docx
@@ -2101,7 +2101,18 @@
         <w:t>tone_off</w:t>
       </w:r>
       <w:r>
-        <w:t xml:space="preserve"> (the steady tone);</w:t>
+        <w:t xml:space="preserve"> (the steady tone). The optional </w:t>
+      </w:r>
+      <w:r>
+        <w:rPr>
+          <w:rFonts w:ascii="Courier New" w:hAnsi="Courier New" w:eastAsia="Courier New" w:cs="Courier New"/>
+          <w:color w:val="374151"/>
+          <w:sz w:val="19"/>
+        </w:rPr>
+        <w:t>variant</w:t>
+      </w:r>
+      <w:r>
+        <w:t xml:space="preserve"> below distinguishes their current recipes;</w:t>
       </w:r>
     </w:p>
     <w:p>
@@ -2423,6 +2434,225 @@
       </w:r>
       <w:r>
         <w:t>, estimated from the words (exact for a voice memo).</w:t>
+      </w:r>
+    </w:p>
+    <w:p>
+      <w:pPr>
+        <w:numPr>
+          <w:ilvl w:val="0"/>
+          <w:numId w:val="916"/>
+        </w:numPr>
+        <w:pStyle w:val="ListParagraph"/>
+      </w:pPr>
+      <w:r>
+        <w:rPr>
+          <w:b/>
+        </w:rPr>
+        <w:t>Guidance sound detail (optional, compatible with older messages):</w:t>
+      </w:r>
+      <w:r>
+        <w:t xml:space="preserve"> </w:t>
+      </w:r>
+      <w:r>
+        <w:rPr>
+          <w:rFonts w:ascii="Courier New" w:hAnsi="Courier New" w:eastAsia="Courier New" w:cs="Courier New"/>
+          <w:color w:val="374151"/>
+          <w:sz w:val="19"/>
+        </w:rPr>
+        <w:t>variant</w:t>
+      </w:r>
+      <w:r>
+        <w:t xml:space="preserve"> is </w:t>
+      </w:r>
+      <w:r>
+        <w:rPr>
+          <w:rFonts w:ascii="Courier New" w:hAnsi="Courier New" w:eastAsia="Courier New" w:cs="Courier New"/>
+          <w:color w:val="374151"/>
+          <w:sz w:val="19"/>
+        </w:rPr>
+        <w:t>on_beam</w:t>
+      </w:r>
+      <w:r>
+        <w:t xml:space="preserve">, </w:t>
+      </w:r>
+      <w:r>
+        <w:rPr>
+          <w:rFonts w:ascii="Courier New" w:hAnsi="Courier New" w:eastAsia="Courier New" w:cs="Courier New"/>
+          <w:color w:val="374151"/>
+          <w:sz w:val="19"/>
+        </w:rPr>
+        <w:t>off_beam</w:t>
+      </w:r>
+      <w:r>
+        <w:t xml:space="preserve">, </w:t>
+      </w:r>
+      <w:r>
+        <w:rPr>
+          <w:rFonts w:ascii="Courier New" w:hAnsi="Courier New" w:eastAsia="Courier New" w:cs="Courier New"/>
+          <w:color w:val="374151"/>
+          <w:sz w:val="19"/>
+        </w:rPr>
+        <w:t>behind</w:t>
+      </w:r>
+      <w:r>
+        <w:t xml:space="preserve">, </w:t>
+      </w:r>
+      <w:r>
+        <w:rPr>
+          <w:rFonts w:ascii="Courier New" w:hAnsi="Courier New" w:eastAsia="Courier New" w:cs="Courier New"/>
+          <w:color w:val="374151"/>
+          <w:sz w:val="19"/>
+        </w:rPr>
+        <w:t>here</w:t>
+      </w:r>
+      <w:r>
+        <w:t xml:space="preserve"> or </w:t>
+      </w:r>
+      <w:r>
+        <w:rPr>
+          <w:rFonts w:ascii="Courier New" w:hAnsi="Courier New" w:eastAsia="Courier New" w:cs="Courier New"/>
+          <w:color w:val="374151"/>
+          <w:sz w:val="19"/>
+        </w:rPr>
+        <w:t>hand_ping</w:t>
+      </w:r>
+      <w:r>
+        <w:t xml:space="preserve"> for </w:t>
+      </w:r>
+      <w:r>
+        <w:rPr>
+          <w:rFonts w:ascii="Courier New" w:hAnsi="Courier New" w:eastAsia="Courier New" w:cs="Courier New"/>
+          <w:color w:val="374151"/>
+          <w:sz w:val="19"/>
+        </w:rPr>
+        <w:t>beep</w:t>
+      </w:r>
+      <w:r>
+        <w:t xml:space="preserve">; </w:t>
+      </w:r>
+      <w:r>
+        <w:rPr>
+          <w:rFonts w:ascii="Courier New" w:hAnsi="Courier New" w:eastAsia="Courier New" w:cs="Courier New"/>
+          <w:color w:val="374151"/>
+          <w:sz w:val="19"/>
+        </w:rPr>
+        <w:t>arrive</w:t>
+      </w:r>
+      <w:r>
+        <w:t xml:space="preserve"> for </w:t>
+      </w:r>
+      <w:r>
+        <w:rPr>
+          <w:rFonts w:ascii="Courier New" w:hAnsi="Courier New" w:eastAsia="Courier New" w:cs="Courier New"/>
+          <w:color w:val="374151"/>
+          <w:sz w:val="19"/>
+        </w:rPr>
+        <w:t>ding</w:t>
+      </w:r>
+      <w:r>
+        <w:t xml:space="preserve">; </w:t>
+      </w:r>
+      <w:r>
+        <w:rPr>
+          <w:rFonts w:ascii="Courier New" w:hAnsi="Courier New" w:eastAsia="Courier New" w:cs="Courier New"/>
+          <w:color w:val="374151"/>
+          <w:sz w:val="19"/>
+        </w:rPr>
+        <w:t>contact</w:t>
+      </w:r>
+      <w:r>
+        <w:t xml:space="preserve"> for </w:t>
+      </w:r>
+      <w:r>
+        <w:rPr>
+          <w:rFonts w:ascii="Courier New" w:hAnsi="Courier New" w:eastAsia="Courier New" w:cs="Courier New"/>
+          <w:color w:val="374151"/>
+          <w:sz w:val="19"/>
+        </w:rPr>
+        <w:t>tone_on</w:t>
+      </w:r>
+      <w:r>
+        <w:t xml:space="preserve">. The source is </w:t>
+      </w:r>
+      <w:r>
+        <w:rPr>
+          <w:rFonts w:ascii="Courier New" w:hAnsi="Courier New" w:eastAsia="Courier New" w:cs="Courier New"/>
+          <w:color w:val="374151"/>
+          <w:sz w:val="19"/>
+        </w:rPr>
+        <w:t>beacon</w:t>
+      </w:r>
+      <w:r>
+        <w:t xml:space="preserve">. A plain </w:t>
+      </w:r>
+      <w:r>
+        <w:rPr>
+          <w:rFonts w:ascii="Courier New" w:hAnsi="Courier New" w:eastAsia="Courier New" w:cs="Courier New"/>
+          <w:color w:val="374151"/>
+          <w:sz w:val="19"/>
+        </w:rPr>
+        <w:t>ding</w:t>
+      </w:r>
+      <w:r>
+        <w:t xml:space="preserve"> is the two-note facing confirmation; </w:t>
+      </w:r>
+      <w:r>
+        <w:rPr>
+          <w:rFonts w:ascii="Courier New" w:hAnsi="Courier New" w:eastAsia="Courier New" w:cs="Courier New"/>
+          <w:color w:val="374151"/>
+          <w:sz w:val="19"/>
+        </w:rPr>
+        <w:t>arrive</w:t>
+      </w:r>
+      <w:r>
+        <w:t xml:space="preserve"> is the three-note stop cue. A </w:t>
+      </w:r>
+      <w:r>
+        <w:rPr>
+          <w:rFonts w:ascii="Courier New" w:hAnsi="Courier New" w:eastAsia="Courier New" w:cs="Courier New"/>
+          <w:color w:val="374151"/>
+          <w:sz w:val="19"/>
+        </w:rPr>
+        <w:t>hand_ping</w:t>
+      </w:r>
+      <w:r>
+        <w:t xml:space="preserve"> must include integer </w:t>
+      </w:r>
+      <w:r>
+        <w:rPr>
+          <w:rFonts w:ascii="Courier New" w:hAnsi="Courier New" w:eastAsia="Courier New" w:cs="Courier New"/>
+          <w:color w:val="374151"/>
+          <w:sz w:val="19"/>
+        </w:rPr>
+        <w:t>hand_step</w:t>
+      </w:r>
+      <w:r>
+        <w:t xml:space="preserve"> 0–5 (D5, E5, F♯5, A5, B5, D6); no other variant carries a step. The contact tone is the rounded top note, 1175 Hz. Absent/null detail means the original generic beep/ding/660 Hz tone; do not infer a variant from direction or distance. The phone uses its actual cue and pitch step, including the playback clamp.</w:t>
+      </w:r>
+    </w:p>
+    <w:p>
+      <w:r>
+        <w:t>```json</w:t>
+      </w:r>
+    </w:p>
+    <w:p>
+      <w:r>
+        <w:t>{"type": "sound", "session_id": "…", "t_device": 81240.2, "cue": "beep", "source": "beacon", "anchor": "item",</w:t>
+      </w:r>
+    </w:p>
+    <w:p>
+      <w:r>
+        <w:t>"az_deg": 5.0, "el_deg": -40.0, "distance_m": 0.6, "variant": "hand_ping", "hand_step": 4}</w:t>
+      </w:r>
+    </w:p>
+    <w:p>
+      <w:r>
+        <w:rPr>
+          <w:rFonts w:ascii="Courier New" w:hAnsi="Courier New" w:eastAsia="Courier New" w:cs="Courier New"/>
+          <w:color w:val="374151"/>
+          <w:sz w:val="19"/>
+        </w:rPr>
+        <w:t>`</w:t>
       </w:r>
     </w:p>
     <w:p>
@@ -6905,6 +7135,58 @@
       </w:r>
       <w:r>
         <w:t>).</w:t>
+      </w:r>
+    </w:p>
+    <w:p>
+      <w:pPr>
+        <w:numPr>
+          <w:ilvl w:val="1"/>
+          <w:numId w:val="946"/>
+        </w:numPr>
+        <w:pStyle w:val="ListParagraph"/>
+      </w:pPr>
+      <w:r>
+        <w:t xml:space="preserve">Guidance cue detail is relayed unchanged as optional </w:t>
+      </w:r>
+      <w:r>
+        <w:rPr>
+          <w:rFonts w:ascii="Courier New" w:hAnsi="Courier New" w:eastAsia="Courier New" w:cs="Courier New"/>
+          <w:color w:val="374151"/>
+          <w:sz w:val="19"/>
+        </w:rPr>
+        <w:t>variant</w:t>
+      </w:r>
+      <w:r>
+        <w:t xml:space="preserve"> and </w:t>
+      </w:r>
+      <w:r>
+        <w:rPr>
+          <w:rFonts w:ascii="Courier New" w:hAnsi="Courier New" w:eastAsia="Courier New" w:cs="Courier New"/>
+          <w:color w:val="374151"/>
+          <w:sz w:val="19"/>
+        </w:rPr>
+        <w:t>handStep</w:t>
+      </w:r>
+      <w:r>
+        <w:t xml:space="preserve"> (§3.2); old messages omit them. Invalid variants, cue/source combinations or pitch steps are dropped. No schema-version change: old clients ignore these extra fields and new clients retain the old recipes when details are absent.</w:t>
+      </w:r>
+    </w:p>
+    <w:p>
+      <w:pPr>
+        <w:numPr>
+          <w:ilvl w:val="1"/>
+          <w:numId w:val="946"/>
+        </w:numPr>
+        <w:pStyle w:val="ListParagraph"/>
+      </w:pPr>
+      <w:r>
+        <w:rPr>
+          <w:b/>
+        </w:rPr>
+        <w:t>Listen in</w:t>
+      </w:r>
+      <w:r>
+        <w:t xml:space="preserve"> synthesizes the reported current recipe, including all six reach pitches, the arrival triad and contact tone. Distance attenuation uses the phone's 0.6 m reference and 0.35 rolloff. This is an observer reconstruction with network timing and the browser's HRTF, not a recording of Apple's rendered output; haptics are not replayed. Opt-in remains required.</w:t>
       </w:r>
     </w:p>
     <w:p>

</xml_diff>